<commit_message>
Add Smokey project to site
</commit_message>
<xml_diff>
--- a/downloads/micwin_profil.docx
+++ b/downloads/micwin_profil.docx
@@ -41,7 +41,7 @@
         <w:pStyle w:val="Date"/>
       </w:pPr>
       <w:r>
-        <w:t xml:space="preserve">06.10.2025</w:t>
+        <w:t xml:space="preserve">25.03.2026</w:t>
       </w:r>
     </w:p>
     <w:p>
@@ -62,13 +62,13 @@
         <w:t xml:space="preserve">Ansible, Confluence, Docker, GitLab, Jenkins, Jira, Kubernetes, Linux, Portman, Python</w:t>
       </w:r>
     </w:p>
-    <w:bookmarkStart w:id="20" w:name="letzte-5-projekte"/>
+    <w:bookmarkStart w:id="20" w:name="letzte-5-projekte-nicht-pro-bono"/>
     <w:p>
       <w:pPr>
         <w:pStyle w:val="Heading2"/>
       </w:pPr>
       <w:r>
-        <w:t xml:space="preserve">Letzte 5 Projekte</w:t>
+        <w:t xml:space="preserve">Letzte 5 Projekte (nicht pro bono)</w:t>
       </w:r>
     </w:p>
     <w:p>
@@ -80,7 +80,7 @@
           <w:bCs/>
           <w:b/>
         </w:rPr>
-        <w:t xml:space="preserve">Integrator (Kubernetes, GitLab CI, Ansible)</w:t>
+        <w:t xml:space="preserve">Integrator (Kubernetes/GitLab CI/Ansible)</w:t>
       </w:r>
       <w:r>
         <w:t xml:space="preserve"> </w:t>
@@ -120,12 +120,6 @@
       <w:r>
         <w:t xml:space="preserve">Wiedererweckung und Modernisierung eines halbautomatischen Frameworks auf Powershell-Basis für das Management von 13 Systemumgebungen. Das Projekt war zuvor zwei Jahre pausiert und wurde ohne die ursprünglichen Ressourcen reaktiviert.</w:t>
       </w:r>
-      <w:r>
-        <w:t xml:space="preserve"> </w:t>
-      </w:r>
-      <w:r>
-        <w:t xml:space="preserve">(AirBus/SIE Integ Europe)</w:t>
-      </w:r>
     </w:p>
     <w:p>
       <w:pPr>
@@ -176,12 +170,6 @@
       <w:r>
         <w:t xml:space="preserve">Weiterentwicklung von Ansible-Playbooks zur Wartung eines bestehenden GitLab-Geo-Clusters, inklusive Erstellung neuer Cluster. Entwicklung und Migration von End-to-End-Tests in containerisierte Umgebungen. Erstellung eines Tools zur automatischen Bereinigung hängender Runner-Container.</w:t>
       </w:r>
-      <w:r>
-        <w:t xml:space="preserve"> </w:t>
-      </w:r>
-      <w:r>
-        <w:t xml:space="preserve">(Infineon/GitLab, End-to-End-Tests)</w:t>
-      </w:r>
     </w:p>
     <w:p>
       <w:pPr>
@@ -232,12 +220,6 @@
       <w:r>
         <w:t xml:space="preserve">Entwicklung eines BOM-Generators für Maven-Projekte. Mitarbeit an einem Docker-Image-Package-Scanner.</w:t>
       </w:r>
-      <w:r>
-        <w:t xml:space="preserve"> </w:t>
-      </w:r>
-      <w:r>
-        <w:t xml:space="preserve">(Advantia/Maven-Scanner)</w:t>
-      </w:r>
     </w:p>
     <w:p>
       <w:pPr>
@@ -288,12 +270,6 @@
       <w:r>
         <w:t xml:space="preserve">Vorbereitung zur Einführung von „Test First“ und Behebung von Blocker-Issues in SonarQube.</w:t>
       </w:r>
-      <w:r>
-        <w:t xml:space="preserve"> </w:t>
-      </w:r>
-      <w:r>
-        <w:t xml:space="preserve">(marketoolz/Test First)</w:t>
-      </w:r>
     </w:p>
     <w:p>
       <w:pPr>
@@ -343,12 +319,6 @@
       </w:r>
       <w:r>
         <w:t xml:space="preserve">Einrichtung zusätzlicher GitLab-Agenten sowie Erstellung von Build- und Deploy-Pipelines für OpenStack (kolla-ansible, Cinder).</w:t>
-      </w:r>
-      <w:r>
-        <w:t xml:space="preserve"> </w:t>
-      </w:r>
-      <w:r>
-        <w:t xml:space="preserve">(iqOptimize/OpenStack)</w:t>
       </w:r>
     </w:p>
     <w:bookmarkEnd w:id="20"/>
@@ -465,22 +435,22 @@
       </w:hyperlink>
     </w:p>
     <w:bookmarkEnd w:id="22"/>
-    <w:bookmarkStart w:id="72" w:name="ausführliche-projekt-historie"/>
+    <w:bookmarkStart w:id="77" w:name="vollständige-projektliste"/>
     <w:p>
       <w:pPr>
         <w:pStyle w:val="Heading2"/>
       </w:pPr>
       <w:r>
-        <w:t xml:space="preserve">Ausführliche Projekt-Historie</w:t>
-      </w:r>
-    </w:p>
-    <w:bookmarkStart w:id="23" w:name="X2ba3f6c11dbd7d4ef5a6486e064d52f0f969cfa"/>
+        <w:t xml:space="preserve">Vollständige Projektliste</w:t>
+      </w:r>
+    </w:p>
+    <w:bookmarkStart w:id="23" w:name="laufend"/>
     <w:p>
       <w:pPr>
         <w:pStyle w:val="Heading3"/>
       </w:pPr>
       <w:r>
-        <w:t xml:space="preserve">AirBus - SIE Integ Europe (05.2024-05.2025)</w:t>
+        <w:t xml:space="preserve">03.2026 – laufend</w:t>
       </w:r>
     </w:p>
     <w:p>
@@ -489,7 +459,6 @@
           <w:ilvl w:val="0"/>
           <w:numId w:val="1001"/>
         </w:numPr>
-        <w:pStyle w:val="Compact"/>
       </w:pPr>
       <w:r>
         <w:rPr>
@@ -502,7 +471,7 @@
         <w:t xml:space="preserve"> </w:t>
       </w:r>
       <w:r>
-        <w:t xml:space="preserve">Integrator (Kubernetes, GitLab CI, Ansible)</w:t>
+        <w:t xml:space="preserve">CLI-Entwickler (Bash), Maintainer</w:t>
       </w:r>
     </w:p>
     <w:p>
@@ -511,7 +480,6 @@
           <w:ilvl w:val="0"/>
           <w:numId w:val="1001"/>
         </w:numPr>
-        <w:pStyle w:val="Compact"/>
       </w:pPr>
       <w:r>
         <w:rPr>
@@ -524,6 +492,194 @@
         <w:t xml:space="preserve"> </w:t>
       </w:r>
       <w:r>
+        <w:t xml:space="preserve">Bash, GitHub Actions, Debian packaging, Python, HTML, CSS</w:t>
+      </w:r>
+    </w:p>
+    <w:p>
+      <w:pPr>
+        <w:numPr>
+          <w:ilvl w:val="0"/>
+          <w:numId w:val="1001"/>
+        </w:numPr>
+      </w:pPr>
+      <w:r>
+        <w:rPr>
+          <w:bCs/>
+          <w:b/>
+        </w:rPr>
+        <w:t xml:space="preserve">Projekt:</w:t>
+      </w:r>
+      <w:r>
+        <w:t xml:space="preserve"> </w:t>
+      </w:r>
+      <w:r>
+        <w:t xml:space="preserve">Smokey (Pro Bono)</w:t>
+      </w:r>
+    </w:p>
+    <w:p>
+      <w:pPr>
+        <w:numPr>
+          <w:ilvl w:val="0"/>
+          <w:numId w:val="1001"/>
+        </w:numPr>
+      </w:pPr>
+      <w:r>
+        <w:rPr>
+          <w:bCs/>
+          <w:b/>
+        </w:rPr>
+        <w:t xml:space="preserve">Aufgaben:</w:t>
+      </w:r>
+      <w:r>
+        <w:t xml:space="preserve"> </w:t>
+      </w:r>
+      <w:r>
+        <w:t xml:space="preserve">Konzeption und Entwicklung eines Bash-basierten Smoke-Test-Runners für Mono-Repos mit deterministischem 000/999-Suite-Layout, Fail-Fast-/Preserve-/Reuse-State-Flags, isolierten Laufzeitverzeichnissen und exportierten Kontext-Variablen für jeden Test. Aufbau des Installer-Skripts, der Debian-Paketierung, der statischen Marketing-Site mit Versionsplatzhaltern sowie der automatisierten Release-Pipeline auf GitHub Actions.</w:t>
+      </w:r>
+    </w:p>
+    <w:bookmarkEnd w:id="23"/>
+    <w:bookmarkStart w:id="24" w:name="section"/>
+    <w:p>
+      <w:pPr>
+        <w:pStyle w:val="Heading3"/>
+      </w:pPr>
+      <w:r>
+        <w:t xml:space="preserve">06.2024 – 06.2024</w:t>
+      </w:r>
+    </w:p>
+    <w:p>
+      <w:pPr>
+        <w:numPr>
+          <w:ilvl w:val="0"/>
+          <w:numId w:val="1002"/>
+        </w:numPr>
+      </w:pPr>
+      <w:r>
+        <w:rPr>
+          <w:bCs/>
+          <w:b/>
+        </w:rPr>
+        <w:t xml:space="preserve">Rolle(n):</w:t>
+      </w:r>
+      <w:r>
+        <w:t xml:space="preserve"> </w:t>
+      </w:r>
+      <w:r>
+        <w:t xml:space="preserve">Rust-Entwickler</w:t>
+      </w:r>
+    </w:p>
+    <w:p>
+      <w:pPr>
+        <w:numPr>
+          <w:ilvl w:val="0"/>
+          <w:numId w:val="1002"/>
+        </w:numPr>
+      </w:pPr>
+      <w:r>
+        <w:rPr>
+          <w:bCs/>
+          <w:b/>
+        </w:rPr>
+        <w:t xml:space="preserve">Technologien:</w:t>
+      </w:r>
+      <w:r>
+        <w:t xml:space="preserve"> </w:t>
+      </w:r>
+      <w:r>
+        <w:t xml:space="preserve">Rust, eframe, egui, rayon, crossbeam-channel, chrono</w:t>
+      </w:r>
+    </w:p>
+    <w:p>
+      <w:pPr>
+        <w:numPr>
+          <w:ilvl w:val="0"/>
+          <w:numId w:val="1002"/>
+        </w:numPr>
+      </w:pPr>
+      <w:r>
+        <w:rPr>
+          <w:bCs/>
+          <w:b/>
+        </w:rPr>
+        <w:t xml:space="preserve">Projekt:</w:t>
+      </w:r>
+      <w:r>
+        <w:t xml:space="preserve"> </w:t>
+      </w:r>
+      <w:r>
+        <w:t xml:space="preserve">TSP Playground (Pro Bono)</w:t>
+      </w:r>
+    </w:p>
+    <w:p>
+      <w:pPr>
+        <w:numPr>
+          <w:ilvl w:val="0"/>
+          <w:numId w:val="1002"/>
+        </w:numPr>
+      </w:pPr>
+      <w:r>
+        <w:rPr>
+          <w:bCs/>
+          <w:b/>
+        </w:rPr>
+        <w:t xml:space="preserve">Aufgaben:</w:t>
+      </w:r>
+      <w:r>
+        <w:t xml:space="preserve"> </w:t>
+      </w:r>
+      <w:r>
+        <w:t xml:space="preserve">Eine interaktive Rust-Anwendung zur Visualisierung des Travelling-Salesman-Problems (TSP). Das Tool ermöglicht die Untersuchung von optimalen Routen durch eine Brute-Force-Berechnung und bietet eine interaktive Oberfläche zum Verschieben von Punkten, eine Undo-/Redo-Funktion sowie eine Analyse der Stabilitätsbereiche.</w:t>
+      </w:r>
+    </w:p>
+    <w:bookmarkEnd w:id="24"/>
+    <w:bookmarkStart w:id="25" w:name="section-1"/>
+    <w:p>
+      <w:pPr>
+        <w:pStyle w:val="Heading3"/>
+      </w:pPr>
+      <w:r>
+        <w:t xml:space="preserve">05.2024 – 05.2025</w:t>
+      </w:r>
+    </w:p>
+    <w:p>
+      <w:pPr>
+        <w:numPr>
+          <w:ilvl w:val="0"/>
+          <w:numId w:val="1003"/>
+        </w:numPr>
+      </w:pPr>
+      <w:r>
+        <w:rPr>
+          <w:bCs/>
+          <w:b/>
+        </w:rPr>
+        <w:t xml:space="preserve">Rolle(n):</w:t>
+      </w:r>
+      <w:r>
+        <w:t xml:space="preserve"> </w:t>
+      </w:r>
+      <w:r>
+        <w:t xml:space="preserve">Integrator (Kubernetes/GitLab CI/Ansible)</w:t>
+      </w:r>
+    </w:p>
+    <w:p>
+      <w:pPr>
+        <w:numPr>
+          <w:ilvl w:val="0"/>
+          <w:numId w:val="1003"/>
+        </w:numPr>
+      </w:pPr>
+      <w:r>
+        <w:rPr>
+          <w:bCs/>
+          <w:b/>
+        </w:rPr>
+        <w:t xml:space="preserve">Technologien:</w:t>
+      </w:r>
+      <w:r>
+        <w:t xml:space="preserve"> </w:t>
+      </w:r>
+      <w:r>
         <w:t xml:space="preserve">Kubernetes, Rancher Kubernetes Engine 2 (RKE2), Powershell, GitLab CI, Puppet, Ansible, Docker, Portman, Crane, Python, Jenkins</w:t>
       </w:r>
     </w:p>
@@ -531,9 +687,8 @@
       <w:pPr>
         <w:numPr>
           <w:ilvl w:val="0"/>
-          <w:numId w:val="1001"/>
-        </w:numPr>
-        <w:pStyle w:val="Compact"/>
+          <w:numId w:val="1003"/>
+        </w:numPr>
       </w:pPr>
       <w:r>
         <w:rPr>
@@ -549,23 +704,22 @@
         <w:t xml:space="preserve">Wiedererweckung und Modernisierung eines halbautomatischen Frameworks auf Powershell-Basis für das Management von 13 Systemumgebungen. Das Projekt war zuvor zwei Jahre pausiert und wurde ohne die ursprünglichen Ressourcen reaktiviert.</w:t>
       </w:r>
     </w:p>
-    <w:bookmarkEnd w:id="23"/>
-    <w:bookmarkStart w:id="24" w:name="X283af5517a0c34190d33e90685bbdced276f2b7"/>
+    <w:bookmarkEnd w:id="25"/>
+    <w:bookmarkStart w:id="26" w:name="section-2"/>
     <w:p>
       <w:pPr>
         <w:pStyle w:val="Heading3"/>
       </w:pPr>
       <w:r>
-        <w:t xml:space="preserve">Infineon - GitLab, End-to-End-Tests (08.2022-07.2023)</w:t>
-      </w:r>
-    </w:p>
-    <w:p>
-      <w:pPr>
-        <w:numPr>
-          <w:ilvl w:val="0"/>
-          <w:numId w:val="1002"/>
-        </w:numPr>
-        <w:pStyle w:val="Compact"/>
+        <w:t xml:space="preserve">08.2022 – 07.2023</w:t>
+      </w:r>
+    </w:p>
+    <w:p>
+      <w:pPr>
+        <w:numPr>
+          <w:ilvl w:val="0"/>
+          <w:numId w:val="1004"/>
+        </w:numPr>
       </w:pPr>
       <w:r>
         <w:rPr>
@@ -585,9 +739,8 @@
       <w:pPr>
         <w:numPr>
           <w:ilvl w:val="0"/>
-          <w:numId w:val="1002"/>
-        </w:numPr>
-        <w:pStyle w:val="Compact"/>
+          <w:numId w:val="1004"/>
+        </w:numPr>
       </w:pPr>
       <w:r>
         <w:rPr>
@@ -607,9 +760,8 @@
       <w:pPr>
         <w:numPr>
           <w:ilvl w:val="0"/>
-          <w:numId w:val="1002"/>
-        </w:numPr>
-        <w:pStyle w:val="Compact"/>
+          <w:numId w:val="1004"/>
+        </w:numPr>
       </w:pPr>
       <w:r>
         <w:rPr>
@@ -625,23 +777,22 @@
         <w:t xml:space="preserve">Weiterentwicklung von Ansible-Playbooks zur Wartung eines bestehenden GitLab-Geo-Clusters, inklusive Erstellung neuer Cluster. Entwicklung und Migration von End-to-End-Tests in containerisierte Umgebungen. Erstellung eines Tools zur automatischen Bereinigung hängender Runner-Container.</w:t>
       </w:r>
     </w:p>
-    <w:bookmarkEnd w:id="24"/>
-    <w:bookmarkStart w:id="25" w:name="advantia---maven-scanner-07.2022-09.2022"/>
+    <w:bookmarkEnd w:id="26"/>
+    <w:bookmarkStart w:id="27" w:name="section-3"/>
     <w:p>
       <w:pPr>
         <w:pStyle w:val="Heading3"/>
       </w:pPr>
       <w:r>
-        <w:t xml:space="preserve">Advantia - Maven-Scanner (07.2022-09.2022)</w:t>
-      </w:r>
-    </w:p>
-    <w:p>
-      <w:pPr>
-        <w:numPr>
-          <w:ilvl w:val="0"/>
-          <w:numId w:val="1003"/>
-        </w:numPr>
-        <w:pStyle w:val="Compact"/>
+        <w:t xml:space="preserve">07.2022 – 09.2022</w:t>
+      </w:r>
+    </w:p>
+    <w:p>
+      <w:pPr>
+        <w:numPr>
+          <w:ilvl w:val="0"/>
+          <w:numId w:val="1005"/>
+        </w:numPr>
       </w:pPr>
       <w:r>
         <w:rPr>
@@ -661,9 +812,8 @@
       <w:pPr>
         <w:numPr>
           <w:ilvl w:val="0"/>
-          <w:numId w:val="1003"/>
-        </w:numPr>
-        <w:pStyle w:val="Compact"/>
+          <w:numId w:val="1005"/>
+        </w:numPr>
       </w:pPr>
       <w:r>
         <w:rPr>
@@ -683,9 +833,8 @@
       <w:pPr>
         <w:numPr>
           <w:ilvl w:val="0"/>
-          <w:numId w:val="1003"/>
-        </w:numPr>
-        <w:pStyle w:val="Compact"/>
+          <w:numId w:val="1005"/>
+        </w:numPr>
       </w:pPr>
       <w:r>
         <w:rPr>
@@ -701,23 +850,22 @@
         <w:t xml:space="preserve">Entwicklung eines BOM-Generators für Maven-Projekte. Mitarbeit an einem Docker-Image-Package-Scanner.</w:t>
       </w:r>
     </w:p>
-    <w:bookmarkEnd w:id="25"/>
-    <w:bookmarkStart w:id="26" w:name="marketoolz---test-first-05.2022-06.2022"/>
+    <w:bookmarkEnd w:id="27"/>
+    <w:bookmarkStart w:id="28" w:name="section-4"/>
     <w:p>
       <w:pPr>
         <w:pStyle w:val="Heading3"/>
       </w:pPr>
       <w:r>
-        <w:t xml:space="preserve">marketoolz - Test First (05.2022-06.2022)</w:t>
-      </w:r>
-    </w:p>
-    <w:p>
-      <w:pPr>
-        <w:numPr>
-          <w:ilvl w:val="0"/>
-          <w:numId w:val="1004"/>
-        </w:numPr>
-        <w:pStyle w:val="Compact"/>
+        <w:t xml:space="preserve">05.2022 – 06.2022</w:t>
+      </w:r>
+    </w:p>
+    <w:p>
+      <w:pPr>
+        <w:numPr>
+          <w:ilvl w:val="0"/>
+          <w:numId w:val="1006"/>
+        </w:numPr>
       </w:pPr>
       <w:r>
         <w:rPr>
@@ -737,9 +885,8 @@
       <w:pPr>
         <w:numPr>
           <w:ilvl w:val="0"/>
-          <w:numId w:val="1004"/>
-        </w:numPr>
-        <w:pStyle w:val="Compact"/>
+          <w:numId w:val="1006"/>
+        </w:numPr>
       </w:pPr>
       <w:r>
         <w:rPr>
@@ -759,9 +906,8 @@
       <w:pPr>
         <w:numPr>
           <w:ilvl w:val="0"/>
-          <w:numId w:val="1004"/>
-        </w:numPr>
-        <w:pStyle w:val="Compact"/>
+          <w:numId w:val="1006"/>
+        </w:numPr>
       </w:pPr>
       <w:r>
         <w:rPr>
@@ -777,23 +923,22 @@
         <w:t xml:space="preserve">Vorbereitung zur Einführung von „Test First“ und Behebung von Blocker-Issues in SonarQube.</w:t>
       </w:r>
     </w:p>
-    <w:bookmarkEnd w:id="26"/>
-    <w:bookmarkStart w:id="27" w:name="iqoptimize---openstack-03.2022-04.2022"/>
+    <w:bookmarkEnd w:id="28"/>
+    <w:bookmarkStart w:id="29" w:name="section-5"/>
     <w:p>
       <w:pPr>
         <w:pStyle w:val="Heading3"/>
       </w:pPr>
       <w:r>
-        <w:t xml:space="preserve">iqOptimize - OpenStack (03.2022-04.2022)</w:t>
-      </w:r>
-    </w:p>
-    <w:p>
-      <w:pPr>
-        <w:numPr>
-          <w:ilvl w:val="0"/>
-          <w:numId w:val="1005"/>
-        </w:numPr>
-        <w:pStyle w:val="Compact"/>
+        <w:t xml:space="preserve">03.2022 – 04.2022</w:t>
+      </w:r>
+    </w:p>
+    <w:p>
+      <w:pPr>
+        <w:numPr>
+          <w:ilvl w:val="0"/>
+          <w:numId w:val="1007"/>
+        </w:numPr>
       </w:pPr>
       <w:r>
         <w:rPr>
@@ -813,9 +958,8 @@
       <w:pPr>
         <w:numPr>
           <w:ilvl w:val="0"/>
-          <w:numId w:val="1005"/>
-        </w:numPr>
-        <w:pStyle w:val="Compact"/>
+          <w:numId w:val="1007"/>
+        </w:numPr>
       </w:pPr>
       <w:r>
         <w:rPr>
@@ -835,9 +979,8 @@
       <w:pPr>
         <w:numPr>
           <w:ilvl w:val="0"/>
-          <w:numId w:val="1005"/>
-        </w:numPr>
-        <w:pStyle w:val="Compact"/>
+          <w:numId w:val="1007"/>
+        </w:numPr>
       </w:pPr>
       <w:r>
         <w:rPr>
@@ -853,23 +996,22 @@
         <w:t xml:space="preserve">Einrichtung zusätzlicher GitLab-Agenten sowie Erstellung von Build- und Deploy-Pipelines für OpenStack (kolla-ansible, Cinder).</w:t>
       </w:r>
     </w:p>
-    <w:bookmarkEnd w:id="27"/>
-    <w:bookmarkStart w:id="28" w:name="X2960fbf7e2bddf88c803590b914b2539c852f7c"/>
+    <w:bookmarkEnd w:id="29"/>
+    <w:bookmarkStart w:id="30" w:name="section-6"/>
     <w:p>
       <w:pPr>
         <w:pStyle w:val="Heading3"/>
       </w:pPr>
       <w:r>
-        <w:t xml:space="preserve">Stadtwerke München - Web und Plattformen (10.2021-03.2022)</w:t>
-      </w:r>
-    </w:p>
-    <w:p>
-      <w:pPr>
-        <w:numPr>
-          <w:ilvl w:val="0"/>
-          <w:numId w:val="1006"/>
-        </w:numPr>
-        <w:pStyle w:val="Compact"/>
+        <w:t xml:space="preserve">10.2021 – 03.2022</w:t>
+      </w:r>
+    </w:p>
+    <w:p>
+      <w:pPr>
+        <w:numPr>
+          <w:ilvl w:val="0"/>
+          <w:numId w:val="1008"/>
+        </w:numPr>
       </w:pPr>
       <w:r>
         <w:rPr>
@@ -889,9 +1031,8 @@
       <w:pPr>
         <w:numPr>
           <w:ilvl w:val="0"/>
-          <w:numId w:val="1006"/>
-        </w:numPr>
-        <w:pStyle w:val="Compact"/>
+          <w:numId w:val="1008"/>
+        </w:numPr>
       </w:pPr>
       <w:r>
         <w:rPr>
@@ -911,9 +1052,8 @@
       <w:pPr>
         <w:numPr>
           <w:ilvl w:val="0"/>
-          <w:numId w:val="1006"/>
-        </w:numPr>
-        <w:pStyle w:val="Compact"/>
+          <w:numId w:val="1008"/>
+        </w:numPr>
       </w:pPr>
       <w:r>
         <w:rPr>
@@ -929,23 +1069,22 @@
         <w:t xml:space="preserve">Betrieb von über 400 individuellen Installationen der Stadtwerke München, MVG und muenchen.de. Bereitstellung eines dynamischen Ansible-Repos mit Python auf Basis von libgender.</w:t>
       </w:r>
     </w:p>
-    <w:bookmarkEnd w:id="28"/>
-    <w:bookmarkStart w:id="29" w:name="Xcdfc8e64e06b2d30b45d82fd6424ea9ecc9be19"/>
+    <w:bookmarkEnd w:id="30"/>
+    <w:bookmarkStart w:id="31" w:name="section-7"/>
     <w:p>
       <w:pPr>
         <w:pStyle w:val="Heading3"/>
       </w:pPr>
       <w:r>
-        <w:t xml:space="preserve">Munich Re Investment Partners - Silvertree (11.2020-03.2021)</w:t>
-      </w:r>
-    </w:p>
-    <w:p>
-      <w:pPr>
-        <w:numPr>
-          <w:ilvl w:val="0"/>
-          <w:numId w:val="1007"/>
-        </w:numPr>
-        <w:pStyle w:val="Compact"/>
+        <w:t xml:space="preserve">11.2020 – 03.2021</w:t>
+      </w:r>
+    </w:p>
+    <w:p>
+      <w:pPr>
+        <w:numPr>
+          <w:ilvl w:val="0"/>
+          <w:numId w:val="1009"/>
+        </w:numPr>
       </w:pPr>
       <w:r>
         <w:rPr>
@@ -965,9 +1104,8 @@
       <w:pPr>
         <w:numPr>
           <w:ilvl w:val="0"/>
-          <w:numId w:val="1007"/>
-        </w:numPr>
-        <w:pStyle w:val="Compact"/>
+          <w:numId w:val="1009"/>
+        </w:numPr>
       </w:pPr>
       <w:r>
         <w:rPr>
@@ -987,9 +1125,8 @@
       <w:pPr>
         <w:numPr>
           <w:ilvl w:val="0"/>
-          <w:numId w:val="1007"/>
-        </w:numPr>
-        <w:pStyle w:val="Compact"/>
+          <w:numId w:val="1009"/>
+        </w:numPr>
       </w:pPr>
       <w:r>
         <w:rPr>
@@ -1005,23 +1142,22 @@
         <w:t xml:space="preserve">Aufbau von Integrationstests in Azure Pipelines und Kubernetes. Implementierung von Alerting, Fehlerbehebung, Nutzung der Loki-Instanz, sowie Erstellung diverser Verwaltungsjobs (DB-Restore, Pod-Reports, Log-Dumps).</w:t>
       </w:r>
     </w:p>
-    <w:bookmarkEnd w:id="29"/>
-    <w:bookmarkStart w:id="30" w:name="X9cdc96f0825f53172000d29d8942f9b38ab4ddb"/>
+    <w:bookmarkEnd w:id="31"/>
+    <w:bookmarkStart w:id="32" w:name="section-8"/>
     <w:p>
       <w:pPr>
         <w:pStyle w:val="Heading3"/>
       </w:pPr>
       <w:r>
-        <w:t xml:space="preserve">Vontobel, Schweiz - Deritrade 17 (05.2020-08.2020)</w:t>
-      </w:r>
-    </w:p>
-    <w:p>
-      <w:pPr>
-        <w:numPr>
-          <w:ilvl w:val="0"/>
-          <w:numId w:val="1008"/>
-        </w:numPr>
-        <w:pStyle w:val="Compact"/>
+        <w:t xml:space="preserve">01.2020 – 12.2020</w:t>
+      </w:r>
+    </w:p>
+    <w:p>
+      <w:pPr>
+        <w:numPr>
+          <w:ilvl w:val="0"/>
+          <w:numId w:val="1010"/>
+        </w:numPr>
       </w:pPr>
       <w:r>
         <w:rPr>
@@ -1034,16 +1170,15 @@
         <w:t xml:space="preserve"> </w:t>
       </w:r>
       <w:r>
-        <w:t xml:space="preserve">DevOps, Server-Admin, interim Application Manager</w:t>
-      </w:r>
-    </w:p>
-    <w:p>
-      <w:pPr>
-        <w:numPr>
-          <w:ilvl w:val="0"/>
-          <w:numId w:val="1008"/>
-        </w:numPr>
-        <w:pStyle w:val="Compact"/>
+        <w:t xml:space="preserve">Go-Entwickler, DevOps Engineer</w:t>
+      </w:r>
+    </w:p>
+    <w:p>
+      <w:pPr>
+        <w:numPr>
+          <w:ilvl w:val="0"/>
+          <w:numId w:val="1010"/>
+        </w:numPr>
       </w:pPr>
       <w:r>
         <w:rPr>
@@ -1056,16 +1191,36 @@
         <w:t xml:space="preserve"> </w:t>
       </w:r>
       <w:r>
-        <w:t xml:space="preserve">Linux (RHEL), Spring Boot, Bash, Maven, Adopt OpenJDK 11, Docker, Docker-compose, Hashicorp Vault, ELK, Jenkins, OpenVPN, TestRail, Jira, Confluence</w:t>
-      </w:r>
-    </w:p>
-    <w:p>
-      <w:pPr>
-        <w:numPr>
-          <w:ilvl w:val="0"/>
-          <w:numId w:val="1008"/>
-        </w:numPr>
-        <w:pStyle w:val="Compact"/>
+        <w:t xml:space="preserve">Go, Cobra CLI, Docker, Kubernetes, MkDocs, GitLab CI</w:t>
+      </w:r>
+    </w:p>
+    <w:p>
+      <w:pPr>
+        <w:numPr>
+          <w:ilvl w:val="0"/>
+          <w:numId w:val="1010"/>
+        </w:numPr>
+      </w:pPr>
+      <w:r>
+        <w:rPr>
+          <w:bCs/>
+          <w:b/>
+        </w:rPr>
+        <w:t xml:space="preserve">Projekt:</w:t>
+      </w:r>
+      <w:r>
+        <w:t xml:space="preserve"> </w:t>
+      </w:r>
+      <w:r>
+        <w:t xml:space="preserve">kvledger (Pro Bono)</w:t>
+      </w:r>
+    </w:p>
+    <w:p>
+      <w:pPr>
+        <w:numPr>
+          <w:ilvl w:val="0"/>
+          <w:numId w:val="1010"/>
+        </w:numPr>
       </w:pPr>
       <w:r>
         <w:rPr>
@@ -1078,26 +1233,25 @@
         <w:t xml:space="preserve"> </w:t>
       </w:r>
       <w:r>
-        <w:t xml:space="preserve">Übernahme der Wartung im Zuge des Insourcings von einem externen Team. Erstellung von Docker-Compose und Controller-Skripten für eine dockerisierte Microservice-Architektur. Einrichtung von Monitoring, IP-Freischaltungen, Etablierung eines Client-to-Site-VPNs. Abschaltung wegen Nachfolgeversion.</w:t>
-      </w:r>
-    </w:p>
-    <w:bookmarkEnd w:id="30"/>
-    <w:bookmarkStart w:id="31" w:name="Xaf4918230fc665c631a6e6d05748b0d5a4485a1"/>
+        <w:t xml:space="preserve">Architektur und Entwicklung eines dezentralen Config-Stores auf Ledger-Basis, inklusive Go-CLI (Cobra), Docker/Kubernetes-Deployments und MkDocs-Dokumentation für global verteilte Service-Mesh-Konfigurationen.</w:t>
+      </w:r>
+    </w:p>
+    <w:bookmarkEnd w:id="32"/>
+    <w:bookmarkStart w:id="33" w:name="laufend-1"/>
     <w:p>
       <w:pPr>
         <w:pStyle w:val="Heading3"/>
       </w:pPr>
       <w:r>
-        <w:t xml:space="preserve">VZUG, Zug, Schweiz - MyVZugHome V3 (01.2020-04.2020)</w:t>
-      </w:r>
-    </w:p>
-    <w:p>
-      <w:pPr>
-        <w:numPr>
-          <w:ilvl w:val="0"/>
-          <w:numId w:val="1009"/>
-        </w:numPr>
-        <w:pStyle w:val="Compact"/>
+        <w:t xml:space="preserve">07.2020 – laufend</w:t>
+      </w:r>
+    </w:p>
+    <w:p>
+      <w:pPr>
+        <w:numPr>
+          <w:ilvl w:val="0"/>
+          <w:numId w:val="1011"/>
+        </w:numPr>
       </w:pPr>
       <w:r>
         <w:rPr>
@@ -1110,6 +1264,173 @@
         <w:t xml:space="preserve"> </w:t>
       </w:r>
       <w:r>
+        <w:t xml:space="preserve">Entwickler, Betreiber</w:t>
+      </w:r>
+    </w:p>
+    <w:p>
+      <w:pPr>
+        <w:numPr>
+          <w:ilvl w:val="0"/>
+          <w:numId w:val="1011"/>
+        </w:numPr>
+      </w:pPr>
+      <w:r>
+        <w:rPr>
+          <w:bCs/>
+          <w:b/>
+        </w:rPr>
+        <w:t xml:space="preserve">Technologien:</w:t>
+      </w:r>
+      <w:r>
+        <w:t xml:space="preserve"> </w:t>
+      </w:r>
+      <w:r>
+        <w:t xml:space="preserve">Azure Pipelines, Bash, GitLab</w:t>
+      </w:r>
+    </w:p>
+    <w:p>
+      <w:pPr>
+        <w:numPr>
+          <w:ilvl w:val="0"/>
+          <w:numId w:val="1011"/>
+        </w:numPr>
+      </w:pPr>
+      <w:r>
+        <w:rPr>
+          <w:bCs/>
+          <w:b/>
+        </w:rPr>
+        <w:t xml:space="preserve">Projekt:</w:t>
+      </w:r>
+      <w:r>
+        <w:t xml:space="preserve"> </w:t>
+      </w:r>
+      <w:r>
+        <w:t xml:space="preserve">Clici (Pro Bono)</w:t>
+      </w:r>
+    </w:p>
+    <w:p>
+      <w:pPr>
+        <w:numPr>
+          <w:ilvl w:val="0"/>
+          <w:numId w:val="1011"/>
+        </w:numPr>
+      </w:pPr>
+      <w:r>
+        <w:rPr>
+          <w:bCs/>
+          <w:b/>
+        </w:rPr>
+        <w:t xml:space="preserve">Aufgaben:</w:t>
+      </w:r>
+      <w:r>
+        <w:t xml:space="preserve"> </w:t>
+      </w:r>
+      <w:r>
+        <w:t xml:space="preserve">Entwicklung und Betreuung eines bash-basierten Build-Frameworks für CI/CD-Pipelines. Verantwortlich für CLI-Entwurf, Modul-Scaffolding, Dokumentation und Releases. Bereitstellung als Open-Source-Projekt (https://metafence.gitlab.io/clici/).</w:t>
+      </w:r>
+    </w:p>
+    <w:bookmarkEnd w:id="33"/>
+    <w:bookmarkStart w:id="34" w:name="section-9"/>
+    <w:p>
+      <w:pPr>
+        <w:pStyle w:val="Heading3"/>
+      </w:pPr>
+      <w:r>
+        <w:t xml:space="preserve">05.2020 – 08.2020</w:t>
+      </w:r>
+    </w:p>
+    <w:p>
+      <w:pPr>
+        <w:numPr>
+          <w:ilvl w:val="0"/>
+          <w:numId w:val="1012"/>
+        </w:numPr>
+      </w:pPr>
+      <w:r>
+        <w:rPr>
+          <w:bCs/>
+          <w:b/>
+        </w:rPr>
+        <w:t xml:space="preserve">Rolle(n):</w:t>
+      </w:r>
+      <w:r>
+        <w:t xml:space="preserve"> </w:t>
+      </w:r>
+      <w:r>
+        <w:t xml:space="preserve">DevOps, Server-Admin, Interim Application Manager</w:t>
+      </w:r>
+    </w:p>
+    <w:p>
+      <w:pPr>
+        <w:numPr>
+          <w:ilvl w:val="0"/>
+          <w:numId w:val="1012"/>
+        </w:numPr>
+      </w:pPr>
+      <w:r>
+        <w:rPr>
+          <w:bCs/>
+          <w:b/>
+        </w:rPr>
+        <w:t xml:space="preserve">Technologien:</w:t>
+      </w:r>
+      <w:r>
+        <w:t xml:space="preserve"> </w:t>
+      </w:r>
+      <w:r>
+        <w:t xml:space="preserve">Linux (RHEL), Spring Boot, Bash, Maven, AdoptOpenJDK 11, Docker, Docker Compose, Hashicorp Vault, ELK, Jenkins, OpenVPN, TestRail, Jira, Confluence</w:t>
+      </w:r>
+    </w:p>
+    <w:p>
+      <w:pPr>
+        <w:numPr>
+          <w:ilvl w:val="0"/>
+          <w:numId w:val="1012"/>
+        </w:numPr>
+      </w:pPr>
+      <w:r>
+        <w:rPr>
+          <w:bCs/>
+          <w:b/>
+        </w:rPr>
+        <w:t xml:space="preserve">Aufgaben:</w:t>
+      </w:r>
+      <w:r>
+        <w:t xml:space="preserve"> </w:t>
+      </w:r>
+      <w:r>
+        <w:t xml:space="preserve">Übernahme der Wartung im Zuge des Insourcings von einem externen Team. Erstellung von Docker Compose Workflows und Controller-Skripten für eine dockerisierte Microservice-Architektur. Einrichtung von Monitoring, IP-Freischaltungen, Etablierung eines Client-to-Site-VPNs. Abschaltung wegen Nachfolgeversion.</w:t>
+      </w:r>
+    </w:p>
+    <w:bookmarkEnd w:id="34"/>
+    <w:bookmarkStart w:id="35" w:name="section-10"/>
+    <w:p>
+      <w:pPr>
+        <w:pStyle w:val="Heading3"/>
+      </w:pPr>
+      <w:r>
+        <w:t xml:space="preserve">01.2020 – 04.2020</w:t>
+      </w:r>
+    </w:p>
+    <w:p>
+      <w:pPr>
+        <w:numPr>
+          <w:ilvl w:val="0"/>
+          <w:numId w:val="1013"/>
+        </w:numPr>
+      </w:pPr>
+      <w:r>
+        <w:rPr>
+          <w:bCs/>
+          <w:b/>
+        </w:rPr>
+        <w:t xml:space="preserve">Rolle(n):</w:t>
+      </w:r>
+      <w:r>
+        <w:t xml:space="preserve"> </w:t>
+      </w:r>
+      <w:r>
         <w:t xml:space="preserve">DevOps, Server-Admin</w:t>
       </w:r>
     </w:p>
@@ -1117,9 +1438,8 @@
       <w:pPr>
         <w:numPr>
           <w:ilvl w:val="0"/>
-          <w:numId w:val="1009"/>
-        </w:numPr>
-        <w:pStyle w:val="Compact"/>
+          <w:numId w:val="1013"/>
+        </w:numPr>
       </w:pPr>
       <w:r>
         <w:rPr>
@@ -1139,9 +1459,8 @@
       <w:pPr>
         <w:numPr>
           <w:ilvl w:val="0"/>
-          <w:numId w:val="1009"/>
-        </w:numPr>
-        <w:pStyle w:val="Compact"/>
+          <w:numId w:val="1013"/>
+        </w:numPr>
       </w:pPr>
       <w:r>
         <w:rPr>
@@ -1157,23 +1476,22 @@
         <w:t xml:space="preserve">Unterstützung der Entwickler bei Eclipse-Problemen. Setup von zwei On-Prem-Maschinen für Inhousing, Dockerisierung des Build-Prozesses, Einführung von Thinlinc. Ab März Übergabe an T-Systems.</w:t>
       </w:r>
     </w:p>
-    <w:bookmarkEnd w:id="31"/>
-    <w:bookmarkStart w:id="32" w:name="Xf5b635cfcb771bef1afdd041698fdaa8f1952bc"/>
+    <w:bookmarkEnd w:id="35"/>
+    <w:bookmarkStart w:id="36" w:name="section-11"/>
     <w:p>
       <w:pPr>
         <w:pStyle w:val="Heading3"/>
       </w:pPr>
       <w:r>
-        <w:t xml:space="preserve">Cyber-Solutions, München - Webshop 3.0 (10.2019-12.2019)</w:t>
-      </w:r>
-    </w:p>
-    <w:p>
-      <w:pPr>
-        <w:numPr>
-          <w:ilvl w:val="0"/>
-          <w:numId w:val="1010"/>
-        </w:numPr>
-        <w:pStyle w:val="Compact"/>
+        <w:t xml:space="preserve">10.2019 – 12.2019</w:t>
+      </w:r>
+    </w:p>
+    <w:p>
+      <w:pPr>
+        <w:numPr>
+          <w:ilvl w:val="0"/>
+          <w:numId w:val="1014"/>
+        </w:numPr>
       </w:pPr>
       <w:r>
         <w:rPr>
@@ -1193,9 +1511,8 @@
       <w:pPr>
         <w:numPr>
           <w:ilvl w:val="0"/>
-          <w:numId w:val="1010"/>
-        </w:numPr>
-        <w:pStyle w:val="Compact"/>
+          <w:numId w:val="1014"/>
+        </w:numPr>
       </w:pPr>
       <w:r>
         <w:rPr>
@@ -1208,16 +1525,15 @@
         <w:t xml:space="preserve"> </w:t>
       </w:r>
       <w:r>
-        <w:t xml:space="preserve">Percona Cluster, Percona Manager, Grafana, Linux, Docker, Ansible, Docker-compose, Jira, Confluence, Bitbucket, Jenkins, Hybris, SSH, csshx</w:t>
-      </w:r>
-    </w:p>
-    <w:p>
-      <w:pPr>
-        <w:numPr>
-          <w:ilvl w:val="0"/>
-          <w:numId w:val="1010"/>
-        </w:numPr>
-        <w:pStyle w:val="Compact"/>
+        <w:t xml:space="preserve">Percona Cluster, Percona Manager, Grafana, Linux, Docker, Ansible, Docker Compose, Jira, Confluence, Bitbucket, Jenkins, Hybris, SSH, csshx</w:t>
+      </w:r>
+    </w:p>
+    <w:p>
+      <w:pPr>
+        <w:numPr>
+          <w:ilvl w:val="0"/>
+          <w:numId w:val="1014"/>
+        </w:numPr>
       </w:pPr>
       <w:r>
         <w:rPr>
@@ -1233,23 +1549,22 @@
         <w:t xml:space="preserve">Vorbereitung auf Black Friday/Cyber Monday: Migration von vier Umgebungen von MySQL zu Percona. Installation und Konfiguration des Percona Management Servers. Erstellung von Jenkins-Jobs und Bereitschaftsdienst.</w:t>
       </w:r>
     </w:p>
-    <w:bookmarkEnd w:id="32"/>
-    <w:bookmarkStart w:id="33" w:name="Xf7e2ff71290dabe61d37086f3b586f5be628504"/>
+    <w:bookmarkEnd w:id="36"/>
+    <w:bookmarkStart w:id="37" w:name="section-12"/>
     <w:p>
       <w:pPr>
         <w:pStyle w:val="Heading3"/>
       </w:pPr>
       <w:r>
-        <w:t xml:space="preserve">Consors Nürnberg - Zentrales Release-Management (08.2019-09.2019)</w:t>
-      </w:r>
-    </w:p>
-    <w:p>
-      <w:pPr>
-        <w:numPr>
-          <w:ilvl w:val="0"/>
-          <w:numId w:val="1011"/>
-        </w:numPr>
-        <w:pStyle w:val="Compact"/>
+        <w:t xml:space="preserve">08.2019 – 09.2019</w:t>
+      </w:r>
+    </w:p>
+    <w:p>
+      <w:pPr>
+        <w:numPr>
+          <w:ilvl w:val="0"/>
+          <w:numId w:val="1015"/>
+        </w:numPr>
       </w:pPr>
       <w:r>
         <w:rPr>
@@ -1269,9 +1584,8 @@
       <w:pPr>
         <w:numPr>
           <w:ilvl w:val="0"/>
-          <w:numId w:val="1011"/>
-        </w:numPr>
-        <w:pStyle w:val="Compact"/>
+          <w:numId w:val="1015"/>
+        </w:numPr>
       </w:pPr>
       <w:r>
         <w:rPr>
@@ -1291,9 +1605,8 @@
       <w:pPr>
         <w:numPr>
           <w:ilvl w:val="0"/>
-          <w:numId w:val="1011"/>
-        </w:numPr>
-        <w:pStyle w:val="Compact"/>
+          <w:numId w:val="1015"/>
+        </w:numPr>
       </w:pPr>
       <w:r>
         <w:rPr>
@@ -1309,23 +1622,22 @@
         <w:t xml:space="preserve">Tägliches Einsammeln, Normalisieren und Zusammenführen der Ticket-Statusberichte von zwölf Projektteams.</w:t>
       </w:r>
     </w:p>
-    <w:bookmarkEnd w:id="33"/>
-    <w:bookmarkStart w:id="34" w:name="X40a090671f8d501791d4347205a953858480f1c"/>
+    <w:bookmarkEnd w:id="37"/>
+    <w:bookmarkStart w:id="38" w:name="section-13"/>
     <w:p>
       <w:pPr>
         <w:pStyle w:val="Heading3"/>
       </w:pPr>
       <w:r>
-        <w:t xml:space="preserve">TAB Erfurt - eCohesion Automatisierung und Funktionstrennung (04.2019-07.2019)</w:t>
-      </w:r>
-    </w:p>
-    <w:p>
-      <w:pPr>
-        <w:numPr>
-          <w:ilvl w:val="0"/>
-          <w:numId w:val="1012"/>
-        </w:numPr>
-        <w:pStyle w:val="Compact"/>
+        <w:t xml:space="preserve">04.2019 – 07.2019</w:t>
+      </w:r>
+    </w:p>
+    <w:p>
+      <w:pPr>
+        <w:numPr>
+          <w:ilvl w:val="0"/>
+          <w:numId w:val="1016"/>
+        </w:numPr>
       </w:pPr>
       <w:r>
         <w:rPr>
@@ -1345,9 +1657,8 @@
       <w:pPr>
         <w:numPr>
           <w:ilvl w:val="0"/>
-          <w:numId w:val="1012"/>
-        </w:numPr>
-        <w:pStyle w:val="Compact"/>
+          <w:numId w:val="1016"/>
+        </w:numPr>
       </w:pPr>
       <w:r>
         <w:rPr>
@@ -1367,9 +1678,8 @@
       <w:pPr>
         <w:numPr>
           <w:ilvl w:val="0"/>
-          <w:numId w:val="1012"/>
-        </w:numPr>
-        <w:pStyle w:val="Compact"/>
+          <w:numId w:val="1016"/>
+        </w:numPr>
       </w:pPr>
       <w:r>
         <w:rPr>
@@ -1385,23 +1695,22 @@
         <w:t xml:space="preserve">Durchführung manueller Staging- und Live-Deployments in Liferay. Migration der CI-Umgebung von Jenkins/Gitblit nach GitLab. Aufbau erster Docker-basierter Build-Agents, Mitarbeit in Task-Forces zur Code-Qualität, Entwicklung eines IaC-Ansatzes sowie Ticketbearbeitung und Fehlersuche.</w:t>
       </w:r>
     </w:p>
-    <w:bookmarkEnd w:id="34"/>
-    <w:bookmarkStart w:id="35" w:name="zf-passau---devops-a4.0-10.2018-01.2019"/>
+    <w:bookmarkEnd w:id="38"/>
+    <w:bookmarkStart w:id="39" w:name="section-14"/>
     <w:p>
       <w:pPr>
         <w:pStyle w:val="Heading3"/>
       </w:pPr>
       <w:r>
-        <w:t xml:space="preserve">ZF Passau - DevOps A4.0 (10.2018-01.2019)</w:t>
-      </w:r>
-    </w:p>
-    <w:p>
-      <w:pPr>
-        <w:numPr>
-          <w:ilvl w:val="0"/>
-          <w:numId w:val="1013"/>
-        </w:numPr>
-        <w:pStyle w:val="Compact"/>
+        <w:t xml:space="preserve">10.2018 – 01.2019</w:t>
+      </w:r>
+    </w:p>
+    <w:p>
+      <w:pPr>
+        <w:numPr>
+          <w:ilvl w:val="0"/>
+          <w:numId w:val="1017"/>
+        </w:numPr>
       </w:pPr>
       <w:r>
         <w:rPr>
@@ -1421,9 +1730,8 @@
       <w:pPr>
         <w:numPr>
           <w:ilvl w:val="0"/>
-          <w:numId w:val="1013"/>
-        </w:numPr>
-        <w:pStyle w:val="Compact"/>
+          <w:numId w:val="1017"/>
+        </w:numPr>
       </w:pPr>
       <w:r>
         <w:rPr>
@@ -1443,9 +1751,8 @@
       <w:pPr>
         <w:numPr>
           <w:ilvl w:val="0"/>
-          <w:numId w:val="1013"/>
-        </w:numPr>
-        <w:pStyle w:val="Compact"/>
+          <w:numId w:val="1017"/>
+        </w:numPr>
       </w:pPr>
       <w:r>
         <w:rPr>
@@ -1458,26 +1765,25 @@
         <w:t xml:space="preserve"> </w:t>
       </w:r>
       <w:r>
-        <w:t xml:space="preserve">Design und Aufbau einer IaC-Toolchain zur automatisierten Erstellung von Umgebungen auf Basis von OpenStack und TFS Build Jobs. Erstellung von Testumgebungen mit RabbitMQ und Python mittels Docker-compose. Einrichtung eines Remote-Zugriffs auf Ubuntu-VMs via Citrix.</w:t>
-      </w:r>
-    </w:p>
-    <w:bookmarkEnd w:id="35"/>
-    <w:bookmarkStart w:id="36" w:name="X730f41baae93e2a77516e3961888cc486689d71"/>
+        <w:t xml:space="preserve">Design und Aufbau einer IaC-Toolchain zur automatisierten Erstellung von Umgebungen auf Basis von OpenStack und TFS Build Jobs. Erstellung von Testumgebungen mit RabbitMQ und Python mittels Docker Compose. Einrichtung eines Remote-Zugriffs auf Ubuntu-VMs via Citrix.</w:t>
+      </w:r>
+    </w:p>
+    <w:bookmarkEnd w:id="39"/>
+    <w:bookmarkStart w:id="40" w:name="section-15"/>
     <w:p>
       <w:pPr>
         <w:pStyle w:val="Heading3"/>
       </w:pPr>
       <w:r>
-        <w:t xml:space="preserve">Voith DSG - DevOps IoT &amp; OpenStack (07.2017-09.2018)</w:t>
-      </w:r>
-    </w:p>
-    <w:p>
-      <w:pPr>
-        <w:numPr>
-          <w:ilvl w:val="0"/>
-          <w:numId w:val="1014"/>
-        </w:numPr>
-        <w:pStyle w:val="Compact"/>
+        <w:t xml:space="preserve">07.2017 – 09.2018</w:t>
+      </w:r>
+    </w:p>
+    <w:p>
+      <w:pPr>
+        <w:numPr>
+          <w:ilvl w:val="0"/>
+          <w:numId w:val="1018"/>
+        </w:numPr>
       </w:pPr>
       <w:r>
         <w:rPr>
@@ -1497,9 +1803,8 @@
       <w:pPr>
         <w:numPr>
           <w:ilvl w:val="0"/>
-          <w:numId w:val="1014"/>
-        </w:numPr>
-        <w:pStyle w:val="Compact"/>
+          <w:numId w:val="1018"/>
+        </w:numPr>
       </w:pPr>
       <w:r>
         <w:rPr>
@@ -1519,9 +1824,8 @@
       <w:pPr>
         <w:numPr>
           <w:ilvl w:val="0"/>
-          <w:numId w:val="1014"/>
-        </w:numPr>
-        <w:pStyle w:val="Compact"/>
+          <w:numId w:val="1018"/>
+        </w:numPr>
       </w:pPr>
       <w:r>
         <w:rPr>
@@ -1537,23 +1841,22 @@
         <w:t xml:space="preserve">Aufbau einer Container-Umgebung (CoreOS, Rancher). Betrieb und Sicherung der zentralen GitLab-Instanz mittels Ansible. Unterstützung der Entwickler bei CI/CD-Pipelines. Automatisierung von Deployments für Red Hat OpenStack (Undercloud, Overcloud) mit GitLab-CI und Ansible. Erstellung eines Consul-Clusters (PoC), automatischer Backup-Testprozess für GitLab. Gelegentliche Scrum-Master-Tätigkeiten.</w:t>
       </w:r>
     </w:p>
-    <w:bookmarkEnd w:id="36"/>
-    <w:bookmarkStart w:id="37" w:name="bdk---devops-phoenix-09.2016-06.2017"/>
+    <w:bookmarkEnd w:id="40"/>
+    <w:bookmarkStart w:id="41" w:name="section-16"/>
     <w:p>
       <w:pPr>
         <w:pStyle w:val="Heading3"/>
       </w:pPr>
       <w:r>
-        <w:t xml:space="preserve">Bdk - DevOps Phoenix (09.2016-06.2017)</w:t>
-      </w:r>
-    </w:p>
-    <w:p>
-      <w:pPr>
-        <w:numPr>
-          <w:ilvl w:val="0"/>
-          <w:numId w:val="1015"/>
-        </w:numPr>
-        <w:pStyle w:val="Compact"/>
+        <w:t xml:space="preserve">09.2016 – 06.2017</w:t>
+      </w:r>
+    </w:p>
+    <w:p>
+      <w:pPr>
+        <w:numPr>
+          <w:ilvl w:val="0"/>
+          <w:numId w:val="1019"/>
+        </w:numPr>
       </w:pPr>
       <w:r>
         <w:rPr>
@@ -1573,9 +1876,8 @@
       <w:pPr>
         <w:numPr>
           <w:ilvl w:val="0"/>
-          <w:numId w:val="1015"/>
-        </w:numPr>
-        <w:pStyle w:val="Compact"/>
+          <w:numId w:val="1019"/>
+        </w:numPr>
       </w:pPr>
       <w:r>
         <w:rPr>
@@ -1595,9 +1897,8 @@
       <w:pPr>
         <w:numPr>
           <w:ilvl w:val="0"/>
-          <w:numId w:val="1015"/>
-        </w:numPr>
-        <w:pStyle w:val="Compact"/>
+          <w:numId w:val="1019"/>
+        </w:numPr>
       </w:pPr>
       <w:r>
         <w:rPr>
@@ -1613,23 +1914,22 @@
         <w:t xml:space="preserve">Wartung einer bestehenden CI-Umgebung (Nexus, Gradle, Jenkins mit 20 Slaves, Tomcat). Unterstützung bei der Migration zu JobDSL, Evaluation von Provisioning-Tools, Aufbau prototypischer Entwicklungsinfrastrukturen (Ansible, Docker, GitLab, Tomcat, nginx). Entwicklung eines Docker-Swarm-Prototypen, Git-Coaching, Durchführung von Präsentationen, Prozessberatung, Entwurf eines Ethereum-basierten Geschäftsmodells, Erstellung von Installations- und Betriebskonzepten.</w:t>
       </w:r>
     </w:p>
-    <w:bookmarkEnd w:id="37"/>
-    <w:bookmarkStart w:id="38" w:name="X4906461d78988c105e84993fec637440fe1553c"/>
+    <w:bookmarkEnd w:id="41"/>
+    <w:bookmarkStart w:id="42" w:name="section-17"/>
     <w:p>
       <w:pPr>
         <w:pStyle w:val="Heading3"/>
       </w:pPr>
       <w:r>
-        <w:t xml:space="preserve">Interhyp - Great Place to Work / ER-Technologien (06.2016-09.2016)</w:t>
-      </w:r>
-    </w:p>
-    <w:p>
-      <w:pPr>
-        <w:numPr>
-          <w:ilvl w:val="0"/>
-          <w:numId w:val="1016"/>
-        </w:numPr>
-        <w:pStyle w:val="Compact"/>
+        <w:t xml:space="preserve">06.2016 – 09.2016</w:t>
+      </w:r>
+    </w:p>
+    <w:p>
+      <w:pPr>
+        <w:numPr>
+          <w:ilvl w:val="0"/>
+          <w:numId w:val="1020"/>
+        </w:numPr>
       </w:pPr>
       <w:r>
         <w:rPr>
@@ -1649,9 +1949,8 @@
       <w:pPr>
         <w:numPr>
           <w:ilvl w:val="0"/>
-          <w:numId w:val="1016"/>
-        </w:numPr>
-        <w:pStyle w:val="Compact"/>
+          <w:numId w:val="1020"/>
+        </w:numPr>
       </w:pPr>
       <w:r>
         <w:rPr>
@@ -1671,9 +1970,8 @@
       <w:pPr>
         <w:numPr>
           <w:ilvl w:val="0"/>
-          <w:numId w:val="1016"/>
-        </w:numPr>
-        <w:pStyle w:val="Compact"/>
+          <w:numId w:val="1020"/>
+        </w:numPr>
       </w:pPr>
       <w:r>
         <w:rPr>
@@ -1689,23 +1987,22 @@
         <w:t xml:space="preserve">Konzeption und Durchführung der Migration von CVS zu Git. Mitarbeit an einem Schulungskonzept, Integration in Bitbucket/Jira, Konzeption von Git-Flow für Interhyp, Erstellung von Export-/Import-Skripten, Durchführung von Git-Workshops sowie einer Klein-Studie zu Feature-Toggles.</w:t>
       </w:r>
     </w:p>
-    <w:bookmarkEnd w:id="38"/>
-    <w:bookmarkStart w:id="39" w:name="X6dc6dc5cc3ba8abfb94e109b0e1b3e897cbca5d"/>
+    <w:bookmarkEnd w:id="42"/>
+    <w:bookmarkStart w:id="43" w:name="section-18"/>
     <w:p>
       <w:pPr>
         <w:pStyle w:val="Heading3"/>
       </w:pPr>
       <w:r>
-        <w:t xml:space="preserve">Hornbach - DevOps, cubus, step2pim (01.2016-05.2016)</w:t>
-      </w:r>
-    </w:p>
-    <w:p>
-      <w:pPr>
-        <w:numPr>
-          <w:ilvl w:val="0"/>
-          <w:numId w:val="1017"/>
-        </w:numPr>
-        <w:pStyle w:val="Compact"/>
+        <w:t xml:space="preserve">01.2016 – 05.2016</w:t>
+      </w:r>
+    </w:p>
+    <w:p>
+      <w:pPr>
+        <w:numPr>
+          <w:ilvl w:val="0"/>
+          <w:numId w:val="1021"/>
+        </w:numPr>
       </w:pPr>
       <w:r>
         <w:rPr>
@@ -1725,9 +2022,8 @@
       <w:pPr>
         <w:numPr>
           <w:ilvl w:val="0"/>
-          <w:numId w:val="1017"/>
-        </w:numPr>
-        <w:pStyle w:val="Compact"/>
+          <w:numId w:val="1021"/>
+        </w:numPr>
       </w:pPr>
       <w:r>
         <w:rPr>
@@ -1747,9 +2043,8 @@
       <w:pPr>
         <w:numPr>
           <w:ilvl w:val="0"/>
-          <w:numId w:val="1017"/>
-        </w:numPr>
-        <w:pStyle w:val="Compact"/>
+          <w:numId w:val="1021"/>
+        </w:numPr>
       </w:pPr>
       <w:r>
         <w:rPr>
@@ -1765,23 +2060,22 @@
         <w:t xml:space="preserve">Mitarbeit im DevOps-Team (3 Personen). Konzeption und Umsetzung einer Deployment-Pipeline auf Basis des Apache ServiceBus, Unterstützung bei Maven-Skripten, Technologieentscheidungen und Präsentationen. Aufbau eines Dashboards mit Raspberry Pi II und Raspbian. Design eines Basis-Images für VMs, Ticket-Bearbeitung, User-Administration, Verwaltung von GitLab/Jenkins, Management von Verteilprozessen, Neuaufbau von Build-Pipelines für Apache ServiceMix-Projekte.</w:t>
       </w:r>
     </w:p>
-    <w:bookmarkEnd w:id="39"/>
-    <w:bookmarkStart w:id="40" w:name="vhv-gruppe---kobra-08.2015-12.2015"/>
+    <w:bookmarkEnd w:id="43"/>
+    <w:bookmarkStart w:id="44" w:name="section-19"/>
     <w:p>
       <w:pPr>
         <w:pStyle w:val="Heading3"/>
       </w:pPr>
       <w:r>
-        <w:t xml:space="preserve">VHV Gruppe - Kobra (08.2015-12.2015)</w:t>
-      </w:r>
-    </w:p>
-    <w:p>
-      <w:pPr>
-        <w:numPr>
-          <w:ilvl w:val="0"/>
-          <w:numId w:val="1018"/>
-        </w:numPr>
-        <w:pStyle w:val="Compact"/>
+        <w:t xml:space="preserve">08.2015 – 12.2015</w:t>
+      </w:r>
+    </w:p>
+    <w:p>
+      <w:pPr>
+        <w:numPr>
+          <w:ilvl w:val="0"/>
+          <w:numId w:val="1022"/>
+        </w:numPr>
       </w:pPr>
       <w:r>
         <w:rPr>
@@ -1801,9 +2095,8 @@
       <w:pPr>
         <w:numPr>
           <w:ilvl w:val="0"/>
-          <w:numId w:val="1018"/>
-        </w:numPr>
-        <w:pStyle w:val="Compact"/>
+          <w:numId w:val="1022"/>
+        </w:numPr>
       </w:pPr>
       <w:r>
         <w:rPr>
@@ -1823,9 +2116,8 @@
       <w:pPr>
         <w:numPr>
           <w:ilvl w:val="0"/>
-          <w:numId w:val="1018"/>
-        </w:numPr>
-        <w:pStyle w:val="Compact"/>
+          <w:numId w:val="1022"/>
+        </w:numPr>
       </w:pPr>
       <w:r>
         <w:rPr>
@@ -1841,23 +2133,22 @@
         <w:t xml:space="preserve">Analyse, Planung und teilweise Durchführung der Migrationen von CruiseControl zu Jenkins, von CVS zu Subversion sowie von Ant nach Maven. Erstellung diverser Präsentationen, Statusberichte und Mini-Schulungen der betroffenen Mitarbeiter.</w:t>
       </w:r>
     </w:p>
-    <w:bookmarkEnd w:id="40"/>
-    <w:bookmarkStart w:id="41" w:name="Xc70b170c8aac7da1ad80acbf2c526127dbb1a0e"/>
+    <w:bookmarkEnd w:id="44"/>
+    <w:bookmarkStart w:id="45" w:name="section-20"/>
     <w:p>
       <w:pPr>
         <w:pStyle w:val="Heading3"/>
       </w:pPr>
       <w:r>
-        <w:t xml:space="preserve">p3 group - BigDataBackend (05.2015-07.2015)</w:t>
-      </w:r>
-    </w:p>
-    <w:p>
-      <w:pPr>
-        <w:numPr>
-          <w:ilvl w:val="0"/>
-          <w:numId w:val="1019"/>
-        </w:numPr>
-        <w:pStyle w:val="Compact"/>
+        <w:t xml:space="preserve">05.2015 – 07.2015</w:t>
+      </w:r>
+    </w:p>
+    <w:p>
+      <w:pPr>
+        <w:numPr>
+          <w:ilvl w:val="0"/>
+          <w:numId w:val="1023"/>
+        </w:numPr>
       </w:pPr>
       <w:r>
         <w:rPr>
@@ -1877,9 +2168,8 @@
       <w:pPr>
         <w:numPr>
           <w:ilvl w:val="0"/>
-          <w:numId w:val="1019"/>
-        </w:numPr>
-        <w:pStyle w:val="Compact"/>
+          <w:numId w:val="1023"/>
+        </w:numPr>
       </w:pPr>
       <w:r>
         <w:rPr>
@@ -1899,9 +2189,8 @@
       <w:pPr>
         <w:numPr>
           <w:ilvl w:val="0"/>
-          <w:numId w:val="1019"/>
-        </w:numPr>
-        <w:pStyle w:val="Compact"/>
+          <w:numId w:val="1023"/>
+        </w:numPr>
       </w:pPr>
       <w:r>
         <w:rPr>
@@ -1917,23 +2206,22 @@
         <w:t xml:space="preserve">Erstellung einer Dokumentationsplattform basierend auf dem Maven Site Plugin. Optimierung von Jenkins-Builds, Evaluation von Vagrant, Überarbeitung des Multi-Module-Maven-Builds, Migration von Subversion nach Git, Verbesserung der Integrationstests sowie Wartung des Entwickler-Clusters.</w:t>
       </w:r>
     </w:p>
-    <w:bookmarkEnd w:id="41"/>
-    <w:bookmarkStart w:id="42" w:name="X41761c1707aa09d7e5141132304e1ab76e8c79d"/>
+    <w:bookmarkEnd w:id="45"/>
+    <w:bookmarkStart w:id="46" w:name="section-21"/>
     <w:p>
       <w:pPr>
         <w:pStyle w:val="Heading3"/>
       </w:pPr>
       <w:r>
-        <w:t xml:space="preserve">ESG / Volkswagen - Livas3, CoMa (11.2014-04.2015)</w:t>
-      </w:r>
-    </w:p>
-    <w:p>
-      <w:pPr>
-        <w:numPr>
-          <w:ilvl w:val="0"/>
-          <w:numId w:val="1020"/>
-        </w:numPr>
-        <w:pStyle w:val="Compact"/>
+        <w:t xml:space="preserve">11.2014 – 04.2015</w:t>
+      </w:r>
+    </w:p>
+    <w:p>
+      <w:pPr>
+        <w:numPr>
+          <w:ilvl w:val="0"/>
+          <w:numId w:val="1024"/>
+        </w:numPr>
       </w:pPr>
       <w:r>
         <w:rPr>
@@ -1953,9 +2241,8 @@
       <w:pPr>
         <w:numPr>
           <w:ilvl w:val="0"/>
-          <w:numId w:val="1020"/>
-        </w:numPr>
-        <w:pStyle w:val="Compact"/>
+          <w:numId w:val="1024"/>
+        </w:numPr>
       </w:pPr>
       <w:r>
         <w:rPr>
@@ -1975,9 +2262,8 @@
       <w:pPr>
         <w:numPr>
           <w:ilvl w:val="0"/>
-          <w:numId w:val="1020"/>
-        </w:numPr>
-        <w:pStyle w:val="Compact"/>
+          <w:numId w:val="1024"/>
+        </w:numPr>
       </w:pPr>
       <w:r>
         <w:rPr>
@@ -1993,23 +2279,22 @@
         <w:t xml:space="preserve">Refactoring und Weiterentwicklung eines Systems zur Übersetzung von Betriebshandbüchern in verschiedene Sprachen. Entwicklung von Swing-Komponenten, Anpassung der SOAP-Schnittstelle (Client und Server) an neue Typen, Erstellung von Mockups für den Endkunden sowie Coaching jüngerer Entwickler und Fehlerbehebung.</w:t>
       </w:r>
     </w:p>
-    <w:bookmarkEnd w:id="42"/>
-    <w:bookmarkStart w:id="43" w:name="Xc41422e16eb9b69cb48f89aa00b34d73c4cc0ea"/>
+    <w:bookmarkEnd w:id="46"/>
+    <w:bookmarkStart w:id="47" w:name="section-22"/>
     <w:p>
       <w:pPr>
         <w:pStyle w:val="Heading3"/>
       </w:pPr>
       <w:r>
-        <w:t xml:space="preserve">Teamware / Audi - Entwickler-Box, Import-Tools (04.2014-09.2014)</w:t>
-      </w:r>
-    </w:p>
-    <w:p>
-      <w:pPr>
-        <w:numPr>
-          <w:ilvl w:val="0"/>
-          <w:numId w:val="1021"/>
-        </w:numPr>
-        <w:pStyle w:val="Compact"/>
+        <w:t xml:space="preserve">04.2014 – 09.2014</w:t>
+      </w:r>
+    </w:p>
+    <w:p>
+      <w:pPr>
+        <w:numPr>
+          <w:ilvl w:val="0"/>
+          <w:numId w:val="1025"/>
+        </w:numPr>
       </w:pPr>
       <w:r>
         <w:rPr>
@@ -2029,9 +2314,8 @@
       <w:pPr>
         <w:numPr>
           <w:ilvl w:val="0"/>
-          <w:numId w:val="1021"/>
-        </w:numPr>
-        <w:pStyle w:val="Compact"/>
+          <w:numId w:val="1025"/>
+        </w:numPr>
       </w:pPr>
       <w:r>
         <w:rPr>
@@ -2051,9 +2335,8 @@
       <w:pPr>
         <w:numPr>
           <w:ilvl w:val="0"/>
-          <w:numId w:val="1021"/>
-        </w:numPr>
-        <w:pStyle w:val="Compact"/>
+          <w:numId w:val="1025"/>
+        </w:numPr>
       </w:pPr>
       <w:r>
         <w:rPr>
@@ -2069,23 +2352,22 @@
         <w:t xml:space="preserve">Erstellung eines VirtualBox-Images für Entwickler. Entwicklung zweier Import-Tools für Datenabgleich mittels eines RCP-Clients. Vorbereitung eines OCSP-Providers als Ersatz der bestehenden CRL-Lösung.</w:t>
       </w:r>
     </w:p>
-    <w:bookmarkEnd w:id="43"/>
-    <w:bookmarkStart w:id="44" w:name="Xee505e5411f11f7119830debe713e588c92b3ff"/>
+    <w:bookmarkEnd w:id="47"/>
+    <w:bookmarkStart w:id="48" w:name="section-23"/>
     <w:p>
       <w:pPr>
         <w:pStyle w:val="Heading3"/>
       </w:pPr>
       <w:r>
-        <w:t xml:space="preserve">SBB Bern - Admintools / Debugging (09.2013-12.2013)</w:t>
-      </w:r>
-    </w:p>
-    <w:p>
-      <w:pPr>
-        <w:numPr>
-          <w:ilvl w:val="0"/>
-          <w:numId w:val="1022"/>
-        </w:numPr>
-        <w:pStyle w:val="Compact"/>
+        <w:t xml:space="preserve">09.2013 – 12.2013</w:t>
+      </w:r>
+    </w:p>
+    <w:p>
+      <w:pPr>
+        <w:numPr>
+          <w:ilvl w:val="0"/>
+          <w:numId w:val="1026"/>
+        </w:numPr>
       </w:pPr>
       <w:r>
         <w:rPr>
@@ -2105,9 +2387,8 @@
       <w:pPr>
         <w:numPr>
           <w:ilvl w:val="0"/>
-          <w:numId w:val="1022"/>
-        </w:numPr>
-        <w:pStyle w:val="Compact"/>
+          <w:numId w:val="1026"/>
+        </w:numPr>
       </w:pPr>
       <w:r>
         <w:rPr>
@@ -2127,9 +2408,8 @@
       <w:pPr>
         <w:numPr>
           <w:ilvl w:val="0"/>
-          <w:numId w:val="1022"/>
-        </w:numPr>
-        <w:pStyle w:val="Compact"/>
+          <w:numId w:val="1026"/>
+        </w:numPr>
       </w:pPr>
       <w:r>
         <w:rPr>
@@ -2145,23 +2425,22 @@
         <w:t xml:space="preserve">Fehlerbehebung im laufenden Shop-Betrieb sowie Erweiterung der Backoffice-Administrationstools.</w:t>
       </w:r>
     </w:p>
-    <w:bookmarkEnd w:id="44"/>
-    <w:bookmarkStart w:id="45" w:name="Xa53e0861a622351dd1ee44f3b5b0ff73a0c66fb"/>
+    <w:bookmarkEnd w:id="48"/>
+    <w:bookmarkStart w:id="49" w:name="section-24"/>
     <w:p>
       <w:pPr>
         <w:pStyle w:val="Heading3"/>
       </w:pPr>
       <w:r>
-        <w:t xml:space="preserve">IBM Chemnitz - SEPA Management-Tool (04.2013-08.2013)</w:t>
-      </w:r>
-    </w:p>
-    <w:p>
-      <w:pPr>
-        <w:numPr>
-          <w:ilvl w:val="0"/>
-          <w:numId w:val="1023"/>
-        </w:numPr>
-        <w:pStyle w:val="Compact"/>
+        <w:t xml:space="preserve">04.2013 – 08.2013</w:t>
+      </w:r>
+    </w:p>
+    <w:p>
+      <w:pPr>
+        <w:numPr>
+          <w:ilvl w:val="0"/>
+          <w:numId w:val="1027"/>
+        </w:numPr>
       </w:pPr>
       <w:r>
         <w:rPr>
@@ -2174,16 +2453,15 @@
         <w:t xml:space="preserve"> </w:t>
       </w:r>
       <w:r>
-        <w:t xml:space="preserve">Software-Entwickler, interim Team-Lead</w:t>
-      </w:r>
-    </w:p>
-    <w:p>
-      <w:pPr>
-        <w:numPr>
-          <w:ilvl w:val="0"/>
-          <w:numId w:val="1023"/>
-        </w:numPr>
-        <w:pStyle w:val="Compact"/>
+        <w:t xml:space="preserve">Software-Entwickler, Interim Team-Lead</w:t>
+      </w:r>
+    </w:p>
+    <w:p>
+      <w:pPr>
+        <w:numPr>
+          <w:ilvl w:val="0"/>
+          <w:numId w:val="1027"/>
+        </w:numPr>
       </w:pPr>
       <w:r>
         <w:rPr>
@@ -2203,9 +2481,8 @@
       <w:pPr>
         <w:numPr>
           <w:ilvl w:val="0"/>
-          <w:numId w:val="1023"/>
-        </w:numPr>
-        <w:pStyle w:val="Compact"/>
+          <w:numId w:val="1027"/>
+        </w:numPr>
       </w:pPr>
       <w:r>
         <w:rPr>
@@ -2221,23 +2498,22 @@
         <w:t xml:space="preserve">Implementierung des camt.54-Imports für eine Webanwendung zum Management von SEPA Direct Debit Mandaten und SEPA Credit Transfers. Überarbeitung des Unit-Test-Frameworks und interimistischer Team-Lead kleinerer Teams.</w:t>
       </w:r>
     </w:p>
-    <w:bookmarkEnd w:id="45"/>
-    <w:bookmarkStart w:id="46" w:name="postbank---termintool-01.2013-04.2013"/>
+    <w:bookmarkEnd w:id="49"/>
+    <w:bookmarkStart w:id="50" w:name="section-25"/>
     <w:p>
       <w:pPr>
         <w:pStyle w:val="Heading3"/>
       </w:pPr>
       <w:r>
-        <w:t xml:space="preserve">Postbank - Termintool (01.2013-04.2013)</w:t>
-      </w:r>
-    </w:p>
-    <w:p>
-      <w:pPr>
-        <w:numPr>
-          <w:ilvl w:val="0"/>
-          <w:numId w:val="1024"/>
-        </w:numPr>
-        <w:pStyle w:val="Compact"/>
+        <w:t xml:space="preserve">01.2013 – 04.2013</w:t>
+      </w:r>
+    </w:p>
+    <w:p>
+      <w:pPr>
+        <w:numPr>
+          <w:ilvl w:val="0"/>
+          <w:numId w:val="1028"/>
+        </w:numPr>
       </w:pPr>
       <w:r>
         <w:rPr>
@@ -2257,9 +2533,8 @@
       <w:pPr>
         <w:numPr>
           <w:ilvl w:val="0"/>
-          <w:numId w:val="1024"/>
-        </w:numPr>
-        <w:pStyle w:val="Compact"/>
+          <w:numId w:val="1028"/>
+        </w:numPr>
       </w:pPr>
       <w:r>
         <w:rPr>
@@ -2279,9 +2554,8 @@
       <w:pPr>
         <w:numPr>
           <w:ilvl w:val="0"/>
-          <w:numId w:val="1024"/>
-        </w:numPr>
-        <w:pStyle w:val="Compact"/>
+          <w:numId w:val="1028"/>
+        </w:numPr>
       </w:pPr>
       <w:r>
         <w:rPr>
@@ -2297,23 +2571,22 @@
         <w:t xml:space="preserve">Umstellung der Kalender-Anwendung auf eine generische Anwesenheits- und Abwesenheitsverwaltung sowie Behebung diverser Fehler.</w:t>
       </w:r>
     </w:p>
-    <w:bookmarkEnd w:id="46"/>
-    <w:bookmarkStart w:id="47" w:name="Xea834c3f84ed43b0538d44bd5fd5105d7eb044f"/>
+    <w:bookmarkEnd w:id="50"/>
+    <w:bookmarkStart w:id="51" w:name="section-26"/>
     <w:p>
       <w:pPr>
         <w:pStyle w:val="Heading3"/>
       </w:pPr>
       <w:r>
-        <w:t xml:space="preserve">Linde/KION - Intranet-Anwendung (09.2012-12.2012)</w:t>
-      </w:r>
-    </w:p>
-    <w:p>
-      <w:pPr>
-        <w:numPr>
-          <w:ilvl w:val="0"/>
-          <w:numId w:val="1025"/>
-        </w:numPr>
-        <w:pStyle w:val="Compact"/>
+        <w:t xml:space="preserve">09.2012 – 12.2012</w:t>
+      </w:r>
+    </w:p>
+    <w:p>
+      <w:pPr>
+        <w:numPr>
+          <w:ilvl w:val="0"/>
+          <w:numId w:val="1029"/>
+        </w:numPr>
       </w:pPr>
       <w:r>
         <w:rPr>
@@ -2333,9 +2606,8 @@
       <w:pPr>
         <w:numPr>
           <w:ilvl w:val="0"/>
-          <w:numId w:val="1025"/>
-        </w:numPr>
-        <w:pStyle w:val="Compact"/>
+          <w:numId w:val="1029"/>
+        </w:numPr>
       </w:pPr>
       <w:r>
         <w:rPr>
@@ -2355,9 +2627,8 @@
       <w:pPr>
         <w:numPr>
           <w:ilvl w:val="0"/>
-          <w:numId w:val="1025"/>
-        </w:numPr>
-        <w:pStyle w:val="Compact"/>
+          <w:numId w:val="1029"/>
+        </w:numPr>
       </w:pPr>
       <w:r>
         <w:rPr>
@@ -2373,23 +2644,22 @@
         <w:t xml:space="preserve">Implementierung einer hybriden Intranet-Anwendung (Online/Offline) für die Servicetechniker der intern produzierten Industriemaschinen. Umsetzung eines bestehenden RCP-Clients als Wicket-Webanwendung.</w:t>
       </w:r>
     </w:p>
-    <w:bookmarkEnd w:id="47"/>
-    <w:bookmarkStart w:id="48" w:name="X3c7f0dcdd3f6365e5d3a044552a0b5f1fec7b7a"/>
+    <w:bookmarkEnd w:id="51"/>
+    <w:bookmarkStart w:id="52" w:name="section-27"/>
     <w:p>
       <w:pPr>
         <w:pStyle w:val="Heading3"/>
       </w:pPr>
       <w:r>
-        <w:t xml:space="preserve">Flughafen München - EAI: JMS ↔ Corba (10.2011-09.2012)</w:t>
-      </w:r>
-    </w:p>
-    <w:p>
-      <w:pPr>
-        <w:numPr>
-          <w:ilvl w:val="0"/>
-          <w:numId w:val="1026"/>
-        </w:numPr>
-        <w:pStyle w:val="Compact"/>
+        <w:t xml:space="preserve">10.2011 – 09.2012</w:t>
+      </w:r>
+    </w:p>
+    <w:p>
+      <w:pPr>
+        <w:numPr>
+          <w:ilvl w:val="0"/>
+          <w:numId w:val="1030"/>
+        </w:numPr>
       </w:pPr>
       <w:r>
         <w:rPr>
@@ -2409,9 +2679,8 @@
       <w:pPr>
         <w:numPr>
           <w:ilvl w:val="0"/>
-          <w:numId w:val="1026"/>
-        </w:numPr>
-        <w:pStyle w:val="Compact"/>
+          <w:numId w:val="1030"/>
+        </w:numPr>
       </w:pPr>
       <w:r>
         <w:rPr>
@@ -2431,9 +2700,8 @@
       <w:pPr>
         <w:numPr>
           <w:ilvl w:val="0"/>
-          <w:numId w:val="1026"/>
-        </w:numPr>
-        <w:pStyle w:val="Compact"/>
+          <w:numId w:val="1030"/>
+        </w:numPr>
       </w:pPr>
       <w:r>
         <w:rPr>
@@ -2449,23 +2717,22 @@
         <w:t xml:space="preserve">Verfeinerung und Weiterentwicklung eines EAI-Adapters, der externe JMS/XML-Daten entgegennimmt, puffert, validiert, anreichert und an interne Corba-Dienste weiterleitet. Konzeption und Entwicklung weiterer Adapter.</w:t>
       </w:r>
     </w:p>
-    <w:bookmarkEnd w:id="48"/>
-    <w:bookmarkStart w:id="49" w:name="X80bd0a93572971d340ed5c196d49f93d25e71fe"/>
+    <w:bookmarkEnd w:id="52"/>
+    <w:bookmarkStart w:id="53" w:name="section-28"/>
     <w:p>
       <w:pPr>
         <w:pStyle w:val="Heading3"/>
       </w:pPr>
       <w:r>
-        <w:t xml:space="preserve">quisma - Banner-Auslieferung und Tracking (01.2011-08.2011)</w:t>
-      </w:r>
-    </w:p>
-    <w:p>
-      <w:pPr>
-        <w:numPr>
-          <w:ilvl w:val="0"/>
-          <w:numId w:val="1027"/>
-        </w:numPr>
-        <w:pStyle w:val="Compact"/>
+        <w:t xml:space="preserve">01.2011 – 08.2011</w:t>
+      </w:r>
+    </w:p>
+    <w:p>
+      <w:pPr>
+        <w:numPr>
+          <w:ilvl w:val="0"/>
+          <w:numId w:val="1031"/>
+        </w:numPr>
       </w:pPr>
       <w:r>
         <w:rPr>
@@ -2485,9 +2752,8 @@
       <w:pPr>
         <w:numPr>
           <w:ilvl w:val="0"/>
-          <w:numId w:val="1027"/>
-        </w:numPr>
-        <w:pStyle w:val="Compact"/>
+          <w:numId w:val="1031"/>
+        </w:numPr>
       </w:pPr>
       <w:r>
         <w:rPr>
@@ -2507,9 +2773,8 @@
       <w:pPr>
         <w:numPr>
           <w:ilvl w:val="0"/>
-          <w:numId w:val="1027"/>
-        </w:numPr>
-        <w:pStyle w:val="Compact"/>
+          <w:numId w:val="1031"/>
+        </w:numPr>
       </w:pPr>
       <w:r>
         <w:rPr>
@@ -2525,23 +2790,22 @@
         <w:t xml:space="preserve">Übernahme und Performance-Optimierung eines Banner-Auslieferungs- und Click-Tracking-Servers, ursprünglich von einem externen Team in Armenien entwickelt. Behebung eines kritischen Datenbank-Performanceproblems, Optimierung der Build- und Deployment-Prozesse, Entwicklung einer Mini-Profiling-API, allgemeine Performanceverbesserungen, Datenbankbereinigung und Einführung von Git.</w:t>
       </w:r>
     </w:p>
-    <w:bookmarkEnd w:id="49"/>
-    <w:bookmarkStart w:id="50" w:name="X7e8c604cb928f6641e7b8c807ade39e40e7bd86"/>
+    <w:bookmarkEnd w:id="53"/>
+    <w:bookmarkStart w:id="54" w:name="section-29"/>
     <w:p>
       <w:pPr>
         <w:pStyle w:val="Heading3"/>
       </w:pPr>
       <w:r>
-        <w:t xml:space="preserve">Dekra - Gutachten-Abwicklung (07.2010-12.2010)</w:t>
-      </w:r>
-    </w:p>
-    <w:p>
-      <w:pPr>
-        <w:numPr>
-          <w:ilvl w:val="0"/>
-          <w:numId w:val="1028"/>
-        </w:numPr>
-        <w:pStyle w:val="Compact"/>
+        <w:t xml:space="preserve">07.2010 – 12.2010</w:t>
+      </w:r>
+    </w:p>
+    <w:p>
+      <w:pPr>
+        <w:numPr>
+          <w:ilvl w:val="0"/>
+          <w:numId w:val="1032"/>
+        </w:numPr>
       </w:pPr>
       <w:r>
         <w:rPr>
@@ -2561,9 +2825,8 @@
       <w:pPr>
         <w:numPr>
           <w:ilvl w:val="0"/>
-          <w:numId w:val="1028"/>
-        </w:numPr>
-        <w:pStyle w:val="Compact"/>
+          <w:numId w:val="1032"/>
+        </w:numPr>
       </w:pPr>
       <w:r>
         <w:rPr>
@@ -2583,9 +2846,8 @@
       <w:pPr>
         <w:numPr>
           <w:ilvl w:val="0"/>
-          <w:numId w:val="1028"/>
-        </w:numPr>
-        <w:pStyle w:val="Compact"/>
+          <w:numId w:val="1032"/>
+        </w:numPr>
       </w:pPr>
       <w:r>
         <w:rPr>
@@ -2601,23 +2863,22 @@
         <w:t xml:space="preserve">Erweiterung eines bestehenden Swing-Clients für die anstehende TÜV-Privatisierung. Implementierung von Komponenten auf allen Schichten sowie Konzeption und Umsetzung verschiedener Teilfunktionen und Module.</w:t>
       </w:r>
     </w:p>
-    <w:bookmarkEnd w:id="50"/>
-    <w:bookmarkStart w:id="51" w:name="X74a56c9827b886b090a7dc7809c4b119d91865f"/>
+    <w:bookmarkEnd w:id="54"/>
+    <w:bookmarkStart w:id="55" w:name="section-30"/>
     <w:p>
       <w:pPr>
         <w:pStyle w:val="Heading3"/>
       </w:pPr>
       <w:r>
-        <w:t xml:space="preserve">McKay Relocation Services - CRM-Lösung (04.2010-08.2010)</w:t>
-      </w:r>
-    </w:p>
-    <w:p>
-      <w:pPr>
-        <w:numPr>
-          <w:ilvl w:val="0"/>
-          <w:numId w:val="1029"/>
-        </w:numPr>
-        <w:pStyle w:val="Compact"/>
+        <w:t xml:space="preserve">04.2010 – 08.2010</w:t>
+      </w:r>
+    </w:p>
+    <w:p>
+      <w:pPr>
+        <w:numPr>
+          <w:ilvl w:val="0"/>
+          <w:numId w:val="1033"/>
+        </w:numPr>
       </w:pPr>
       <w:r>
         <w:rPr>
@@ -2637,9 +2898,8 @@
       <w:pPr>
         <w:numPr>
           <w:ilvl w:val="0"/>
-          <w:numId w:val="1029"/>
-        </w:numPr>
-        <w:pStyle w:val="Compact"/>
+          <w:numId w:val="1033"/>
+        </w:numPr>
       </w:pPr>
       <w:r>
         <w:rPr>
@@ -2659,9 +2919,8 @@
       <w:pPr>
         <w:numPr>
           <w:ilvl w:val="0"/>
-          <w:numId w:val="1029"/>
-        </w:numPr>
-        <w:pStyle w:val="Compact"/>
+          <w:numId w:val="1033"/>
+        </w:numPr>
       </w:pPr>
       <w:r>
         <w:rPr>
@@ -2677,23 +2936,22 @@
         <w:t xml:space="preserve">Konzeption und Umsetzung einer Webanwendung zur Verwaltung von Kundenbeziehungen und Abwicklung von Umzugsprojekten.</w:t>
       </w:r>
     </w:p>
-    <w:bookmarkEnd w:id="51"/>
-    <w:bookmarkStart w:id="52" w:name="vkb---zentraler-build-12.2009-02.2010"/>
+    <w:bookmarkEnd w:id="55"/>
+    <w:bookmarkStart w:id="56" w:name="section-31"/>
     <w:p>
       <w:pPr>
         <w:pStyle w:val="Heading3"/>
       </w:pPr>
       <w:r>
-        <w:t xml:space="preserve">VKB - Zentraler Build (12.2009-02.2010)</w:t>
-      </w:r>
-    </w:p>
-    <w:p>
-      <w:pPr>
-        <w:numPr>
-          <w:ilvl w:val="0"/>
-          <w:numId w:val="1030"/>
-        </w:numPr>
-        <w:pStyle w:val="Compact"/>
+        <w:t xml:space="preserve">12.2009 – 02.2010</w:t>
+      </w:r>
+    </w:p>
+    <w:p>
+      <w:pPr>
+        <w:numPr>
+          <w:ilvl w:val="0"/>
+          <w:numId w:val="1034"/>
+        </w:numPr>
       </w:pPr>
       <w:r>
         <w:rPr>
@@ -2713,9 +2971,8 @@
       <w:pPr>
         <w:numPr>
           <w:ilvl w:val="0"/>
-          <w:numId w:val="1030"/>
-        </w:numPr>
-        <w:pStyle w:val="Compact"/>
+          <w:numId w:val="1034"/>
+        </w:numPr>
       </w:pPr>
       <w:r>
         <w:rPr>
@@ -2735,9 +2992,8 @@
       <w:pPr>
         <w:numPr>
           <w:ilvl w:val="0"/>
-          <w:numId w:val="1030"/>
-        </w:numPr>
-        <w:pStyle w:val="Compact"/>
+          <w:numId w:val="1034"/>
+        </w:numPr>
       </w:pPr>
       <w:r>
         <w:rPr>
@@ -2753,23 +3009,22 @@
         <w:t xml:space="preserve">Portierung diverser Java-Projekte (Eclipse RCP, Eclipse PDE) von Ant nach Maven sowie Einrichtung entsprechender Build-Pläne in Bamboo.</w:t>
       </w:r>
     </w:p>
-    <w:bookmarkEnd w:id="52"/>
-    <w:bookmarkStart w:id="53" w:name="Xf0dd14f28dd0e48cf2282a91eddd62b60bcb0b8"/>
+    <w:bookmarkEnd w:id="56"/>
+    <w:bookmarkStart w:id="57" w:name="section-32"/>
     <w:p>
       <w:pPr>
         <w:pStyle w:val="Heading3"/>
       </w:pPr>
       <w:r>
-        <w:t xml:space="preserve">Allianz AG - Korrespondenz-Management (01.2009-11.2009)</w:t>
-      </w:r>
-    </w:p>
-    <w:p>
-      <w:pPr>
-        <w:numPr>
-          <w:ilvl w:val="0"/>
-          <w:numId w:val="1031"/>
-        </w:numPr>
-        <w:pStyle w:val="Compact"/>
+        <w:t xml:space="preserve">01.2009 – 11.2009</w:t>
+      </w:r>
+    </w:p>
+    <w:p>
+      <w:pPr>
+        <w:numPr>
+          <w:ilvl w:val="0"/>
+          <w:numId w:val="1035"/>
+        </w:numPr>
       </w:pPr>
       <w:r>
         <w:rPr>
@@ -2789,9 +3044,8 @@
       <w:pPr>
         <w:numPr>
           <w:ilvl w:val="0"/>
-          <w:numId w:val="1031"/>
-        </w:numPr>
-        <w:pStyle w:val="Compact"/>
+          <w:numId w:val="1035"/>
+        </w:numPr>
       </w:pPr>
       <w:r>
         <w:rPr>
@@ -2811,9 +3065,8 @@
       <w:pPr>
         <w:numPr>
           <w:ilvl w:val="0"/>
-          <w:numId w:val="1031"/>
-        </w:numPr>
-        <w:pStyle w:val="Compact"/>
+          <w:numId w:val="1035"/>
+        </w:numPr>
       </w:pPr>
       <w:r>
         <w:rPr>
@@ -2844,23 +3097,22 @@
         <w:t xml:space="preserve">.</w:t>
       </w:r>
     </w:p>
-    <w:bookmarkEnd w:id="53"/>
-    <w:bookmarkStart w:id="54" w:name="X186a438a6e1407bd42cf6c3027257917b6975c0"/>
+    <w:bookmarkEnd w:id="57"/>
+    <w:bookmarkStart w:id="58" w:name="section-33"/>
     <w:p>
       <w:pPr>
         <w:pStyle w:val="Heading3"/>
       </w:pPr>
       <w:r>
-        <w:t xml:space="preserve">British Telecom - Ticketing (04.2008-10.2008)</w:t>
-      </w:r>
-    </w:p>
-    <w:p>
-      <w:pPr>
-        <w:numPr>
-          <w:ilvl w:val="0"/>
-          <w:numId w:val="1032"/>
-        </w:numPr>
-        <w:pStyle w:val="Compact"/>
+        <w:t xml:space="preserve">04.2008 – 10.2008</w:t>
+      </w:r>
+    </w:p>
+    <w:p>
+      <w:pPr>
+        <w:numPr>
+          <w:ilvl w:val="0"/>
+          <w:numId w:val="1036"/>
+        </w:numPr>
       </w:pPr>
       <w:r>
         <w:rPr>
@@ -2880,9 +3132,8 @@
       <w:pPr>
         <w:numPr>
           <w:ilvl w:val="0"/>
-          <w:numId w:val="1032"/>
-        </w:numPr>
-        <w:pStyle w:val="Compact"/>
+          <w:numId w:val="1036"/>
+        </w:numPr>
       </w:pPr>
       <w:r>
         <w:rPr>
@@ -2902,9 +3153,8 @@
       <w:pPr>
         <w:numPr>
           <w:ilvl w:val="0"/>
-          <w:numId w:val="1032"/>
-        </w:numPr>
-        <w:pStyle w:val="Compact"/>
+          <w:numId w:val="1036"/>
+        </w:numPr>
       </w:pPr>
       <w:r>
         <w:rPr>
@@ -2920,23 +3170,22 @@
         <w:t xml:space="preserve">Erweiterung eines Trouble-Management-Systems zur Integration eines zusätzlichen Kunden.</w:t>
       </w:r>
     </w:p>
-    <w:bookmarkEnd w:id="54"/>
-    <w:bookmarkStart w:id="55" w:name="X59469d62566c075ba8c3bb498c5fcdb3b337f39"/>
+    <w:bookmarkEnd w:id="58"/>
+    <w:bookmarkStart w:id="59" w:name="section-34"/>
     <w:p>
       <w:pPr>
         <w:pStyle w:val="Heading3"/>
       </w:pPr>
       <w:r>
-        <w:t xml:space="preserve">GMX GmbH - Integration e. Drittanbieters (07.2007-03.2008)</w:t>
-      </w:r>
-    </w:p>
-    <w:p>
-      <w:pPr>
-        <w:numPr>
-          <w:ilvl w:val="0"/>
-          <w:numId w:val="1033"/>
-        </w:numPr>
-        <w:pStyle w:val="Compact"/>
+        <w:t xml:space="preserve">07.2007 – 03.2008</w:t>
+      </w:r>
+    </w:p>
+    <w:p>
+      <w:pPr>
+        <w:numPr>
+          <w:ilvl w:val="0"/>
+          <w:numId w:val="1037"/>
+        </w:numPr>
       </w:pPr>
       <w:r>
         <w:rPr>
@@ -2956,9 +3205,8 @@
       <w:pPr>
         <w:numPr>
           <w:ilvl w:val="0"/>
-          <w:numId w:val="1033"/>
-        </w:numPr>
-        <w:pStyle w:val="Compact"/>
+          <w:numId w:val="1037"/>
+        </w:numPr>
       </w:pPr>
       <w:r>
         <w:rPr>
@@ -2978,9 +3226,8 @@
       <w:pPr>
         <w:numPr>
           <w:ilvl w:val="0"/>
-          <w:numId w:val="1033"/>
-        </w:numPr>
-        <w:pStyle w:val="Compact"/>
+          <w:numId w:val="1037"/>
+        </w:numPr>
       </w:pPr>
       <w:r>
         <w:rPr>
@@ -2996,23 +3243,22 @@
         <w:t xml:space="preserve">Design und Erstellung eines Adapter-Service (Multi-Protokoll) zur Integration einer Drittanbieter-Lösung zum Faxen per Internet. Design und Erstellung eines zentraler Multiprotokoll-Dienst für die konzernweite Verwaltung von Freikontingenten</w:t>
       </w:r>
     </w:p>
-    <w:bookmarkEnd w:id="55"/>
-    <w:bookmarkStart w:id="56" w:name="Xfe9bf4324d71e88eff3085ef2db7f9753cf4df6"/>
+    <w:bookmarkEnd w:id="59"/>
+    <w:bookmarkStart w:id="60" w:name="section-35"/>
     <w:p>
       <w:pPr>
         <w:pStyle w:val="Heading3"/>
       </w:pPr>
       <w:r>
-        <w:t xml:space="preserve">GWP GmbH - Redesign Auftragsverwaltung (07.2007-05.2008)</w:t>
-      </w:r>
-    </w:p>
-    <w:p>
-      <w:pPr>
-        <w:numPr>
-          <w:ilvl w:val="0"/>
-          <w:numId w:val="1034"/>
-        </w:numPr>
-        <w:pStyle w:val="Compact"/>
+        <w:t xml:space="preserve">07.2007 – 05.2008</w:t>
+      </w:r>
+    </w:p>
+    <w:p>
+      <w:pPr>
+        <w:numPr>
+          <w:ilvl w:val="0"/>
+          <w:numId w:val="1038"/>
+        </w:numPr>
       </w:pPr>
       <w:r>
         <w:rPr>
@@ -3032,9 +3278,8 @@
       <w:pPr>
         <w:numPr>
           <w:ilvl w:val="0"/>
-          <w:numId w:val="1034"/>
-        </w:numPr>
-        <w:pStyle w:val="Compact"/>
+          <w:numId w:val="1038"/>
+        </w:numPr>
       </w:pPr>
       <w:r>
         <w:rPr>
@@ -3054,9 +3299,8 @@
       <w:pPr>
         <w:numPr>
           <w:ilvl w:val="0"/>
-          <w:numId w:val="1034"/>
-        </w:numPr>
-        <w:pStyle w:val="Compact"/>
+          <w:numId w:val="1038"/>
+        </w:numPr>
       </w:pPr>
       <w:r>
         <w:rPr>
@@ -3072,23 +3316,22 @@
         <w:t xml:space="preserve">Überführung eines Delphi Fat Clients zur Auftragsabwicklung in eine SOA-basierte Architektur</w:t>
       </w:r>
     </w:p>
-    <w:bookmarkEnd w:id="56"/>
-    <w:bookmarkStart w:id="57" w:name="X7cbc36b563c29cc9832f4f0502fde9f34b4f4c4"/>
+    <w:bookmarkEnd w:id="60"/>
+    <w:bookmarkStart w:id="61" w:name="section-36"/>
     <w:p>
       <w:pPr>
         <w:pStyle w:val="Heading3"/>
       </w:pPr>
       <w:r>
-        <w:t xml:space="preserve">Virtual Solutions - Prämien-Verbilligung (Schweiz) (11.2006-06.2007)</w:t>
-      </w:r>
-    </w:p>
-    <w:p>
-      <w:pPr>
-        <w:numPr>
-          <w:ilvl w:val="0"/>
-          <w:numId w:val="1035"/>
-        </w:numPr>
-        <w:pStyle w:val="Compact"/>
+        <w:t xml:space="preserve">11.2006 – 06.2007</w:t>
+      </w:r>
+    </w:p>
+    <w:p>
+      <w:pPr>
+        <w:numPr>
+          <w:ilvl w:val="0"/>
+          <w:numId w:val="1039"/>
+        </w:numPr>
       </w:pPr>
       <w:r>
         <w:rPr>
@@ -3108,9 +3351,8 @@
       <w:pPr>
         <w:numPr>
           <w:ilvl w:val="0"/>
-          <w:numId w:val="1035"/>
-        </w:numPr>
-        <w:pStyle w:val="Compact"/>
+          <w:numId w:val="1039"/>
+        </w:numPr>
       </w:pPr>
       <w:r>
         <w:rPr>
@@ -3130,9 +3372,8 @@
       <w:pPr>
         <w:numPr>
           <w:ilvl w:val="0"/>
-          <w:numId w:val="1035"/>
-        </w:numPr>
-        <w:pStyle w:val="Compact"/>
+          <w:numId w:val="1039"/>
+        </w:numPr>
       </w:pPr>
       <w:r>
         <w:rPr>
@@ -3199,23 +3440,22 @@
         <w:t xml:space="preserve">. Hier wurde exzessiv die modellgetriebene Software-Entwicklung betrieben, es kam die gesamte IBM Rational tool chain zum Einsatz. Teilweise in Zürich.</w:t>
       </w:r>
     </w:p>
-    <w:bookmarkEnd w:id="57"/>
-    <w:bookmarkStart w:id="58" w:name="X3f66f44d2e09586aa7cc76c59dfb4619471fdba"/>
+    <w:bookmarkEnd w:id="61"/>
+    <w:bookmarkStart w:id="62" w:name="section-37"/>
     <w:p>
       <w:pPr>
         <w:pStyle w:val="Heading3"/>
       </w:pPr>
       <w:r>
-        <w:t xml:space="preserve">Internet-Agentur - CRM-Lösung (08.2006-09.2006)</w:t>
-      </w:r>
-    </w:p>
-    <w:p>
-      <w:pPr>
-        <w:numPr>
-          <w:ilvl w:val="0"/>
-          <w:numId w:val="1036"/>
-        </w:numPr>
-        <w:pStyle w:val="Compact"/>
+        <w:t xml:space="preserve">08.2006 – 09.2006</w:t>
+      </w:r>
+    </w:p>
+    <w:p>
+      <w:pPr>
+        <w:numPr>
+          <w:ilvl w:val="0"/>
+          <w:numId w:val="1040"/>
+        </w:numPr>
       </w:pPr>
       <w:r>
         <w:rPr>
@@ -3235,9 +3475,8 @@
       <w:pPr>
         <w:numPr>
           <w:ilvl w:val="0"/>
-          <w:numId w:val="1036"/>
-        </w:numPr>
-        <w:pStyle w:val="Compact"/>
+          <w:numId w:val="1040"/>
+        </w:numPr>
       </w:pPr>
       <w:r>
         <w:rPr>
@@ -3257,9 +3496,8 @@
       <w:pPr>
         <w:numPr>
           <w:ilvl w:val="0"/>
-          <w:numId w:val="1036"/>
-        </w:numPr>
-        <w:pStyle w:val="Compact"/>
+          <w:numId w:val="1040"/>
+        </w:numPr>
       </w:pPr>
       <w:r>
         <w:rPr>
@@ -3275,23 +3513,22 @@
         <w:t xml:space="preserve">Im Rahmen einer Urlaubsvertretung Erweiterung einer bestehenden, web-basierten, proprietären CRM-Lösung für die Siemens SRS, sowie die Behebung zahlreicher Bugs.</w:t>
       </w:r>
     </w:p>
-    <w:bookmarkEnd w:id="58"/>
-    <w:bookmarkStart w:id="59" w:name="siemens---transnet-08.2005-07.2006"/>
+    <w:bookmarkEnd w:id="62"/>
+    <w:bookmarkStart w:id="63" w:name="section-38"/>
     <w:p>
       <w:pPr>
         <w:pStyle w:val="Heading3"/>
       </w:pPr>
       <w:r>
-        <w:t xml:space="preserve">Siemens - TransNet (08.2005-07.2006)</w:t>
-      </w:r>
-    </w:p>
-    <w:p>
-      <w:pPr>
-        <w:numPr>
-          <w:ilvl w:val="0"/>
-          <w:numId w:val="1037"/>
-        </w:numPr>
-        <w:pStyle w:val="Compact"/>
+        <w:t xml:space="preserve">08.2005 – 07.2006</w:t>
+      </w:r>
+    </w:p>
+    <w:p>
+      <w:pPr>
+        <w:numPr>
+          <w:ilvl w:val="0"/>
+          <w:numId w:val="1041"/>
+        </w:numPr>
       </w:pPr>
       <w:r>
         <w:rPr>
@@ -3311,9 +3548,8 @@
       <w:pPr>
         <w:numPr>
           <w:ilvl w:val="0"/>
-          <w:numId w:val="1037"/>
-        </w:numPr>
-        <w:pStyle w:val="Compact"/>
+          <w:numId w:val="1041"/>
+        </w:numPr>
       </w:pPr>
       <w:r>
         <w:rPr>
@@ -3333,9 +3569,8 @@
       <w:pPr>
         <w:numPr>
           <w:ilvl w:val="0"/>
-          <w:numId w:val="1037"/>
-        </w:numPr>
-        <w:pStyle w:val="Compact"/>
+          <w:numId w:val="1041"/>
+        </w:numPr>
       </w:pPr>
       <w:r>
         <w:rPr>
@@ -3351,23 +3586,22 @@
         <w:t xml:space="preserve">Überarbeitung der Analyse-Engine eines WAN- Planungtools hinsichtlich einer neuen Produktlinie. Die Analyse-Engine ist Teil eines Fat Clients mit Swing- Oberfläche.</w:t>
       </w:r>
     </w:p>
-    <w:bookmarkEnd w:id="59"/>
-    <w:bookmarkStart w:id="60" w:name="telekom---crm-lösung-06.2003-06.2004"/>
+    <w:bookmarkEnd w:id="63"/>
+    <w:bookmarkStart w:id="64" w:name="section-39"/>
     <w:p>
       <w:pPr>
         <w:pStyle w:val="Heading3"/>
       </w:pPr>
       <w:r>
-        <w:t xml:space="preserve">Telekom - CRM-Lösung (06.2003-06.2004)</w:t>
-      </w:r>
-    </w:p>
-    <w:p>
-      <w:pPr>
-        <w:numPr>
-          <w:ilvl w:val="0"/>
-          <w:numId w:val="1038"/>
-        </w:numPr>
-        <w:pStyle w:val="Compact"/>
+        <w:t xml:space="preserve">06.2003 – 06.2004</w:t>
+      </w:r>
+    </w:p>
+    <w:p>
+      <w:pPr>
+        <w:numPr>
+          <w:ilvl w:val="0"/>
+          <w:numId w:val="1042"/>
+        </w:numPr>
       </w:pPr>
       <w:r>
         <w:rPr>
@@ -3387,9 +3621,8 @@
       <w:pPr>
         <w:numPr>
           <w:ilvl w:val="0"/>
-          <w:numId w:val="1038"/>
-        </w:numPr>
-        <w:pStyle w:val="Compact"/>
+          <w:numId w:val="1042"/>
+        </w:numPr>
       </w:pPr>
       <w:r>
         <w:rPr>
@@ -3409,9 +3642,8 @@
       <w:pPr>
         <w:numPr>
           <w:ilvl w:val="0"/>
-          <w:numId w:val="1038"/>
-        </w:numPr>
-        <w:pStyle w:val="Compact"/>
+          <w:numId w:val="1042"/>
+        </w:numPr>
       </w:pPr>
       <w:r>
         <w:rPr>
@@ -3427,23 +3659,22 @@
         <w:t xml:space="preserve">Wartung des T-Punkt-Client-/Servermoduls, eines eingebetteten Visual Basic Clients zur Bearbeitung von Adressdaten, der seine Daten mittels XML-Schnittstelle von einem Java-Server bezieht, und dorthin speichert.</w:t>
       </w:r>
     </w:p>
-    <w:bookmarkEnd w:id="60"/>
-    <w:bookmarkStart w:id="61" w:name="X74c474ae8cb724a6529919334df0e57815256f6"/>
+    <w:bookmarkEnd w:id="64"/>
+    <w:bookmarkStart w:id="65" w:name="section-40"/>
     <w:p>
       <w:pPr>
         <w:pStyle w:val="Heading3"/>
       </w:pPr>
       <w:r>
-        <w:t xml:space="preserve">Telekom - Massenumschaltung und Rufnummernänderung (01.2003-06.2003)</w:t>
-      </w:r>
-    </w:p>
-    <w:p>
-      <w:pPr>
-        <w:numPr>
-          <w:ilvl w:val="0"/>
-          <w:numId w:val="1039"/>
-        </w:numPr>
-        <w:pStyle w:val="Compact"/>
+        <w:t xml:space="preserve">01.2003 – 06.2003</w:t>
+      </w:r>
+    </w:p>
+    <w:p>
+      <w:pPr>
+        <w:numPr>
+          <w:ilvl w:val="0"/>
+          <w:numId w:val="1043"/>
+        </w:numPr>
       </w:pPr>
       <w:r>
         <w:rPr>
@@ -3463,9 +3694,8 @@
       <w:pPr>
         <w:numPr>
           <w:ilvl w:val="0"/>
-          <w:numId w:val="1039"/>
-        </w:numPr>
-        <w:pStyle w:val="Compact"/>
+          <w:numId w:val="1043"/>
+        </w:numPr>
       </w:pPr>
       <w:r>
         <w:rPr>
@@ -3485,9 +3715,8 @@
       <w:pPr>
         <w:numPr>
           <w:ilvl w:val="0"/>
-          <w:numId w:val="1039"/>
-        </w:numPr>
-        <w:pStyle w:val="Compact"/>
+          <w:numId w:val="1043"/>
+        </w:numPr>
       </w:pPr>
       <w:r>
         <w:rPr>
@@ -3503,23 +3732,22 @@
         <w:t xml:space="preserve">Portierung des zentralen Batch-Moduls zur „Massenumschaltung und Rufnummernänderung“ von Cobol und C/C++ nach Java. Zusammenarbeit in einem dynamisch wechselnden Team.</w:t>
       </w:r>
     </w:p>
-    <w:bookmarkEnd w:id="61"/>
-    <w:bookmarkStart w:id="62" w:name="X6eff855ec62720da73e19afb862b7ba8debebf0"/>
+    <w:bookmarkEnd w:id="65"/>
+    <w:bookmarkStart w:id="66" w:name="section-41"/>
     <w:p>
       <w:pPr>
         <w:pStyle w:val="Heading3"/>
       </w:pPr>
       <w:r>
-        <w:t xml:space="preserve">Telekom - CRM-Lösung (Adressdatenimport) (07.2002-12.2002)</w:t>
-      </w:r>
-    </w:p>
-    <w:p>
-      <w:pPr>
-        <w:numPr>
-          <w:ilvl w:val="0"/>
-          <w:numId w:val="1040"/>
-        </w:numPr>
-        <w:pStyle w:val="Compact"/>
+        <w:t xml:space="preserve">07.2002 – 12.2002</w:t>
+      </w:r>
+    </w:p>
+    <w:p>
+      <w:pPr>
+        <w:numPr>
+          <w:ilvl w:val="0"/>
+          <w:numId w:val="1044"/>
+        </w:numPr>
       </w:pPr>
       <w:r>
         <w:rPr>
@@ -3539,9 +3767,8 @@
       <w:pPr>
         <w:numPr>
           <w:ilvl w:val="0"/>
-          <w:numId w:val="1040"/>
-        </w:numPr>
-        <w:pStyle w:val="Compact"/>
+          <w:numId w:val="1044"/>
+        </w:numPr>
       </w:pPr>
       <w:r>
         <w:rPr>
@@ -3561,9 +3788,8 @@
       <w:pPr>
         <w:numPr>
           <w:ilvl w:val="0"/>
-          <w:numId w:val="1040"/>
-        </w:numPr>
-        <w:pStyle w:val="Compact"/>
+          <w:numId w:val="1044"/>
+        </w:numPr>
       </w:pPr>
       <w:r>
         <w:rPr>
@@ -3579,23 +3805,22 @@
         <w:t xml:space="preserve">Portierung des zentralen Import-Moduls für Vertriebs-Adressdaten von etwa 12 Satelliten-Systemen aus C/C++ und Cobol nach Java unter hohem Zeitdruck.</w:t>
       </w:r>
     </w:p>
-    <w:bookmarkEnd w:id="62"/>
-    <w:bookmarkStart w:id="63" w:name="X3024c8763a8e5d0fd4558c5b3c61ad730ecc0db"/>
+    <w:bookmarkEnd w:id="66"/>
+    <w:bookmarkStart w:id="67" w:name="section-42"/>
     <w:p>
       <w:pPr>
         <w:pStyle w:val="Heading3"/>
       </w:pPr>
       <w:r>
-        <w:t xml:space="preserve">Telekom - CRM-Lösung (Löschvorgänge Überwachung) (04.2002-06.2002)</w:t>
-      </w:r>
-    </w:p>
-    <w:p>
-      <w:pPr>
-        <w:numPr>
-          <w:ilvl w:val="0"/>
-          <w:numId w:val="1041"/>
-        </w:numPr>
-        <w:pStyle w:val="Compact"/>
+        <w:t xml:space="preserve">04.2002 – 06.2002</w:t>
+      </w:r>
+    </w:p>
+    <w:p>
+      <w:pPr>
+        <w:numPr>
+          <w:ilvl w:val="0"/>
+          <w:numId w:val="1045"/>
+        </w:numPr>
       </w:pPr>
       <w:r>
         <w:rPr>
@@ -3615,9 +3840,8 @@
       <w:pPr>
         <w:numPr>
           <w:ilvl w:val="0"/>
-          <w:numId w:val="1041"/>
-        </w:numPr>
-        <w:pStyle w:val="Compact"/>
+          <w:numId w:val="1045"/>
+        </w:numPr>
       </w:pPr>
       <w:r>
         <w:rPr>
@@ -3637,9 +3861,8 @@
       <w:pPr>
         <w:numPr>
           <w:ilvl w:val="0"/>
-          <w:numId w:val="1041"/>
-        </w:numPr>
-        <w:pStyle w:val="Compact"/>
+          <w:numId w:val="1045"/>
+        </w:numPr>
       </w:pPr>
       <w:r>
         <w:rPr>
@@ -3655,23 +3878,22 @@
         <w:t xml:space="preserve">Analyse, Entwurf und Realisierung einer Web-Anwendung zur Überwachung und Auswertung von Löschvorgängen in der zentralen Eintragsdatenbank der T-Com auf Tages-, Wochen- und Monatsbasis. Umsetzung aller Projektphasen außer Anwendungstests.</w:t>
       </w:r>
     </w:p>
-    <w:bookmarkEnd w:id="63"/>
-    <w:bookmarkStart w:id="64" w:name="telekom---produktkatalog-01.2002-03.2002"/>
+    <w:bookmarkEnd w:id="67"/>
+    <w:bookmarkStart w:id="68" w:name="section-43"/>
     <w:p>
       <w:pPr>
         <w:pStyle w:val="Heading3"/>
       </w:pPr>
       <w:r>
-        <w:t xml:space="preserve">Telekom - Produktkatalog (01.2002-03.2002)</w:t>
-      </w:r>
-    </w:p>
-    <w:p>
-      <w:pPr>
-        <w:numPr>
-          <w:ilvl w:val="0"/>
-          <w:numId w:val="1042"/>
-        </w:numPr>
-        <w:pStyle w:val="Compact"/>
+        <w:t xml:space="preserve">01.2002 – 03.2002</w:t>
+      </w:r>
+    </w:p>
+    <w:p>
+      <w:pPr>
+        <w:numPr>
+          <w:ilvl w:val="0"/>
+          <w:numId w:val="1046"/>
+        </w:numPr>
       </w:pPr>
       <w:r>
         <w:rPr>
@@ -3691,9 +3913,8 @@
       <w:pPr>
         <w:numPr>
           <w:ilvl w:val="0"/>
-          <w:numId w:val="1042"/>
-        </w:numPr>
-        <w:pStyle w:val="Compact"/>
+          <w:numId w:val="1046"/>
+        </w:numPr>
       </w:pPr>
       <w:r>
         <w:rPr>
@@ -3713,9 +3934,8 @@
       <w:pPr>
         <w:numPr>
           <w:ilvl w:val="0"/>
-          <w:numId w:val="1042"/>
-        </w:numPr>
-        <w:pStyle w:val="Compact"/>
+          <w:numId w:val="1046"/>
+        </w:numPr>
       </w:pPr>
       <w:r>
         <w:rPr>
@@ -3731,23 +3951,22 @@
         <w:t xml:space="preserve">Entwurf und Implementierung mehrerer Varianten eines EJB zur Speicherung und zum Auslesen von Produktdaten.</w:t>
       </w:r>
     </w:p>
-    <w:bookmarkEnd w:id="64"/>
-    <w:bookmarkStart w:id="65" w:name="X8c6f62bcbaa20b765dcfad228fa81990f37e3ce"/>
+    <w:bookmarkEnd w:id="68"/>
+    <w:bookmarkStart w:id="69" w:name="section-44"/>
     <w:p>
       <w:pPr>
         <w:pStyle w:val="Heading3"/>
       </w:pPr>
       <w:r>
-        <w:t xml:space="preserve">Deutsche Post - Dokumenten-Management (07.2001-08.2001)</w:t>
-      </w:r>
-    </w:p>
-    <w:p>
-      <w:pPr>
-        <w:numPr>
-          <w:ilvl w:val="0"/>
-          <w:numId w:val="1043"/>
-        </w:numPr>
-        <w:pStyle w:val="Compact"/>
+        <w:t xml:space="preserve">07.2001 – 08.2001</w:t>
+      </w:r>
+    </w:p>
+    <w:p>
+      <w:pPr>
+        <w:numPr>
+          <w:ilvl w:val="0"/>
+          <w:numId w:val="1047"/>
+        </w:numPr>
       </w:pPr>
       <w:r>
         <w:rPr>
@@ -3767,9 +3986,8 @@
       <w:pPr>
         <w:numPr>
           <w:ilvl w:val="0"/>
-          <w:numId w:val="1043"/>
-        </w:numPr>
-        <w:pStyle w:val="Compact"/>
+          <w:numId w:val="1047"/>
+        </w:numPr>
       </w:pPr>
       <w:r>
         <w:rPr>
@@ -3789,9 +4007,8 @@
       <w:pPr>
         <w:numPr>
           <w:ilvl w:val="0"/>
-          <w:numId w:val="1043"/>
-        </w:numPr>
-        <w:pStyle w:val="Compact"/>
+          <w:numId w:val="1047"/>
+        </w:numPr>
       </w:pPr>
       <w:r>
         <w:rPr>
@@ -3807,23 +4024,22 @@
         <w:t xml:space="preserve">Wartung des Web-Clients zur Nachbearbeitung von OCR-erkannten Adresskorrekturkarten der Deutschen Post. Verantwortlich für die Datenbankschicht (Weiterentwicklung und Wartung).</w:t>
       </w:r>
     </w:p>
-    <w:bookmarkEnd w:id="65"/>
-    <w:bookmarkStart w:id="66" w:name="X85f6a4ada9546de2d7929a740a5ed14f219a8c3"/>
+    <w:bookmarkEnd w:id="69"/>
+    <w:bookmarkStart w:id="70" w:name="section-45"/>
     <w:p>
       <w:pPr>
         <w:pStyle w:val="Heading3"/>
       </w:pPr>
       <w:r>
-        <w:t xml:space="preserve">Versicherungen - Flying Coach (03.2001-06.2001)</w:t>
-      </w:r>
-    </w:p>
-    <w:p>
-      <w:pPr>
-        <w:numPr>
-          <w:ilvl w:val="0"/>
-          <w:numId w:val="1044"/>
-        </w:numPr>
-        <w:pStyle w:val="Compact"/>
+        <w:t xml:space="preserve">03.2001 – 06.2001</w:t>
+      </w:r>
+    </w:p>
+    <w:p>
+      <w:pPr>
+        <w:numPr>
+          <w:ilvl w:val="0"/>
+          <w:numId w:val="1048"/>
+        </w:numPr>
       </w:pPr>
       <w:r>
         <w:rPr>
@@ -3843,9 +4059,8 @@
       <w:pPr>
         <w:numPr>
           <w:ilvl w:val="0"/>
-          <w:numId w:val="1044"/>
-        </w:numPr>
-        <w:pStyle w:val="Compact"/>
+          <w:numId w:val="1048"/>
+        </w:numPr>
       </w:pPr>
       <w:r>
         <w:rPr>
@@ -3865,9 +4080,8 @@
       <w:pPr>
         <w:numPr>
           <w:ilvl w:val="0"/>
-          <w:numId w:val="1044"/>
-        </w:numPr>
-        <w:pStyle w:val="Compact"/>
+          <w:numId w:val="1048"/>
+        </w:numPr>
       </w:pPr>
       <w:r>
         <w:rPr>
@@ -3883,23 +4097,22 @@
         <w:t xml:space="preserve">Coaching von Java-Einsteigern und Erstellung eines Projektpiloten zur Nachbearbeitung halbautomatisch (Fax/OCR) erfasster Meldebelege.</w:t>
       </w:r>
     </w:p>
-    <w:bookmarkEnd w:id="66"/>
-    <w:bookmarkStart w:id="67" w:name="X940f16a8ba15a0997b0f7250c3791ff888b4765"/>
+    <w:bookmarkEnd w:id="70"/>
+    <w:bookmarkStart w:id="71" w:name="section-46"/>
     <w:p>
       <w:pPr>
         <w:pStyle w:val="Heading3"/>
       </w:pPr>
       <w:r>
-        <w:t xml:space="preserve">Osram GmbH - Osram Medien-Datenbank (OMD) (05.2000-02.2001)</w:t>
-      </w:r>
-    </w:p>
-    <w:p>
-      <w:pPr>
-        <w:numPr>
-          <w:ilvl w:val="0"/>
-          <w:numId w:val="1045"/>
-        </w:numPr>
-        <w:pStyle w:val="Compact"/>
+        <w:t xml:space="preserve">05.2000 – 02.2001</w:t>
+      </w:r>
+    </w:p>
+    <w:p>
+      <w:pPr>
+        <w:numPr>
+          <w:ilvl w:val="0"/>
+          <w:numId w:val="1049"/>
+        </w:numPr>
       </w:pPr>
       <w:r>
         <w:rPr>
@@ -3919,9 +4132,8 @@
       <w:pPr>
         <w:numPr>
           <w:ilvl w:val="0"/>
-          <w:numId w:val="1045"/>
-        </w:numPr>
-        <w:pStyle w:val="Compact"/>
+          <w:numId w:val="1049"/>
+        </w:numPr>
       </w:pPr>
       <w:r>
         <w:rPr>
@@ -3941,9 +4153,8 @@
       <w:pPr>
         <w:numPr>
           <w:ilvl w:val="0"/>
-          <w:numId w:val="1045"/>
-        </w:numPr>
-        <w:pStyle w:val="Compact"/>
+          <w:numId w:val="1049"/>
+        </w:numPr>
       </w:pPr>
       <w:r>
         <w:rPr>
@@ -3959,23 +4170,22 @@
         <w:t xml:space="preserve">Entwicklung eines Intranet-Shops für Marketingdokumente (Prospekte, Bilder, Druckvorstufen). Dokumente wurden per Swing-Oberfläche importiert, Kunden konnten online bestellen. Verwaltung von Kostenstellen, Berechtigungen und Budgetierungen.</w:t>
       </w:r>
     </w:p>
-    <w:bookmarkEnd w:id="67"/>
-    <w:bookmarkStart w:id="68" w:name="X80d5e3d47a22435f5937147d42183f974a87996"/>
+    <w:bookmarkEnd w:id="71"/>
+    <w:bookmarkStart w:id="72" w:name="section-47"/>
     <w:p>
       <w:pPr>
         <w:pStyle w:val="Heading3"/>
       </w:pPr>
       <w:r>
-        <w:t xml:space="preserve">SAP LS - Java Zertifizierungs-Client (09.1999-04.2000)</w:t>
-      </w:r>
-    </w:p>
-    <w:p>
-      <w:pPr>
-        <w:numPr>
-          <w:ilvl w:val="0"/>
-          <w:numId w:val="1046"/>
-        </w:numPr>
-        <w:pStyle w:val="Compact"/>
+        <w:t xml:space="preserve">09.1999 – 04.2000</w:t>
+      </w:r>
+    </w:p>
+    <w:p>
+      <w:pPr>
+        <w:numPr>
+          <w:ilvl w:val="0"/>
+          <w:numId w:val="1050"/>
+        </w:numPr>
       </w:pPr>
       <w:r>
         <w:rPr>
@@ -3995,9 +4205,8 @@
       <w:pPr>
         <w:numPr>
           <w:ilvl w:val="0"/>
-          <w:numId w:val="1046"/>
-        </w:numPr>
-        <w:pStyle w:val="Compact"/>
+          <w:numId w:val="1050"/>
+        </w:numPr>
       </w:pPr>
       <w:r>
         <w:rPr>
@@ -4017,9 +4226,8 @@
       <w:pPr>
         <w:numPr>
           <w:ilvl w:val="0"/>
-          <w:numId w:val="1046"/>
-        </w:numPr>
-        <w:pStyle w:val="Compact"/>
+          <w:numId w:val="1050"/>
+        </w:numPr>
       </w:pPr>
       <w:r>
         <w:rPr>
@@ -4035,23 +4243,22 @@
         <w:t xml:space="preserve">Implementierung eines Swing-basierten Zertifizierungs-Clients im Rahmen des Platinum-Projekts bei SAP LS (Learning Solution). Fokus auf optische Anpassung und Skalierbarkeit zur Windows-Vorlage.</w:t>
       </w:r>
     </w:p>
-    <w:bookmarkEnd w:id="68"/>
-    <w:bookmarkStart w:id="69" w:name="X9892eba38d8aa8f442ccbf63736af9bdeef64e3"/>
+    <w:bookmarkEnd w:id="72"/>
+    <w:bookmarkStart w:id="73" w:name="laufend-2"/>
     <w:p>
       <w:pPr>
         <w:pStyle w:val="Heading3"/>
       </w:pPr>
       <w:r>
-        <w:t xml:space="preserve">FH Konstanz - Diplomarbeit: Timetabling mit genetischen Algorithmen (03.1999-02.2000)</w:t>
-      </w:r>
-    </w:p>
-    <w:p>
-      <w:pPr>
-        <w:numPr>
-          <w:ilvl w:val="0"/>
-          <w:numId w:val="1047"/>
-        </w:numPr>
-        <w:pStyle w:val="Compact"/>
+        <w:t xml:space="preserve">03.2017 – laufend</w:t>
+      </w:r>
+    </w:p>
+    <w:p>
+      <w:pPr>
+        <w:numPr>
+          <w:ilvl w:val="0"/>
+          <w:numId w:val="1051"/>
+        </w:numPr>
       </w:pPr>
       <w:r>
         <w:rPr>
@@ -4064,6 +4271,106 @@
         <w:t xml:space="preserve"> </w:t>
       </w:r>
       <w:r>
+        <w:t xml:space="preserve">Entwickler und Betreiber</w:t>
+      </w:r>
+    </w:p>
+    <w:p>
+      <w:pPr>
+        <w:numPr>
+          <w:ilvl w:val="0"/>
+          <w:numId w:val="1051"/>
+        </w:numPr>
+      </w:pPr>
+      <w:r>
+        <w:rPr>
+          <w:bCs/>
+          <w:b/>
+        </w:rPr>
+        <w:t xml:space="preserve">Technologien:</w:t>
+      </w:r>
+      <w:r>
+        <w:t xml:space="preserve"> </w:t>
+      </w:r>
+      <w:r>
+        <w:t xml:space="preserve">Bash, Docker, SSH</w:t>
+      </w:r>
+    </w:p>
+    <w:p>
+      <w:pPr>
+        <w:numPr>
+          <w:ilvl w:val="0"/>
+          <w:numId w:val="1051"/>
+        </w:numPr>
+      </w:pPr>
+      <w:r>
+        <w:rPr>
+          <w:bCs/>
+          <w:b/>
+        </w:rPr>
+        <w:t xml:space="preserve">Projekt:</w:t>
+      </w:r>
+      <w:r>
+        <w:t xml:space="preserve"> </w:t>
+      </w:r>
+      <w:r>
+        <w:t xml:space="preserve">ssh-relais (Pro Bono)</w:t>
+      </w:r>
+    </w:p>
+    <w:p>
+      <w:pPr>
+        <w:numPr>
+          <w:ilvl w:val="0"/>
+          <w:numId w:val="1051"/>
+        </w:numPr>
+      </w:pPr>
+      <w:r>
+        <w:rPr>
+          <w:bCs/>
+          <w:b/>
+        </w:rPr>
+        <w:t xml:space="preserve">Aufgaben:</w:t>
+      </w:r>
+      <w:r>
+        <w:t xml:space="preserve"> </w:t>
+      </w:r>
+      <w:r>
+        <w:t xml:space="preserve">Docker-basierter SSH-Relay-Service zur vereinfachten Infrastrukturverwaltung.</w:t>
+      </w:r>
+      <w:r>
+        <w:t xml:space="preserve"> </w:t>
+      </w:r>
+      <w:r>
+        <w:t xml:space="preserve">URL: https://hub.docker.com/repository/docker/outpost/ssh-relais</w:t>
+      </w:r>
+    </w:p>
+    <w:bookmarkEnd w:id="73"/>
+    <w:bookmarkStart w:id="74" w:name="section-48"/>
+    <w:p>
+      <w:pPr>
+        <w:pStyle w:val="Heading3"/>
+      </w:pPr>
+      <w:r>
+        <w:t xml:space="preserve">03.1999 – 02.2000</w:t>
+      </w:r>
+    </w:p>
+    <w:p>
+      <w:pPr>
+        <w:numPr>
+          <w:ilvl w:val="0"/>
+          <w:numId w:val="1052"/>
+        </w:numPr>
+      </w:pPr>
+      <w:r>
+        <w:rPr>
+          <w:bCs/>
+          <w:b/>
+        </w:rPr>
+        <w:t xml:space="preserve">Rolle(n):</w:t>
+      </w:r>
+      <w:r>
+        <w:t xml:space="preserve"> </w:t>
+      </w:r>
+      <w:r>
         <w:t xml:space="preserve">Diplomand</w:t>
       </w:r>
     </w:p>
@@ -4071,9 +4378,8 @@
       <w:pPr>
         <w:numPr>
           <w:ilvl w:val="0"/>
-          <w:numId w:val="1047"/>
-        </w:numPr>
-        <w:pStyle w:val="Compact"/>
+          <w:numId w:val="1052"/>
+        </w:numPr>
       </w:pPr>
       <w:r>
         <w:rPr>
@@ -4093,9 +4399,8 @@
       <w:pPr>
         <w:numPr>
           <w:ilvl w:val="0"/>
-          <w:numId w:val="1047"/>
-        </w:numPr>
-        <w:pStyle w:val="Compact"/>
+          <w:numId w:val="1052"/>
+        </w:numPr>
       </w:pPr>
       <w:r>
         <w:rPr>
@@ -4111,23 +4416,22 @@
         <w:t xml:space="preserve">Konzeption und Umsetzung einer Timetabling-Software mittels genetischer Algorithmen im Rahmen meiner Diplomarbeit.</w:t>
       </w:r>
     </w:p>
-    <w:bookmarkEnd w:id="69"/>
-    <w:bookmarkStart w:id="70" w:name="X3fa273fc1268f23cb4752cd073ca3a91e55c1b7"/>
+    <w:bookmarkEnd w:id="74"/>
+    <w:bookmarkStart w:id="75" w:name="section-49"/>
     <w:p>
       <w:pPr>
         <w:pStyle w:val="Heading3"/>
       </w:pPr>
       <w:r>
-        <w:t xml:space="preserve">Prof. Schubert, FH Konstanz - Portfolio-Optimierung (Delphi) (06.1998-02.1999)</w:t>
-      </w:r>
-    </w:p>
-    <w:p>
-      <w:pPr>
-        <w:numPr>
-          <w:ilvl w:val="0"/>
-          <w:numId w:val="1048"/>
-        </w:numPr>
-        <w:pStyle w:val="Compact"/>
+        <w:t xml:space="preserve">06.1998 – 02.1999</w:t>
+      </w:r>
+    </w:p>
+    <w:p>
+      <w:pPr>
+        <w:numPr>
+          <w:ilvl w:val="0"/>
+          <w:numId w:val="1053"/>
+        </w:numPr>
       </w:pPr>
       <w:r>
         <w:rPr>
@@ -4147,9 +4451,8 @@
       <w:pPr>
         <w:numPr>
           <w:ilvl w:val="0"/>
-          <w:numId w:val="1048"/>
-        </w:numPr>
-        <w:pStyle w:val="Compact"/>
+          <w:numId w:val="1053"/>
+        </w:numPr>
       </w:pPr>
       <w:r>
         <w:rPr>
@@ -4169,9 +4472,8 @@
       <w:pPr>
         <w:numPr>
           <w:ilvl w:val="0"/>
-          <w:numId w:val="1048"/>
-        </w:numPr>
-        <w:pStyle w:val="Compact"/>
+          <w:numId w:val="1053"/>
+        </w:numPr>
       </w:pPr>
       <w:r>
         <w:rPr>
@@ -4187,23 +4489,22 @@
         <w:t xml:space="preserve">Entwicklung eines Tools zur Generierung von Importdaten für lineare Gleichungssysteme zur Optimierung von Aktien-Portfolios.</w:t>
       </w:r>
     </w:p>
-    <w:bookmarkEnd w:id="70"/>
-    <w:bookmarkStart w:id="71" w:name="X724f9ca0a370c1da9066207efeaaa2aa4b4aadb"/>
+    <w:bookmarkEnd w:id="75"/>
+    <w:bookmarkStart w:id="76" w:name="section-50"/>
     <w:p>
       <w:pPr>
         <w:pStyle w:val="Heading3"/>
       </w:pPr>
       <w:r>
-        <w:t xml:space="preserve">Pelzhaus Jäcklin - Artikelverwaltung (07.1985-09.1991)</w:t>
-      </w:r>
-    </w:p>
-    <w:p>
-      <w:pPr>
-        <w:numPr>
-          <w:ilvl w:val="0"/>
-          <w:numId w:val="1049"/>
-        </w:numPr>
-        <w:pStyle w:val="Compact"/>
+        <w:t xml:space="preserve">07.1985 – 09.1991</w:t>
+      </w:r>
+    </w:p>
+    <w:p>
+      <w:pPr>
+        <w:numPr>
+          <w:ilvl w:val="0"/>
+          <w:numId w:val="1054"/>
+        </w:numPr>
       </w:pPr>
       <w:r>
         <w:rPr>
@@ -4223,9 +4524,8 @@
       <w:pPr>
         <w:numPr>
           <w:ilvl w:val="0"/>
-          <w:numId w:val="1049"/>
-        </w:numPr>
-        <w:pStyle w:val="Compact"/>
+          <w:numId w:val="1054"/>
+        </w:numPr>
       </w:pPr>
       <w:r>
         <w:rPr>
@@ -4245,9 +4545,8 @@
       <w:pPr>
         <w:numPr>
           <w:ilvl w:val="0"/>
-          <w:numId w:val="1049"/>
-        </w:numPr>
-        <w:pStyle w:val="Compact"/>
+          <w:numId w:val="1054"/>
+        </w:numPr>
       </w:pPr>
       <w:r>
         <w:rPr>
@@ -4263,8 +4562,8 @@
         <w:t xml:space="preserve">Entwicklung und Wartung einer Artikelverwaltung auf Basis einer textbasierten Datenbank mit selbst entwickeltem Fenstersystem für das elterliche Pelzgeschäft.</w:t>
       </w:r>
     </w:p>
-    <w:bookmarkEnd w:id="71"/>
-    <w:bookmarkEnd w:id="72"/>
+    <w:bookmarkEnd w:id="76"/>
+    <w:bookmarkEnd w:id="77"/>
     <w:sectPr/>
   </w:body>
 </w:document>
@@ -4595,6 +4894,21 @@
     <w:abstractNumId w:val="991"/>
   </w:num>
   <w:num w:numId="1049">
+    <w:abstractNumId w:val="991"/>
+  </w:num>
+  <w:num w:numId="1050">
+    <w:abstractNumId w:val="991"/>
+  </w:num>
+  <w:num w:numId="1051">
+    <w:abstractNumId w:val="991"/>
+  </w:num>
+  <w:num w:numId="1052">
+    <w:abstractNumId w:val="991"/>
+  </w:num>
+  <w:num w:numId="1053">
+    <w:abstractNumId w:val="991"/>
+  </w:num>
+  <w:num w:numId="1054">
     <w:abstractNumId w:val="991"/>
   </w:num>
 </w:numbering>

</xml_diff>

<commit_message>
Sync project list with latest CV
</commit_message>
<xml_diff>
--- a/downloads/micwin_profil.docx
+++ b/downloads/micwin_profil.docx
@@ -41,7 +41,7 @@
         <w:pStyle w:val="Date"/>
       </w:pPr>
       <w:r>
-        <w:t xml:space="preserve">25.03.2026</w:t>
+        <w:t xml:space="preserve">02.04.2026</w:t>
       </w:r>
     </w:p>
     <w:p>
@@ -435,7 +435,7 @@
       </w:hyperlink>
     </w:p>
     <w:bookmarkEnd w:id="22"/>
-    <w:bookmarkStart w:id="77" w:name="vollständige-projektliste"/>
+    <w:bookmarkStart w:id="79" w:name="vollständige-projektliste"/>
     <w:p>
       <w:pPr>
         <w:pStyle w:val="Heading2"/>
@@ -538,12 +538,236 @@
       </w:r>
     </w:p>
     <w:bookmarkEnd w:id="23"/>
-    <w:bookmarkStart w:id="24" w:name="section"/>
+    <w:bookmarkStart w:id="24" w:name="laufend-1"/>
     <w:p>
       <w:pPr>
         <w:pStyle w:val="Heading3"/>
       </w:pPr>
       <w:r>
+        <w:t xml:space="preserve">01.2025 – laufend</w:t>
+      </w:r>
+    </w:p>
+    <w:p>
+      <w:pPr>
+        <w:numPr>
+          <w:ilvl w:val="0"/>
+          <w:numId w:val="1002"/>
+        </w:numPr>
+      </w:pPr>
+      <w:r>
+        <w:rPr>
+          <w:bCs/>
+          <w:b/>
+        </w:rPr>
+        <w:t xml:space="preserve">Rolle(n):</w:t>
+      </w:r>
+      <w:r>
+        <w:t xml:space="preserve"> </w:t>
+      </w:r>
+      <w:r>
+        <w:t xml:space="preserve">PowerShell-Entwickler, Maintainer</w:t>
+      </w:r>
+    </w:p>
+    <w:p>
+      <w:pPr>
+        <w:numPr>
+          <w:ilvl w:val="0"/>
+          <w:numId w:val="1002"/>
+        </w:numPr>
+      </w:pPr>
+      <w:r>
+        <w:rPr>
+          <w:bCs/>
+          <w:b/>
+        </w:rPr>
+        <w:t xml:space="preserve">Technologien:</w:t>
+      </w:r>
+      <w:r>
+        <w:t xml:space="preserve"> </w:t>
+      </w:r>
+      <w:r>
+        <w:t xml:space="preserve">PowerShell 7, INI, Regex, Bash, Smokey</w:t>
+      </w:r>
+    </w:p>
+    <w:p>
+      <w:pPr>
+        <w:numPr>
+          <w:ilvl w:val="0"/>
+          <w:numId w:val="1002"/>
+        </w:numPr>
+      </w:pPr>
+      <w:r>
+        <w:rPr>
+          <w:bCs/>
+          <w:b/>
+        </w:rPr>
+        <w:t xml:space="preserve">Projekt:</w:t>
+      </w:r>
+      <w:r>
+        <w:t xml:space="preserve"> </w:t>
+      </w:r>
+      <w:r>
+        <w:t xml:space="preserve">deannon (Pro Bono)</w:t>
+      </w:r>
+    </w:p>
+    <w:p>
+      <w:pPr>
+        <w:numPr>
+          <w:ilvl w:val="0"/>
+          <w:numId w:val="1002"/>
+        </w:numPr>
+      </w:pPr>
+      <w:r>
+        <w:rPr>
+          <w:bCs/>
+          <w:b/>
+        </w:rPr>
+        <w:t xml:space="preserve">Aufgaben:</w:t>
+      </w:r>
+      <w:r>
+        <w:t xml:space="preserve"> </w:t>
+      </w:r>
+      <w:r>
+        <w:t xml:space="preserve">Entwicklung eines PowerShell-Werkzeugs, das Konfigurationsdateien per INI-Regeln anonymisiert oder deanonymisiert.</w:t>
+      </w:r>
+      <w:r>
+        <w:t xml:space="preserve"> </w:t>
+      </w:r>
+      <w:r>
+        <w:rPr>
+          <w:rStyle w:val="VerbatimChar"/>
+        </w:rPr>
+        <w:t xml:space="preserve">full.*</w:t>
+      </w:r>
+      <w:r>
+        <w:t xml:space="preserve">-Paare sorgen für deterministische Zuordnungen, während</w:t>
+      </w:r>
+      <w:r>
+        <w:t xml:space="preserve"> </w:t>
+      </w:r>
+      <w:r>
+        <w:rPr>
+          <w:rStyle w:val="VerbatimChar"/>
+        </w:rPr>
+        <w:t xml:space="preserve">hint.*</w:t>
+      </w:r>
+      <w:r>
+        <w:t xml:space="preserve">-Regexe neue Token erkennen und automatisch als neue</w:t>
+      </w:r>
+      <w:r>
+        <w:t xml:space="preserve"> </w:t>
+      </w:r>
+      <w:r>
+        <w:rPr>
+          <w:rStyle w:val="VerbatimChar"/>
+        </w:rPr>
+        <w:t xml:space="preserve">full</w:t>
+      </w:r>
+      <w:r>
+        <w:t xml:space="preserve">-Sektionen anhängen. Das Tool läuft plattformübergreifend dank Shebang, aktualisiert die INI-Datei sicher und wird via Smokey-Test-Suite mit Bash orchestriert.</w:t>
+      </w:r>
+    </w:p>
+    <w:bookmarkEnd w:id="24"/>
+    <w:bookmarkStart w:id="25" w:name="laufend-2"/>
+    <w:p>
+      <w:pPr>
+        <w:pStyle w:val="Heading3"/>
+      </w:pPr>
+      <w:r>
+        <w:t xml:space="preserve">04.2026 – laufend</w:t>
+      </w:r>
+    </w:p>
+    <w:p>
+      <w:pPr>
+        <w:numPr>
+          <w:ilvl w:val="0"/>
+          <w:numId w:val="1003"/>
+        </w:numPr>
+      </w:pPr>
+      <w:r>
+        <w:rPr>
+          <w:bCs/>
+          <w:b/>
+        </w:rPr>
+        <w:t xml:space="preserve">Rolle(n):</w:t>
+      </w:r>
+      <w:r>
+        <w:t xml:space="preserve"> </w:t>
+      </w:r>
+      <w:r>
+        <w:t xml:space="preserve">Go-Entwickler, DevOps Engineer</w:t>
+      </w:r>
+    </w:p>
+    <w:p>
+      <w:pPr>
+        <w:numPr>
+          <w:ilvl w:val="0"/>
+          <w:numId w:val="1003"/>
+        </w:numPr>
+      </w:pPr>
+      <w:r>
+        <w:rPr>
+          <w:bCs/>
+          <w:b/>
+        </w:rPr>
+        <w:t xml:space="preserve">Technologien:</w:t>
+      </w:r>
+      <w:r>
+        <w:t xml:space="preserve"> </w:t>
+      </w:r>
+      <w:r>
+        <w:t xml:space="preserve">Go, Argon2id, REST, Docker, Smokey</w:t>
+      </w:r>
+    </w:p>
+    <w:p>
+      <w:pPr>
+        <w:numPr>
+          <w:ilvl w:val="0"/>
+          <w:numId w:val="1003"/>
+        </w:numPr>
+      </w:pPr>
+      <w:r>
+        <w:rPr>
+          <w:bCs/>
+          <w:b/>
+        </w:rPr>
+        <w:t xml:space="preserve">Projekt:</w:t>
+      </w:r>
+      <w:r>
+        <w:t xml:space="preserve"> </w:t>
+      </w:r>
+      <w:r>
+        <w:t xml:space="preserve">vaultline (Pro Bono)</w:t>
+      </w:r>
+    </w:p>
+    <w:p>
+      <w:pPr>
+        <w:numPr>
+          <w:ilvl w:val="0"/>
+          <w:numId w:val="1003"/>
+        </w:numPr>
+      </w:pPr>
+      <w:r>
+        <w:rPr>
+          <w:bCs/>
+          <w:b/>
+        </w:rPr>
+        <w:t xml:space="preserve">Aufgaben:</w:t>
+      </w:r>
+      <w:r>
+        <w:t xml:space="preserve"> </w:t>
+      </w:r>
+      <w:r>
+        <w:t xml:space="preserve">Git-freundlicher Secret-Store mit per-Datei-Verschlüsselung, Argon2id-Schlüsselableitung und manuellem Unseal-Flow. Implementiert REST-Daemon und localhost-CLI, Import/Export-Helfer und Docker-/Systemd-Targets. Tests laufen über Smokey-Suites, Pakete entstehen via Debian-Build-Skripten.</w:t>
+      </w:r>
+    </w:p>
+    <w:bookmarkEnd w:id="25"/>
+    <w:bookmarkStart w:id="26" w:name="section"/>
+    <w:p>
+      <w:pPr>
+        <w:pStyle w:val="Heading3"/>
+      </w:pPr>
+      <w:r>
         <w:t xml:space="preserve">06.2024 – 06.2024</w:t>
       </w:r>
     </w:p>
@@ -551,7 +775,7 @@
       <w:pPr>
         <w:numPr>
           <w:ilvl w:val="0"/>
-          <w:numId w:val="1002"/>
+          <w:numId w:val="1004"/>
         </w:numPr>
       </w:pPr>
       <w:r>
@@ -572,7 +796,7 @@
       <w:pPr>
         <w:numPr>
           <w:ilvl w:val="0"/>
-          <w:numId w:val="1002"/>
+          <w:numId w:val="1004"/>
         </w:numPr>
       </w:pPr>
       <w:r>
@@ -593,7 +817,7 @@
       <w:pPr>
         <w:numPr>
           <w:ilvl w:val="0"/>
-          <w:numId w:val="1002"/>
+          <w:numId w:val="1004"/>
         </w:numPr>
       </w:pPr>
       <w:r>
@@ -614,7 +838,7 @@
       <w:pPr>
         <w:numPr>
           <w:ilvl w:val="0"/>
-          <w:numId w:val="1002"/>
+          <w:numId w:val="1004"/>
         </w:numPr>
       </w:pPr>
       <w:r>
@@ -631,8 +855,8 @@
         <w:t xml:space="preserve">Eine interaktive Rust-Anwendung zur Visualisierung des Travelling-Salesman-Problems (TSP). Das Tool ermöglicht die Untersuchung von optimalen Routen durch eine Brute-Force-Berechnung und bietet eine interaktive Oberfläche zum Verschieben von Punkten, eine Undo-/Redo-Funktion sowie eine Analyse der Stabilitätsbereiche.</w:t>
       </w:r>
     </w:p>
-    <w:bookmarkEnd w:id="24"/>
-    <w:bookmarkStart w:id="25" w:name="section-1"/>
+    <w:bookmarkEnd w:id="26"/>
+    <w:bookmarkStart w:id="27" w:name="section-1"/>
     <w:p>
       <w:pPr>
         <w:pStyle w:val="Heading3"/>
@@ -645,7 +869,7 @@
       <w:pPr>
         <w:numPr>
           <w:ilvl w:val="0"/>
-          <w:numId w:val="1003"/>
+          <w:numId w:val="1005"/>
         </w:numPr>
       </w:pPr>
       <w:r>
@@ -666,7 +890,7 @@
       <w:pPr>
         <w:numPr>
           <w:ilvl w:val="0"/>
-          <w:numId w:val="1003"/>
+          <w:numId w:val="1005"/>
         </w:numPr>
       </w:pPr>
       <w:r>
@@ -687,7 +911,7 @@
       <w:pPr>
         <w:numPr>
           <w:ilvl w:val="0"/>
-          <w:numId w:val="1003"/>
+          <w:numId w:val="1005"/>
         </w:numPr>
       </w:pPr>
       <w:r>
@@ -704,8 +928,8 @@
         <w:t xml:space="preserve">Wiedererweckung und Modernisierung eines halbautomatischen Frameworks auf Powershell-Basis für das Management von 13 Systemumgebungen. Das Projekt war zuvor zwei Jahre pausiert und wurde ohne die ursprünglichen Ressourcen reaktiviert.</w:t>
       </w:r>
     </w:p>
-    <w:bookmarkEnd w:id="25"/>
-    <w:bookmarkStart w:id="26" w:name="section-2"/>
+    <w:bookmarkEnd w:id="27"/>
+    <w:bookmarkStart w:id="28" w:name="section-2"/>
     <w:p>
       <w:pPr>
         <w:pStyle w:val="Heading3"/>
@@ -718,7 +942,7 @@
       <w:pPr>
         <w:numPr>
           <w:ilvl w:val="0"/>
-          <w:numId w:val="1004"/>
+          <w:numId w:val="1006"/>
         </w:numPr>
       </w:pPr>
       <w:r>
@@ -739,7 +963,7 @@
       <w:pPr>
         <w:numPr>
           <w:ilvl w:val="0"/>
-          <w:numId w:val="1004"/>
+          <w:numId w:val="1006"/>
         </w:numPr>
       </w:pPr>
       <w:r>
@@ -760,7 +984,7 @@
       <w:pPr>
         <w:numPr>
           <w:ilvl w:val="0"/>
-          <w:numId w:val="1004"/>
+          <w:numId w:val="1006"/>
         </w:numPr>
       </w:pPr>
       <w:r>
@@ -777,8 +1001,8 @@
         <w:t xml:space="preserve">Weiterentwicklung von Ansible-Playbooks zur Wartung eines bestehenden GitLab-Geo-Clusters, inklusive Erstellung neuer Cluster. Entwicklung und Migration von End-to-End-Tests in containerisierte Umgebungen. Erstellung eines Tools zur automatischen Bereinigung hängender Runner-Container.</w:t>
       </w:r>
     </w:p>
-    <w:bookmarkEnd w:id="26"/>
-    <w:bookmarkStart w:id="27" w:name="section-3"/>
+    <w:bookmarkEnd w:id="28"/>
+    <w:bookmarkStart w:id="29" w:name="section-3"/>
     <w:p>
       <w:pPr>
         <w:pStyle w:val="Heading3"/>
@@ -791,7 +1015,7 @@
       <w:pPr>
         <w:numPr>
           <w:ilvl w:val="0"/>
-          <w:numId w:val="1005"/>
+          <w:numId w:val="1007"/>
         </w:numPr>
       </w:pPr>
       <w:r>
@@ -812,7 +1036,7 @@
       <w:pPr>
         <w:numPr>
           <w:ilvl w:val="0"/>
-          <w:numId w:val="1005"/>
+          <w:numId w:val="1007"/>
         </w:numPr>
       </w:pPr>
       <w:r>
@@ -833,7 +1057,7 @@
       <w:pPr>
         <w:numPr>
           <w:ilvl w:val="0"/>
-          <w:numId w:val="1005"/>
+          <w:numId w:val="1007"/>
         </w:numPr>
       </w:pPr>
       <w:r>
@@ -850,8 +1074,8 @@
         <w:t xml:space="preserve">Entwicklung eines BOM-Generators für Maven-Projekte. Mitarbeit an einem Docker-Image-Package-Scanner.</w:t>
       </w:r>
     </w:p>
-    <w:bookmarkEnd w:id="27"/>
-    <w:bookmarkStart w:id="28" w:name="section-4"/>
+    <w:bookmarkEnd w:id="29"/>
+    <w:bookmarkStart w:id="30" w:name="section-4"/>
     <w:p>
       <w:pPr>
         <w:pStyle w:val="Heading3"/>
@@ -864,7 +1088,7 @@
       <w:pPr>
         <w:numPr>
           <w:ilvl w:val="0"/>
-          <w:numId w:val="1006"/>
+          <w:numId w:val="1008"/>
         </w:numPr>
       </w:pPr>
       <w:r>
@@ -885,7 +1109,7 @@
       <w:pPr>
         <w:numPr>
           <w:ilvl w:val="0"/>
-          <w:numId w:val="1006"/>
+          <w:numId w:val="1008"/>
         </w:numPr>
       </w:pPr>
       <w:r>
@@ -906,7 +1130,7 @@
       <w:pPr>
         <w:numPr>
           <w:ilvl w:val="0"/>
-          <w:numId w:val="1006"/>
+          <w:numId w:val="1008"/>
         </w:numPr>
       </w:pPr>
       <w:r>
@@ -923,8 +1147,8 @@
         <w:t xml:space="preserve">Vorbereitung zur Einführung von „Test First“ und Behebung von Blocker-Issues in SonarQube.</w:t>
       </w:r>
     </w:p>
-    <w:bookmarkEnd w:id="28"/>
-    <w:bookmarkStart w:id="29" w:name="section-5"/>
+    <w:bookmarkEnd w:id="30"/>
+    <w:bookmarkStart w:id="31" w:name="section-5"/>
     <w:p>
       <w:pPr>
         <w:pStyle w:val="Heading3"/>
@@ -937,7 +1161,7 @@
       <w:pPr>
         <w:numPr>
           <w:ilvl w:val="0"/>
-          <w:numId w:val="1007"/>
+          <w:numId w:val="1009"/>
         </w:numPr>
       </w:pPr>
       <w:r>
@@ -958,7 +1182,7 @@
       <w:pPr>
         <w:numPr>
           <w:ilvl w:val="0"/>
-          <w:numId w:val="1007"/>
+          <w:numId w:val="1009"/>
         </w:numPr>
       </w:pPr>
       <w:r>
@@ -979,7 +1203,7 @@
       <w:pPr>
         <w:numPr>
           <w:ilvl w:val="0"/>
-          <w:numId w:val="1007"/>
+          <w:numId w:val="1009"/>
         </w:numPr>
       </w:pPr>
       <w:r>
@@ -996,8 +1220,8 @@
         <w:t xml:space="preserve">Einrichtung zusätzlicher GitLab-Agenten sowie Erstellung von Build- und Deploy-Pipelines für OpenStack (kolla-ansible, Cinder).</w:t>
       </w:r>
     </w:p>
-    <w:bookmarkEnd w:id="29"/>
-    <w:bookmarkStart w:id="30" w:name="section-6"/>
+    <w:bookmarkEnd w:id="31"/>
+    <w:bookmarkStart w:id="32" w:name="section-6"/>
     <w:p>
       <w:pPr>
         <w:pStyle w:val="Heading3"/>
@@ -1010,7 +1234,7 @@
       <w:pPr>
         <w:numPr>
           <w:ilvl w:val="0"/>
-          <w:numId w:val="1008"/>
+          <w:numId w:val="1010"/>
         </w:numPr>
       </w:pPr>
       <w:r>
@@ -1031,7 +1255,7 @@
       <w:pPr>
         <w:numPr>
           <w:ilvl w:val="0"/>
-          <w:numId w:val="1008"/>
+          <w:numId w:val="1010"/>
         </w:numPr>
       </w:pPr>
       <w:r>
@@ -1052,7 +1276,7 @@
       <w:pPr>
         <w:numPr>
           <w:ilvl w:val="0"/>
-          <w:numId w:val="1008"/>
+          <w:numId w:val="1010"/>
         </w:numPr>
       </w:pPr>
       <w:r>
@@ -1069,8 +1293,8 @@
         <w:t xml:space="preserve">Betrieb von über 400 individuellen Installationen der Stadtwerke München, MVG und muenchen.de. Bereitstellung eines dynamischen Ansible-Repos mit Python auf Basis von libgender.</w:t>
       </w:r>
     </w:p>
-    <w:bookmarkEnd w:id="30"/>
-    <w:bookmarkStart w:id="31" w:name="section-7"/>
+    <w:bookmarkEnd w:id="32"/>
+    <w:bookmarkStart w:id="33" w:name="section-7"/>
     <w:p>
       <w:pPr>
         <w:pStyle w:val="Heading3"/>
@@ -1083,7 +1307,7 @@
       <w:pPr>
         <w:numPr>
           <w:ilvl w:val="0"/>
-          <w:numId w:val="1009"/>
+          <w:numId w:val="1011"/>
         </w:numPr>
       </w:pPr>
       <w:r>
@@ -1104,7 +1328,7 @@
       <w:pPr>
         <w:numPr>
           <w:ilvl w:val="0"/>
-          <w:numId w:val="1009"/>
+          <w:numId w:val="1011"/>
         </w:numPr>
       </w:pPr>
       <w:r>
@@ -1125,7 +1349,7 @@
       <w:pPr>
         <w:numPr>
           <w:ilvl w:val="0"/>
-          <w:numId w:val="1009"/>
+          <w:numId w:val="1011"/>
         </w:numPr>
       </w:pPr>
       <w:r>
@@ -1142,8 +1366,8 @@
         <w:t xml:space="preserve">Aufbau von Integrationstests in Azure Pipelines und Kubernetes. Implementierung von Alerting, Fehlerbehebung, Nutzung der Loki-Instanz, sowie Erstellung diverser Verwaltungsjobs (DB-Restore, Pod-Reports, Log-Dumps).</w:t>
       </w:r>
     </w:p>
-    <w:bookmarkEnd w:id="31"/>
-    <w:bookmarkStart w:id="32" w:name="section-8"/>
+    <w:bookmarkEnd w:id="33"/>
+    <w:bookmarkStart w:id="34" w:name="section-8"/>
     <w:p>
       <w:pPr>
         <w:pStyle w:val="Heading3"/>
@@ -1156,7 +1380,7 @@
       <w:pPr>
         <w:numPr>
           <w:ilvl w:val="0"/>
-          <w:numId w:val="1010"/>
+          <w:numId w:val="1012"/>
         </w:numPr>
       </w:pPr>
       <w:r>
@@ -1177,7 +1401,7 @@
       <w:pPr>
         <w:numPr>
           <w:ilvl w:val="0"/>
-          <w:numId w:val="1010"/>
+          <w:numId w:val="1012"/>
         </w:numPr>
       </w:pPr>
       <w:r>
@@ -1198,7 +1422,7 @@
       <w:pPr>
         <w:numPr>
           <w:ilvl w:val="0"/>
-          <w:numId w:val="1010"/>
+          <w:numId w:val="1012"/>
         </w:numPr>
       </w:pPr>
       <w:r>
@@ -1219,7 +1443,7 @@
       <w:pPr>
         <w:numPr>
           <w:ilvl w:val="0"/>
-          <w:numId w:val="1010"/>
+          <w:numId w:val="1012"/>
         </w:numPr>
       </w:pPr>
       <w:r>
@@ -1236,8 +1460,8 @@
         <w:t xml:space="preserve">Architektur und Entwicklung eines dezentralen Config-Stores auf Ledger-Basis, inklusive Go-CLI (Cobra), Docker/Kubernetes-Deployments und MkDocs-Dokumentation für global verteilte Service-Mesh-Konfigurationen.</w:t>
       </w:r>
     </w:p>
-    <w:bookmarkEnd w:id="32"/>
-    <w:bookmarkStart w:id="33" w:name="laufend-1"/>
+    <w:bookmarkEnd w:id="34"/>
+    <w:bookmarkStart w:id="35" w:name="laufend-3"/>
     <w:p>
       <w:pPr>
         <w:pStyle w:val="Heading3"/>
@@ -1250,7 +1474,7 @@
       <w:pPr>
         <w:numPr>
           <w:ilvl w:val="0"/>
-          <w:numId w:val="1011"/>
+          <w:numId w:val="1013"/>
         </w:numPr>
       </w:pPr>
       <w:r>
@@ -1271,7 +1495,7 @@
       <w:pPr>
         <w:numPr>
           <w:ilvl w:val="0"/>
-          <w:numId w:val="1011"/>
+          <w:numId w:val="1013"/>
         </w:numPr>
       </w:pPr>
       <w:r>
@@ -1292,7 +1516,7 @@
       <w:pPr>
         <w:numPr>
           <w:ilvl w:val="0"/>
-          <w:numId w:val="1011"/>
+          <w:numId w:val="1013"/>
         </w:numPr>
       </w:pPr>
       <w:r>
@@ -1313,7 +1537,7 @@
       <w:pPr>
         <w:numPr>
           <w:ilvl w:val="0"/>
-          <w:numId w:val="1011"/>
+          <w:numId w:val="1013"/>
         </w:numPr>
       </w:pPr>
       <w:r>
@@ -1330,8 +1554,8 @@
         <w:t xml:space="preserve">Entwicklung und Betreuung eines bash-basierten Build-Frameworks für CI/CD-Pipelines. Verantwortlich für CLI-Entwurf, Modul-Scaffolding, Dokumentation und Releases. Bereitstellung als Open-Source-Projekt (https://metafence.gitlab.io/clici/).</w:t>
       </w:r>
     </w:p>
-    <w:bookmarkEnd w:id="33"/>
-    <w:bookmarkStart w:id="34" w:name="section-9"/>
+    <w:bookmarkEnd w:id="35"/>
+    <w:bookmarkStart w:id="36" w:name="section-9"/>
     <w:p>
       <w:pPr>
         <w:pStyle w:val="Heading3"/>
@@ -1344,7 +1568,7 @@
       <w:pPr>
         <w:numPr>
           <w:ilvl w:val="0"/>
-          <w:numId w:val="1012"/>
+          <w:numId w:val="1014"/>
         </w:numPr>
       </w:pPr>
       <w:r>
@@ -1365,7 +1589,7 @@
       <w:pPr>
         <w:numPr>
           <w:ilvl w:val="0"/>
-          <w:numId w:val="1012"/>
+          <w:numId w:val="1014"/>
         </w:numPr>
       </w:pPr>
       <w:r>
@@ -1386,7 +1610,7 @@
       <w:pPr>
         <w:numPr>
           <w:ilvl w:val="0"/>
-          <w:numId w:val="1012"/>
+          <w:numId w:val="1014"/>
         </w:numPr>
       </w:pPr>
       <w:r>
@@ -1403,8 +1627,8 @@
         <w:t xml:space="preserve">Übernahme der Wartung im Zuge des Insourcings von einem externen Team. Erstellung von Docker Compose Workflows und Controller-Skripten für eine dockerisierte Microservice-Architektur. Einrichtung von Monitoring, IP-Freischaltungen, Etablierung eines Client-to-Site-VPNs. Abschaltung wegen Nachfolgeversion.</w:t>
       </w:r>
     </w:p>
-    <w:bookmarkEnd w:id="34"/>
-    <w:bookmarkStart w:id="35" w:name="section-10"/>
+    <w:bookmarkEnd w:id="36"/>
+    <w:bookmarkStart w:id="37" w:name="section-10"/>
     <w:p>
       <w:pPr>
         <w:pStyle w:val="Heading3"/>
@@ -1417,7 +1641,7 @@
       <w:pPr>
         <w:numPr>
           <w:ilvl w:val="0"/>
-          <w:numId w:val="1013"/>
+          <w:numId w:val="1015"/>
         </w:numPr>
       </w:pPr>
       <w:r>
@@ -1438,7 +1662,7 @@
       <w:pPr>
         <w:numPr>
           <w:ilvl w:val="0"/>
-          <w:numId w:val="1013"/>
+          <w:numId w:val="1015"/>
         </w:numPr>
       </w:pPr>
       <w:r>
@@ -1459,7 +1683,7 @@
       <w:pPr>
         <w:numPr>
           <w:ilvl w:val="0"/>
-          <w:numId w:val="1013"/>
+          <w:numId w:val="1015"/>
         </w:numPr>
       </w:pPr>
       <w:r>
@@ -1476,8 +1700,8 @@
         <w:t xml:space="preserve">Unterstützung der Entwickler bei Eclipse-Problemen. Setup von zwei On-Prem-Maschinen für Inhousing, Dockerisierung des Build-Prozesses, Einführung von Thinlinc. Ab März Übergabe an T-Systems.</w:t>
       </w:r>
     </w:p>
-    <w:bookmarkEnd w:id="35"/>
-    <w:bookmarkStart w:id="36" w:name="section-11"/>
+    <w:bookmarkEnd w:id="37"/>
+    <w:bookmarkStart w:id="38" w:name="section-11"/>
     <w:p>
       <w:pPr>
         <w:pStyle w:val="Heading3"/>
@@ -1490,7 +1714,7 @@
       <w:pPr>
         <w:numPr>
           <w:ilvl w:val="0"/>
-          <w:numId w:val="1014"/>
+          <w:numId w:val="1016"/>
         </w:numPr>
       </w:pPr>
       <w:r>
@@ -1511,7 +1735,7 @@
       <w:pPr>
         <w:numPr>
           <w:ilvl w:val="0"/>
-          <w:numId w:val="1014"/>
+          <w:numId w:val="1016"/>
         </w:numPr>
       </w:pPr>
       <w:r>
@@ -1532,7 +1756,7 @@
       <w:pPr>
         <w:numPr>
           <w:ilvl w:val="0"/>
-          <w:numId w:val="1014"/>
+          <w:numId w:val="1016"/>
         </w:numPr>
       </w:pPr>
       <w:r>
@@ -1549,8 +1773,8 @@
         <w:t xml:space="preserve">Vorbereitung auf Black Friday/Cyber Monday: Migration von vier Umgebungen von MySQL zu Percona. Installation und Konfiguration des Percona Management Servers. Erstellung von Jenkins-Jobs und Bereitschaftsdienst.</w:t>
       </w:r>
     </w:p>
-    <w:bookmarkEnd w:id="36"/>
-    <w:bookmarkStart w:id="37" w:name="section-12"/>
+    <w:bookmarkEnd w:id="38"/>
+    <w:bookmarkStart w:id="39" w:name="section-12"/>
     <w:p>
       <w:pPr>
         <w:pStyle w:val="Heading3"/>
@@ -1563,7 +1787,7 @@
       <w:pPr>
         <w:numPr>
           <w:ilvl w:val="0"/>
-          <w:numId w:val="1015"/>
+          <w:numId w:val="1017"/>
         </w:numPr>
       </w:pPr>
       <w:r>
@@ -1584,7 +1808,7 @@
       <w:pPr>
         <w:numPr>
           <w:ilvl w:val="0"/>
-          <w:numId w:val="1015"/>
+          <w:numId w:val="1017"/>
         </w:numPr>
       </w:pPr>
       <w:r>
@@ -1605,7 +1829,7 @@
       <w:pPr>
         <w:numPr>
           <w:ilvl w:val="0"/>
-          <w:numId w:val="1015"/>
+          <w:numId w:val="1017"/>
         </w:numPr>
       </w:pPr>
       <w:r>
@@ -1622,8 +1846,8 @@
         <w:t xml:space="preserve">Tägliches Einsammeln, Normalisieren und Zusammenführen der Ticket-Statusberichte von zwölf Projektteams.</w:t>
       </w:r>
     </w:p>
-    <w:bookmarkEnd w:id="37"/>
-    <w:bookmarkStart w:id="38" w:name="section-13"/>
+    <w:bookmarkEnd w:id="39"/>
+    <w:bookmarkStart w:id="40" w:name="section-13"/>
     <w:p>
       <w:pPr>
         <w:pStyle w:val="Heading3"/>
@@ -1636,7 +1860,7 @@
       <w:pPr>
         <w:numPr>
           <w:ilvl w:val="0"/>
-          <w:numId w:val="1016"/>
+          <w:numId w:val="1018"/>
         </w:numPr>
       </w:pPr>
       <w:r>
@@ -1657,7 +1881,7 @@
       <w:pPr>
         <w:numPr>
           <w:ilvl w:val="0"/>
-          <w:numId w:val="1016"/>
+          <w:numId w:val="1018"/>
         </w:numPr>
       </w:pPr>
       <w:r>
@@ -1678,7 +1902,7 @@
       <w:pPr>
         <w:numPr>
           <w:ilvl w:val="0"/>
-          <w:numId w:val="1016"/>
+          <w:numId w:val="1018"/>
         </w:numPr>
       </w:pPr>
       <w:r>
@@ -1695,8 +1919,8 @@
         <w:t xml:space="preserve">Durchführung manueller Staging- und Live-Deployments in Liferay. Migration der CI-Umgebung von Jenkins/Gitblit nach GitLab. Aufbau erster Docker-basierter Build-Agents, Mitarbeit in Task-Forces zur Code-Qualität, Entwicklung eines IaC-Ansatzes sowie Ticketbearbeitung und Fehlersuche.</w:t>
       </w:r>
     </w:p>
-    <w:bookmarkEnd w:id="38"/>
-    <w:bookmarkStart w:id="39" w:name="section-14"/>
+    <w:bookmarkEnd w:id="40"/>
+    <w:bookmarkStart w:id="41" w:name="section-14"/>
     <w:p>
       <w:pPr>
         <w:pStyle w:val="Heading3"/>
@@ -1709,7 +1933,7 @@
       <w:pPr>
         <w:numPr>
           <w:ilvl w:val="0"/>
-          <w:numId w:val="1017"/>
+          <w:numId w:val="1019"/>
         </w:numPr>
       </w:pPr>
       <w:r>
@@ -1730,7 +1954,7 @@
       <w:pPr>
         <w:numPr>
           <w:ilvl w:val="0"/>
-          <w:numId w:val="1017"/>
+          <w:numId w:val="1019"/>
         </w:numPr>
       </w:pPr>
       <w:r>
@@ -1751,7 +1975,7 @@
       <w:pPr>
         <w:numPr>
           <w:ilvl w:val="0"/>
-          <w:numId w:val="1017"/>
+          <w:numId w:val="1019"/>
         </w:numPr>
       </w:pPr>
       <w:r>
@@ -1768,8 +1992,8 @@
         <w:t xml:space="preserve">Design und Aufbau einer IaC-Toolchain zur automatisierten Erstellung von Umgebungen auf Basis von OpenStack und TFS Build Jobs. Erstellung von Testumgebungen mit RabbitMQ und Python mittels Docker Compose. Einrichtung eines Remote-Zugriffs auf Ubuntu-VMs via Citrix.</w:t>
       </w:r>
     </w:p>
-    <w:bookmarkEnd w:id="39"/>
-    <w:bookmarkStart w:id="40" w:name="section-15"/>
+    <w:bookmarkEnd w:id="41"/>
+    <w:bookmarkStart w:id="42" w:name="section-15"/>
     <w:p>
       <w:pPr>
         <w:pStyle w:val="Heading3"/>
@@ -1782,7 +2006,7 @@
       <w:pPr>
         <w:numPr>
           <w:ilvl w:val="0"/>
-          <w:numId w:val="1018"/>
+          <w:numId w:val="1020"/>
         </w:numPr>
       </w:pPr>
       <w:r>
@@ -1803,7 +2027,7 @@
       <w:pPr>
         <w:numPr>
           <w:ilvl w:val="0"/>
-          <w:numId w:val="1018"/>
+          <w:numId w:val="1020"/>
         </w:numPr>
       </w:pPr>
       <w:r>
@@ -1824,7 +2048,7 @@
       <w:pPr>
         <w:numPr>
           <w:ilvl w:val="0"/>
-          <w:numId w:val="1018"/>
+          <w:numId w:val="1020"/>
         </w:numPr>
       </w:pPr>
       <w:r>
@@ -1841,8 +2065,8 @@
         <w:t xml:space="preserve">Aufbau einer Container-Umgebung (CoreOS, Rancher). Betrieb und Sicherung der zentralen GitLab-Instanz mittels Ansible. Unterstützung der Entwickler bei CI/CD-Pipelines. Automatisierung von Deployments für Red Hat OpenStack (Undercloud, Overcloud) mit GitLab-CI und Ansible. Erstellung eines Consul-Clusters (PoC), automatischer Backup-Testprozess für GitLab. Gelegentliche Scrum-Master-Tätigkeiten.</w:t>
       </w:r>
     </w:p>
-    <w:bookmarkEnd w:id="40"/>
-    <w:bookmarkStart w:id="41" w:name="section-16"/>
+    <w:bookmarkEnd w:id="42"/>
+    <w:bookmarkStart w:id="43" w:name="section-16"/>
     <w:p>
       <w:pPr>
         <w:pStyle w:val="Heading3"/>
@@ -1855,7 +2079,7 @@
       <w:pPr>
         <w:numPr>
           <w:ilvl w:val="0"/>
-          <w:numId w:val="1019"/>
+          <w:numId w:val="1021"/>
         </w:numPr>
       </w:pPr>
       <w:r>
@@ -1876,7 +2100,7 @@
       <w:pPr>
         <w:numPr>
           <w:ilvl w:val="0"/>
-          <w:numId w:val="1019"/>
+          <w:numId w:val="1021"/>
         </w:numPr>
       </w:pPr>
       <w:r>
@@ -1897,7 +2121,7 @@
       <w:pPr>
         <w:numPr>
           <w:ilvl w:val="0"/>
-          <w:numId w:val="1019"/>
+          <w:numId w:val="1021"/>
         </w:numPr>
       </w:pPr>
       <w:r>
@@ -1914,8 +2138,8 @@
         <w:t xml:space="preserve">Wartung einer bestehenden CI-Umgebung (Nexus, Gradle, Jenkins mit 20 Slaves, Tomcat). Unterstützung bei der Migration zu JobDSL, Evaluation von Provisioning-Tools, Aufbau prototypischer Entwicklungsinfrastrukturen (Ansible, Docker, GitLab, Tomcat, nginx). Entwicklung eines Docker-Swarm-Prototypen, Git-Coaching, Durchführung von Präsentationen, Prozessberatung, Entwurf eines Ethereum-basierten Geschäftsmodells, Erstellung von Installations- und Betriebskonzepten.</w:t>
       </w:r>
     </w:p>
-    <w:bookmarkEnd w:id="41"/>
-    <w:bookmarkStart w:id="42" w:name="section-17"/>
+    <w:bookmarkEnd w:id="43"/>
+    <w:bookmarkStart w:id="44" w:name="section-17"/>
     <w:p>
       <w:pPr>
         <w:pStyle w:val="Heading3"/>
@@ -1928,7 +2152,7 @@
       <w:pPr>
         <w:numPr>
           <w:ilvl w:val="0"/>
-          <w:numId w:val="1020"/>
+          <w:numId w:val="1022"/>
         </w:numPr>
       </w:pPr>
       <w:r>
@@ -1949,7 +2173,7 @@
       <w:pPr>
         <w:numPr>
           <w:ilvl w:val="0"/>
-          <w:numId w:val="1020"/>
+          <w:numId w:val="1022"/>
         </w:numPr>
       </w:pPr>
       <w:r>
@@ -1970,7 +2194,7 @@
       <w:pPr>
         <w:numPr>
           <w:ilvl w:val="0"/>
-          <w:numId w:val="1020"/>
+          <w:numId w:val="1022"/>
         </w:numPr>
       </w:pPr>
       <w:r>
@@ -1987,8 +2211,8 @@
         <w:t xml:space="preserve">Konzeption und Durchführung der Migration von CVS zu Git. Mitarbeit an einem Schulungskonzept, Integration in Bitbucket/Jira, Konzeption von Git-Flow für Interhyp, Erstellung von Export-/Import-Skripten, Durchführung von Git-Workshops sowie einer Klein-Studie zu Feature-Toggles.</w:t>
       </w:r>
     </w:p>
-    <w:bookmarkEnd w:id="42"/>
-    <w:bookmarkStart w:id="43" w:name="section-18"/>
+    <w:bookmarkEnd w:id="44"/>
+    <w:bookmarkStart w:id="45" w:name="section-18"/>
     <w:p>
       <w:pPr>
         <w:pStyle w:val="Heading3"/>
@@ -2001,7 +2225,7 @@
       <w:pPr>
         <w:numPr>
           <w:ilvl w:val="0"/>
-          <w:numId w:val="1021"/>
+          <w:numId w:val="1023"/>
         </w:numPr>
       </w:pPr>
       <w:r>
@@ -2022,7 +2246,7 @@
       <w:pPr>
         <w:numPr>
           <w:ilvl w:val="0"/>
-          <w:numId w:val="1021"/>
+          <w:numId w:val="1023"/>
         </w:numPr>
       </w:pPr>
       <w:r>
@@ -2043,7 +2267,7 @@
       <w:pPr>
         <w:numPr>
           <w:ilvl w:val="0"/>
-          <w:numId w:val="1021"/>
+          <w:numId w:val="1023"/>
         </w:numPr>
       </w:pPr>
       <w:r>
@@ -2060,8 +2284,8 @@
         <w:t xml:space="preserve">Mitarbeit im DevOps-Team (3 Personen). Konzeption und Umsetzung einer Deployment-Pipeline auf Basis des Apache ServiceBus, Unterstützung bei Maven-Skripten, Technologieentscheidungen und Präsentationen. Aufbau eines Dashboards mit Raspberry Pi II und Raspbian. Design eines Basis-Images für VMs, Ticket-Bearbeitung, User-Administration, Verwaltung von GitLab/Jenkins, Management von Verteilprozessen, Neuaufbau von Build-Pipelines für Apache ServiceMix-Projekte.</w:t>
       </w:r>
     </w:p>
-    <w:bookmarkEnd w:id="43"/>
-    <w:bookmarkStart w:id="44" w:name="section-19"/>
+    <w:bookmarkEnd w:id="45"/>
+    <w:bookmarkStart w:id="46" w:name="section-19"/>
     <w:p>
       <w:pPr>
         <w:pStyle w:val="Heading3"/>
@@ -2074,7 +2298,7 @@
       <w:pPr>
         <w:numPr>
           <w:ilvl w:val="0"/>
-          <w:numId w:val="1022"/>
+          <w:numId w:val="1024"/>
         </w:numPr>
       </w:pPr>
       <w:r>
@@ -2095,7 +2319,7 @@
       <w:pPr>
         <w:numPr>
           <w:ilvl w:val="0"/>
-          <w:numId w:val="1022"/>
+          <w:numId w:val="1024"/>
         </w:numPr>
       </w:pPr>
       <w:r>
@@ -2116,7 +2340,7 @@
       <w:pPr>
         <w:numPr>
           <w:ilvl w:val="0"/>
-          <w:numId w:val="1022"/>
+          <w:numId w:val="1024"/>
         </w:numPr>
       </w:pPr>
       <w:r>
@@ -2133,8 +2357,8 @@
         <w:t xml:space="preserve">Analyse, Planung und teilweise Durchführung der Migrationen von CruiseControl zu Jenkins, von CVS zu Subversion sowie von Ant nach Maven. Erstellung diverser Präsentationen, Statusberichte und Mini-Schulungen der betroffenen Mitarbeiter.</w:t>
       </w:r>
     </w:p>
-    <w:bookmarkEnd w:id="44"/>
-    <w:bookmarkStart w:id="45" w:name="section-20"/>
+    <w:bookmarkEnd w:id="46"/>
+    <w:bookmarkStart w:id="47" w:name="section-20"/>
     <w:p>
       <w:pPr>
         <w:pStyle w:val="Heading3"/>
@@ -2147,7 +2371,7 @@
       <w:pPr>
         <w:numPr>
           <w:ilvl w:val="0"/>
-          <w:numId w:val="1023"/>
+          <w:numId w:val="1025"/>
         </w:numPr>
       </w:pPr>
       <w:r>
@@ -2168,7 +2392,7 @@
       <w:pPr>
         <w:numPr>
           <w:ilvl w:val="0"/>
-          <w:numId w:val="1023"/>
+          <w:numId w:val="1025"/>
         </w:numPr>
       </w:pPr>
       <w:r>
@@ -2189,7 +2413,7 @@
       <w:pPr>
         <w:numPr>
           <w:ilvl w:val="0"/>
-          <w:numId w:val="1023"/>
+          <w:numId w:val="1025"/>
         </w:numPr>
       </w:pPr>
       <w:r>
@@ -2206,8 +2430,8 @@
         <w:t xml:space="preserve">Erstellung einer Dokumentationsplattform basierend auf dem Maven Site Plugin. Optimierung von Jenkins-Builds, Evaluation von Vagrant, Überarbeitung des Multi-Module-Maven-Builds, Migration von Subversion nach Git, Verbesserung der Integrationstests sowie Wartung des Entwickler-Clusters.</w:t>
       </w:r>
     </w:p>
-    <w:bookmarkEnd w:id="45"/>
-    <w:bookmarkStart w:id="46" w:name="section-21"/>
+    <w:bookmarkEnd w:id="47"/>
+    <w:bookmarkStart w:id="48" w:name="section-21"/>
     <w:p>
       <w:pPr>
         <w:pStyle w:val="Heading3"/>
@@ -2220,7 +2444,7 @@
       <w:pPr>
         <w:numPr>
           <w:ilvl w:val="0"/>
-          <w:numId w:val="1024"/>
+          <w:numId w:val="1026"/>
         </w:numPr>
       </w:pPr>
       <w:r>
@@ -2241,7 +2465,7 @@
       <w:pPr>
         <w:numPr>
           <w:ilvl w:val="0"/>
-          <w:numId w:val="1024"/>
+          <w:numId w:val="1026"/>
         </w:numPr>
       </w:pPr>
       <w:r>
@@ -2262,7 +2486,7 @@
       <w:pPr>
         <w:numPr>
           <w:ilvl w:val="0"/>
-          <w:numId w:val="1024"/>
+          <w:numId w:val="1026"/>
         </w:numPr>
       </w:pPr>
       <w:r>
@@ -2279,8 +2503,8 @@
         <w:t xml:space="preserve">Refactoring und Weiterentwicklung eines Systems zur Übersetzung von Betriebshandbüchern in verschiedene Sprachen. Entwicklung von Swing-Komponenten, Anpassung der SOAP-Schnittstelle (Client und Server) an neue Typen, Erstellung von Mockups für den Endkunden sowie Coaching jüngerer Entwickler und Fehlerbehebung.</w:t>
       </w:r>
     </w:p>
-    <w:bookmarkEnd w:id="46"/>
-    <w:bookmarkStart w:id="47" w:name="section-22"/>
+    <w:bookmarkEnd w:id="48"/>
+    <w:bookmarkStart w:id="49" w:name="section-22"/>
     <w:p>
       <w:pPr>
         <w:pStyle w:val="Heading3"/>
@@ -2293,7 +2517,7 @@
       <w:pPr>
         <w:numPr>
           <w:ilvl w:val="0"/>
-          <w:numId w:val="1025"/>
+          <w:numId w:val="1027"/>
         </w:numPr>
       </w:pPr>
       <w:r>
@@ -2314,7 +2538,7 @@
       <w:pPr>
         <w:numPr>
           <w:ilvl w:val="0"/>
-          <w:numId w:val="1025"/>
+          <w:numId w:val="1027"/>
         </w:numPr>
       </w:pPr>
       <w:r>
@@ -2335,7 +2559,7 @@
       <w:pPr>
         <w:numPr>
           <w:ilvl w:val="0"/>
-          <w:numId w:val="1025"/>
+          <w:numId w:val="1027"/>
         </w:numPr>
       </w:pPr>
       <w:r>
@@ -2352,8 +2576,8 @@
         <w:t xml:space="preserve">Erstellung eines VirtualBox-Images für Entwickler. Entwicklung zweier Import-Tools für Datenabgleich mittels eines RCP-Clients. Vorbereitung eines OCSP-Providers als Ersatz der bestehenden CRL-Lösung.</w:t>
       </w:r>
     </w:p>
-    <w:bookmarkEnd w:id="47"/>
-    <w:bookmarkStart w:id="48" w:name="section-23"/>
+    <w:bookmarkEnd w:id="49"/>
+    <w:bookmarkStart w:id="50" w:name="section-23"/>
     <w:p>
       <w:pPr>
         <w:pStyle w:val="Heading3"/>
@@ -2366,7 +2590,7 @@
       <w:pPr>
         <w:numPr>
           <w:ilvl w:val="0"/>
-          <w:numId w:val="1026"/>
+          <w:numId w:val="1028"/>
         </w:numPr>
       </w:pPr>
       <w:r>
@@ -2387,7 +2611,7 @@
       <w:pPr>
         <w:numPr>
           <w:ilvl w:val="0"/>
-          <w:numId w:val="1026"/>
+          <w:numId w:val="1028"/>
         </w:numPr>
       </w:pPr>
       <w:r>
@@ -2408,7 +2632,7 @@
       <w:pPr>
         <w:numPr>
           <w:ilvl w:val="0"/>
-          <w:numId w:val="1026"/>
+          <w:numId w:val="1028"/>
         </w:numPr>
       </w:pPr>
       <w:r>
@@ -2425,8 +2649,8 @@
         <w:t xml:space="preserve">Fehlerbehebung im laufenden Shop-Betrieb sowie Erweiterung der Backoffice-Administrationstools.</w:t>
       </w:r>
     </w:p>
-    <w:bookmarkEnd w:id="48"/>
-    <w:bookmarkStart w:id="49" w:name="section-24"/>
+    <w:bookmarkEnd w:id="50"/>
+    <w:bookmarkStart w:id="51" w:name="section-24"/>
     <w:p>
       <w:pPr>
         <w:pStyle w:val="Heading3"/>
@@ -2439,7 +2663,7 @@
       <w:pPr>
         <w:numPr>
           <w:ilvl w:val="0"/>
-          <w:numId w:val="1027"/>
+          <w:numId w:val="1029"/>
         </w:numPr>
       </w:pPr>
       <w:r>
@@ -2460,7 +2684,7 @@
       <w:pPr>
         <w:numPr>
           <w:ilvl w:val="0"/>
-          <w:numId w:val="1027"/>
+          <w:numId w:val="1029"/>
         </w:numPr>
       </w:pPr>
       <w:r>
@@ -2481,7 +2705,7 @@
       <w:pPr>
         <w:numPr>
           <w:ilvl w:val="0"/>
-          <w:numId w:val="1027"/>
+          <w:numId w:val="1029"/>
         </w:numPr>
       </w:pPr>
       <w:r>
@@ -2498,8 +2722,8 @@
         <w:t xml:space="preserve">Implementierung des camt.54-Imports für eine Webanwendung zum Management von SEPA Direct Debit Mandaten und SEPA Credit Transfers. Überarbeitung des Unit-Test-Frameworks und interimistischer Team-Lead kleinerer Teams.</w:t>
       </w:r>
     </w:p>
-    <w:bookmarkEnd w:id="49"/>
-    <w:bookmarkStart w:id="50" w:name="section-25"/>
+    <w:bookmarkEnd w:id="51"/>
+    <w:bookmarkStart w:id="52" w:name="section-25"/>
     <w:p>
       <w:pPr>
         <w:pStyle w:val="Heading3"/>
@@ -2512,7 +2736,7 @@
       <w:pPr>
         <w:numPr>
           <w:ilvl w:val="0"/>
-          <w:numId w:val="1028"/>
+          <w:numId w:val="1030"/>
         </w:numPr>
       </w:pPr>
       <w:r>
@@ -2533,7 +2757,7 @@
       <w:pPr>
         <w:numPr>
           <w:ilvl w:val="0"/>
-          <w:numId w:val="1028"/>
+          <w:numId w:val="1030"/>
         </w:numPr>
       </w:pPr>
       <w:r>
@@ -2554,7 +2778,7 @@
       <w:pPr>
         <w:numPr>
           <w:ilvl w:val="0"/>
-          <w:numId w:val="1028"/>
+          <w:numId w:val="1030"/>
         </w:numPr>
       </w:pPr>
       <w:r>
@@ -2571,8 +2795,8 @@
         <w:t xml:space="preserve">Umstellung der Kalender-Anwendung auf eine generische Anwesenheits- und Abwesenheitsverwaltung sowie Behebung diverser Fehler.</w:t>
       </w:r>
     </w:p>
-    <w:bookmarkEnd w:id="50"/>
-    <w:bookmarkStart w:id="51" w:name="section-26"/>
+    <w:bookmarkEnd w:id="52"/>
+    <w:bookmarkStart w:id="53" w:name="section-26"/>
     <w:p>
       <w:pPr>
         <w:pStyle w:val="Heading3"/>
@@ -2585,7 +2809,7 @@
       <w:pPr>
         <w:numPr>
           <w:ilvl w:val="0"/>
-          <w:numId w:val="1029"/>
+          <w:numId w:val="1031"/>
         </w:numPr>
       </w:pPr>
       <w:r>
@@ -2606,7 +2830,7 @@
       <w:pPr>
         <w:numPr>
           <w:ilvl w:val="0"/>
-          <w:numId w:val="1029"/>
+          <w:numId w:val="1031"/>
         </w:numPr>
       </w:pPr>
       <w:r>
@@ -2627,7 +2851,7 @@
       <w:pPr>
         <w:numPr>
           <w:ilvl w:val="0"/>
-          <w:numId w:val="1029"/>
+          <w:numId w:val="1031"/>
         </w:numPr>
       </w:pPr>
       <w:r>
@@ -2644,8 +2868,8 @@
         <w:t xml:space="preserve">Implementierung einer hybriden Intranet-Anwendung (Online/Offline) für die Servicetechniker der intern produzierten Industriemaschinen. Umsetzung eines bestehenden RCP-Clients als Wicket-Webanwendung.</w:t>
       </w:r>
     </w:p>
-    <w:bookmarkEnd w:id="51"/>
-    <w:bookmarkStart w:id="52" w:name="section-27"/>
+    <w:bookmarkEnd w:id="53"/>
+    <w:bookmarkStart w:id="54" w:name="section-27"/>
     <w:p>
       <w:pPr>
         <w:pStyle w:val="Heading3"/>
@@ -2658,7 +2882,7 @@
       <w:pPr>
         <w:numPr>
           <w:ilvl w:val="0"/>
-          <w:numId w:val="1030"/>
+          <w:numId w:val="1032"/>
         </w:numPr>
       </w:pPr>
       <w:r>
@@ -2679,7 +2903,7 @@
       <w:pPr>
         <w:numPr>
           <w:ilvl w:val="0"/>
-          <w:numId w:val="1030"/>
+          <w:numId w:val="1032"/>
         </w:numPr>
       </w:pPr>
       <w:r>
@@ -2700,7 +2924,7 @@
       <w:pPr>
         <w:numPr>
           <w:ilvl w:val="0"/>
-          <w:numId w:val="1030"/>
+          <w:numId w:val="1032"/>
         </w:numPr>
       </w:pPr>
       <w:r>
@@ -2717,8 +2941,8 @@
         <w:t xml:space="preserve">Verfeinerung und Weiterentwicklung eines EAI-Adapters, der externe JMS/XML-Daten entgegennimmt, puffert, validiert, anreichert und an interne Corba-Dienste weiterleitet. Konzeption und Entwicklung weiterer Adapter.</w:t>
       </w:r>
     </w:p>
-    <w:bookmarkEnd w:id="52"/>
-    <w:bookmarkStart w:id="53" w:name="section-28"/>
+    <w:bookmarkEnd w:id="54"/>
+    <w:bookmarkStart w:id="55" w:name="section-28"/>
     <w:p>
       <w:pPr>
         <w:pStyle w:val="Heading3"/>
@@ -2731,7 +2955,7 @@
       <w:pPr>
         <w:numPr>
           <w:ilvl w:val="0"/>
-          <w:numId w:val="1031"/>
+          <w:numId w:val="1033"/>
         </w:numPr>
       </w:pPr>
       <w:r>
@@ -2752,7 +2976,7 @@
       <w:pPr>
         <w:numPr>
           <w:ilvl w:val="0"/>
-          <w:numId w:val="1031"/>
+          <w:numId w:val="1033"/>
         </w:numPr>
       </w:pPr>
       <w:r>
@@ -2773,7 +2997,7 @@
       <w:pPr>
         <w:numPr>
           <w:ilvl w:val="0"/>
-          <w:numId w:val="1031"/>
+          <w:numId w:val="1033"/>
         </w:numPr>
       </w:pPr>
       <w:r>
@@ -2790,8 +3014,8 @@
         <w:t xml:space="preserve">Übernahme und Performance-Optimierung eines Banner-Auslieferungs- und Click-Tracking-Servers, ursprünglich von einem externen Team in Armenien entwickelt. Behebung eines kritischen Datenbank-Performanceproblems, Optimierung der Build- und Deployment-Prozesse, Entwicklung einer Mini-Profiling-API, allgemeine Performanceverbesserungen, Datenbankbereinigung und Einführung von Git.</w:t>
       </w:r>
     </w:p>
-    <w:bookmarkEnd w:id="53"/>
-    <w:bookmarkStart w:id="54" w:name="section-29"/>
+    <w:bookmarkEnd w:id="55"/>
+    <w:bookmarkStart w:id="56" w:name="section-29"/>
     <w:p>
       <w:pPr>
         <w:pStyle w:val="Heading3"/>
@@ -2804,7 +3028,7 @@
       <w:pPr>
         <w:numPr>
           <w:ilvl w:val="0"/>
-          <w:numId w:val="1032"/>
+          <w:numId w:val="1034"/>
         </w:numPr>
       </w:pPr>
       <w:r>
@@ -2825,7 +3049,7 @@
       <w:pPr>
         <w:numPr>
           <w:ilvl w:val="0"/>
-          <w:numId w:val="1032"/>
+          <w:numId w:val="1034"/>
         </w:numPr>
       </w:pPr>
       <w:r>
@@ -2846,7 +3070,7 @@
       <w:pPr>
         <w:numPr>
           <w:ilvl w:val="0"/>
-          <w:numId w:val="1032"/>
+          <w:numId w:val="1034"/>
         </w:numPr>
       </w:pPr>
       <w:r>
@@ -2863,8 +3087,8 @@
         <w:t xml:space="preserve">Erweiterung eines bestehenden Swing-Clients für die anstehende TÜV-Privatisierung. Implementierung von Komponenten auf allen Schichten sowie Konzeption und Umsetzung verschiedener Teilfunktionen und Module.</w:t>
       </w:r>
     </w:p>
-    <w:bookmarkEnd w:id="54"/>
-    <w:bookmarkStart w:id="55" w:name="section-30"/>
+    <w:bookmarkEnd w:id="56"/>
+    <w:bookmarkStart w:id="57" w:name="section-30"/>
     <w:p>
       <w:pPr>
         <w:pStyle w:val="Heading3"/>
@@ -2877,7 +3101,7 @@
       <w:pPr>
         <w:numPr>
           <w:ilvl w:val="0"/>
-          <w:numId w:val="1033"/>
+          <w:numId w:val="1035"/>
         </w:numPr>
       </w:pPr>
       <w:r>
@@ -2898,7 +3122,7 @@
       <w:pPr>
         <w:numPr>
           <w:ilvl w:val="0"/>
-          <w:numId w:val="1033"/>
+          <w:numId w:val="1035"/>
         </w:numPr>
       </w:pPr>
       <w:r>
@@ -2919,7 +3143,7 @@
       <w:pPr>
         <w:numPr>
           <w:ilvl w:val="0"/>
-          <w:numId w:val="1033"/>
+          <w:numId w:val="1035"/>
         </w:numPr>
       </w:pPr>
       <w:r>
@@ -2936,8 +3160,8 @@
         <w:t xml:space="preserve">Konzeption und Umsetzung einer Webanwendung zur Verwaltung von Kundenbeziehungen und Abwicklung von Umzugsprojekten.</w:t>
       </w:r>
     </w:p>
-    <w:bookmarkEnd w:id="55"/>
-    <w:bookmarkStart w:id="56" w:name="section-31"/>
+    <w:bookmarkEnd w:id="57"/>
+    <w:bookmarkStart w:id="58" w:name="section-31"/>
     <w:p>
       <w:pPr>
         <w:pStyle w:val="Heading3"/>
@@ -2950,7 +3174,7 @@
       <w:pPr>
         <w:numPr>
           <w:ilvl w:val="0"/>
-          <w:numId w:val="1034"/>
+          <w:numId w:val="1036"/>
         </w:numPr>
       </w:pPr>
       <w:r>
@@ -2971,7 +3195,7 @@
       <w:pPr>
         <w:numPr>
           <w:ilvl w:val="0"/>
-          <w:numId w:val="1034"/>
+          <w:numId w:val="1036"/>
         </w:numPr>
       </w:pPr>
       <w:r>
@@ -2992,7 +3216,7 @@
       <w:pPr>
         <w:numPr>
           <w:ilvl w:val="0"/>
-          <w:numId w:val="1034"/>
+          <w:numId w:val="1036"/>
         </w:numPr>
       </w:pPr>
       <w:r>
@@ -3009,8 +3233,8 @@
         <w:t xml:space="preserve">Portierung diverser Java-Projekte (Eclipse RCP, Eclipse PDE) von Ant nach Maven sowie Einrichtung entsprechender Build-Pläne in Bamboo.</w:t>
       </w:r>
     </w:p>
-    <w:bookmarkEnd w:id="56"/>
-    <w:bookmarkStart w:id="57" w:name="section-32"/>
+    <w:bookmarkEnd w:id="58"/>
+    <w:bookmarkStart w:id="59" w:name="section-32"/>
     <w:p>
       <w:pPr>
         <w:pStyle w:val="Heading3"/>
@@ -3023,7 +3247,7 @@
       <w:pPr>
         <w:numPr>
           <w:ilvl w:val="0"/>
-          <w:numId w:val="1035"/>
+          <w:numId w:val="1037"/>
         </w:numPr>
       </w:pPr>
       <w:r>
@@ -3044,7 +3268,7 @@
       <w:pPr>
         <w:numPr>
           <w:ilvl w:val="0"/>
-          <w:numId w:val="1035"/>
+          <w:numId w:val="1037"/>
         </w:numPr>
       </w:pPr>
       <w:r>
@@ -3065,7 +3289,7 @@
       <w:pPr>
         <w:numPr>
           <w:ilvl w:val="0"/>
-          <w:numId w:val="1035"/>
+          <w:numId w:val="1037"/>
         </w:numPr>
       </w:pPr>
       <w:r>
@@ -3097,8 +3321,8 @@
         <w:t xml:space="preserve">.</w:t>
       </w:r>
     </w:p>
-    <w:bookmarkEnd w:id="57"/>
-    <w:bookmarkStart w:id="58" w:name="section-33"/>
+    <w:bookmarkEnd w:id="59"/>
+    <w:bookmarkStart w:id="60" w:name="section-33"/>
     <w:p>
       <w:pPr>
         <w:pStyle w:val="Heading3"/>
@@ -3111,7 +3335,7 @@
       <w:pPr>
         <w:numPr>
           <w:ilvl w:val="0"/>
-          <w:numId w:val="1036"/>
+          <w:numId w:val="1038"/>
         </w:numPr>
       </w:pPr>
       <w:r>
@@ -3132,7 +3356,7 @@
       <w:pPr>
         <w:numPr>
           <w:ilvl w:val="0"/>
-          <w:numId w:val="1036"/>
+          <w:numId w:val="1038"/>
         </w:numPr>
       </w:pPr>
       <w:r>
@@ -3153,7 +3377,7 @@
       <w:pPr>
         <w:numPr>
           <w:ilvl w:val="0"/>
-          <w:numId w:val="1036"/>
+          <w:numId w:val="1038"/>
         </w:numPr>
       </w:pPr>
       <w:r>
@@ -3170,8 +3394,8 @@
         <w:t xml:space="preserve">Erweiterung eines Trouble-Management-Systems zur Integration eines zusätzlichen Kunden.</w:t>
       </w:r>
     </w:p>
-    <w:bookmarkEnd w:id="58"/>
-    <w:bookmarkStart w:id="59" w:name="section-34"/>
+    <w:bookmarkEnd w:id="60"/>
+    <w:bookmarkStart w:id="61" w:name="section-34"/>
     <w:p>
       <w:pPr>
         <w:pStyle w:val="Heading3"/>
@@ -3184,7 +3408,7 @@
       <w:pPr>
         <w:numPr>
           <w:ilvl w:val="0"/>
-          <w:numId w:val="1037"/>
+          <w:numId w:val="1039"/>
         </w:numPr>
       </w:pPr>
       <w:r>
@@ -3205,7 +3429,7 @@
       <w:pPr>
         <w:numPr>
           <w:ilvl w:val="0"/>
-          <w:numId w:val="1037"/>
+          <w:numId w:val="1039"/>
         </w:numPr>
       </w:pPr>
       <w:r>
@@ -3226,7 +3450,7 @@
       <w:pPr>
         <w:numPr>
           <w:ilvl w:val="0"/>
-          <w:numId w:val="1037"/>
+          <w:numId w:val="1039"/>
         </w:numPr>
       </w:pPr>
       <w:r>
@@ -3243,8 +3467,8 @@
         <w:t xml:space="preserve">Design und Erstellung eines Adapter-Service (Multi-Protokoll) zur Integration einer Drittanbieter-Lösung zum Faxen per Internet. Design und Erstellung eines zentraler Multiprotokoll-Dienst für die konzernweite Verwaltung von Freikontingenten</w:t>
       </w:r>
     </w:p>
-    <w:bookmarkEnd w:id="59"/>
-    <w:bookmarkStart w:id="60" w:name="section-35"/>
+    <w:bookmarkEnd w:id="61"/>
+    <w:bookmarkStart w:id="62" w:name="section-35"/>
     <w:p>
       <w:pPr>
         <w:pStyle w:val="Heading3"/>
@@ -3257,7 +3481,7 @@
       <w:pPr>
         <w:numPr>
           <w:ilvl w:val="0"/>
-          <w:numId w:val="1038"/>
+          <w:numId w:val="1040"/>
         </w:numPr>
       </w:pPr>
       <w:r>
@@ -3278,7 +3502,7 @@
       <w:pPr>
         <w:numPr>
           <w:ilvl w:val="0"/>
-          <w:numId w:val="1038"/>
+          <w:numId w:val="1040"/>
         </w:numPr>
       </w:pPr>
       <w:r>
@@ -3299,7 +3523,7 @@
       <w:pPr>
         <w:numPr>
           <w:ilvl w:val="0"/>
-          <w:numId w:val="1038"/>
+          <w:numId w:val="1040"/>
         </w:numPr>
       </w:pPr>
       <w:r>
@@ -3316,8 +3540,8 @@
         <w:t xml:space="preserve">Überführung eines Delphi Fat Clients zur Auftragsabwicklung in eine SOA-basierte Architektur</w:t>
       </w:r>
     </w:p>
-    <w:bookmarkEnd w:id="60"/>
-    <w:bookmarkStart w:id="61" w:name="section-36"/>
+    <w:bookmarkEnd w:id="62"/>
+    <w:bookmarkStart w:id="63" w:name="section-36"/>
     <w:p>
       <w:pPr>
         <w:pStyle w:val="Heading3"/>
@@ -3330,7 +3554,7 @@
       <w:pPr>
         <w:numPr>
           <w:ilvl w:val="0"/>
-          <w:numId w:val="1039"/>
+          <w:numId w:val="1041"/>
         </w:numPr>
       </w:pPr>
       <w:r>
@@ -3351,7 +3575,7 @@
       <w:pPr>
         <w:numPr>
           <w:ilvl w:val="0"/>
-          <w:numId w:val="1039"/>
+          <w:numId w:val="1041"/>
         </w:numPr>
       </w:pPr>
       <w:r>
@@ -3372,7 +3596,7 @@
       <w:pPr>
         <w:numPr>
           <w:ilvl w:val="0"/>
-          <w:numId w:val="1039"/>
+          <w:numId w:val="1041"/>
         </w:numPr>
       </w:pPr>
       <w:r>
@@ -3440,8 +3664,8 @@
         <w:t xml:space="preserve">. Hier wurde exzessiv die modellgetriebene Software-Entwicklung betrieben, es kam die gesamte IBM Rational tool chain zum Einsatz. Teilweise in Zürich.</w:t>
       </w:r>
     </w:p>
-    <w:bookmarkEnd w:id="61"/>
-    <w:bookmarkStart w:id="62" w:name="section-37"/>
+    <w:bookmarkEnd w:id="63"/>
+    <w:bookmarkStart w:id="64" w:name="section-37"/>
     <w:p>
       <w:pPr>
         <w:pStyle w:val="Heading3"/>
@@ -3454,7 +3678,7 @@
       <w:pPr>
         <w:numPr>
           <w:ilvl w:val="0"/>
-          <w:numId w:val="1040"/>
+          <w:numId w:val="1042"/>
         </w:numPr>
       </w:pPr>
       <w:r>
@@ -3475,7 +3699,7 @@
       <w:pPr>
         <w:numPr>
           <w:ilvl w:val="0"/>
-          <w:numId w:val="1040"/>
+          <w:numId w:val="1042"/>
         </w:numPr>
       </w:pPr>
       <w:r>
@@ -3496,7 +3720,7 @@
       <w:pPr>
         <w:numPr>
           <w:ilvl w:val="0"/>
-          <w:numId w:val="1040"/>
+          <w:numId w:val="1042"/>
         </w:numPr>
       </w:pPr>
       <w:r>
@@ -3513,8 +3737,8 @@
         <w:t xml:space="preserve">Im Rahmen einer Urlaubsvertretung Erweiterung einer bestehenden, web-basierten, proprietären CRM-Lösung für die Siemens SRS, sowie die Behebung zahlreicher Bugs.</w:t>
       </w:r>
     </w:p>
-    <w:bookmarkEnd w:id="62"/>
-    <w:bookmarkStart w:id="63" w:name="section-38"/>
+    <w:bookmarkEnd w:id="64"/>
+    <w:bookmarkStart w:id="65" w:name="section-38"/>
     <w:p>
       <w:pPr>
         <w:pStyle w:val="Heading3"/>
@@ -3527,7 +3751,7 @@
       <w:pPr>
         <w:numPr>
           <w:ilvl w:val="0"/>
-          <w:numId w:val="1041"/>
+          <w:numId w:val="1043"/>
         </w:numPr>
       </w:pPr>
       <w:r>
@@ -3548,7 +3772,7 @@
       <w:pPr>
         <w:numPr>
           <w:ilvl w:val="0"/>
-          <w:numId w:val="1041"/>
+          <w:numId w:val="1043"/>
         </w:numPr>
       </w:pPr>
       <w:r>
@@ -3569,7 +3793,7 @@
       <w:pPr>
         <w:numPr>
           <w:ilvl w:val="0"/>
-          <w:numId w:val="1041"/>
+          <w:numId w:val="1043"/>
         </w:numPr>
       </w:pPr>
       <w:r>
@@ -3586,8 +3810,8 @@
         <w:t xml:space="preserve">Überarbeitung der Analyse-Engine eines WAN- Planungtools hinsichtlich einer neuen Produktlinie. Die Analyse-Engine ist Teil eines Fat Clients mit Swing- Oberfläche.</w:t>
       </w:r>
     </w:p>
-    <w:bookmarkEnd w:id="63"/>
-    <w:bookmarkStart w:id="64" w:name="section-39"/>
+    <w:bookmarkEnd w:id="65"/>
+    <w:bookmarkStart w:id="66" w:name="section-39"/>
     <w:p>
       <w:pPr>
         <w:pStyle w:val="Heading3"/>
@@ -3600,7 +3824,7 @@
       <w:pPr>
         <w:numPr>
           <w:ilvl w:val="0"/>
-          <w:numId w:val="1042"/>
+          <w:numId w:val="1044"/>
         </w:numPr>
       </w:pPr>
       <w:r>
@@ -3621,7 +3845,7 @@
       <w:pPr>
         <w:numPr>
           <w:ilvl w:val="0"/>
-          <w:numId w:val="1042"/>
+          <w:numId w:val="1044"/>
         </w:numPr>
       </w:pPr>
       <w:r>
@@ -3642,7 +3866,7 @@
       <w:pPr>
         <w:numPr>
           <w:ilvl w:val="0"/>
-          <w:numId w:val="1042"/>
+          <w:numId w:val="1044"/>
         </w:numPr>
       </w:pPr>
       <w:r>
@@ -3659,8 +3883,8 @@
         <w:t xml:space="preserve">Wartung des T-Punkt-Client-/Servermoduls, eines eingebetteten Visual Basic Clients zur Bearbeitung von Adressdaten, der seine Daten mittels XML-Schnittstelle von einem Java-Server bezieht, und dorthin speichert.</w:t>
       </w:r>
     </w:p>
-    <w:bookmarkEnd w:id="64"/>
-    <w:bookmarkStart w:id="65" w:name="section-40"/>
+    <w:bookmarkEnd w:id="66"/>
+    <w:bookmarkStart w:id="67" w:name="section-40"/>
     <w:p>
       <w:pPr>
         <w:pStyle w:val="Heading3"/>
@@ -3673,7 +3897,7 @@
       <w:pPr>
         <w:numPr>
           <w:ilvl w:val="0"/>
-          <w:numId w:val="1043"/>
+          <w:numId w:val="1045"/>
         </w:numPr>
       </w:pPr>
       <w:r>
@@ -3694,7 +3918,7 @@
       <w:pPr>
         <w:numPr>
           <w:ilvl w:val="0"/>
-          <w:numId w:val="1043"/>
+          <w:numId w:val="1045"/>
         </w:numPr>
       </w:pPr>
       <w:r>
@@ -3715,7 +3939,7 @@
       <w:pPr>
         <w:numPr>
           <w:ilvl w:val="0"/>
-          <w:numId w:val="1043"/>
+          <w:numId w:val="1045"/>
         </w:numPr>
       </w:pPr>
       <w:r>
@@ -3732,8 +3956,8 @@
         <w:t xml:space="preserve">Portierung des zentralen Batch-Moduls zur „Massenumschaltung und Rufnummernänderung“ von Cobol und C/C++ nach Java. Zusammenarbeit in einem dynamisch wechselnden Team.</w:t>
       </w:r>
     </w:p>
-    <w:bookmarkEnd w:id="65"/>
-    <w:bookmarkStart w:id="66" w:name="section-41"/>
+    <w:bookmarkEnd w:id="67"/>
+    <w:bookmarkStart w:id="68" w:name="section-41"/>
     <w:p>
       <w:pPr>
         <w:pStyle w:val="Heading3"/>
@@ -3746,7 +3970,7 @@
       <w:pPr>
         <w:numPr>
           <w:ilvl w:val="0"/>
-          <w:numId w:val="1044"/>
+          <w:numId w:val="1046"/>
         </w:numPr>
       </w:pPr>
       <w:r>
@@ -3767,7 +3991,7 @@
       <w:pPr>
         <w:numPr>
           <w:ilvl w:val="0"/>
-          <w:numId w:val="1044"/>
+          <w:numId w:val="1046"/>
         </w:numPr>
       </w:pPr>
       <w:r>
@@ -3788,7 +4012,7 @@
       <w:pPr>
         <w:numPr>
           <w:ilvl w:val="0"/>
-          <w:numId w:val="1044"/>
+          <w:numId w:val="1046"/>
         </w:numPr>
       </w:pPr>
       <w:r>
@@ -3805,8 +4029,8 @@
         <w:t xml:space="preserve">Portierung des zentralen Import-Moduls für Vertriebs-Adressdaten von etwa 12 Satelliten-Systemen aus C/C++ und Cobol nach Java unter hohem Zeitdruck.</w:t>
       </w:r>
     </w:p>
-    <w:bookmarkEnd w:id="66"/>
-    <w:bookmarkStart w:id="67" w:name="section-42"/>
+    <w:bookmarkEnd w:id="68"/>
+    <w:bookmarkStart w:id="69" w:name="section-42"/>
     <w:p>
       <w:pPr>
         <w:pStyle w:val="Heading3"/>
@@ -3819,7 +4043,7 @@
       <w:pPr>
         <w:numPr>
           <w:ilvl w:val="0"/>
-          <w:numId w:val="1045"/>
+          <w:numId w:val="1047"/>
         </w:numPr>
       </w:pPr>
       <w:r>
@@ -3840,7 +4064,7 @@
       <w:pPr>
         <w:numPr>
           <w:ilvl w:val="0"/>
-          <w:numId w:val="1045"/>
+          <w:numId w:val="1047"/>
         </w:numPr>
       </w:pPr>
       <w:r>
@@ -3861,7 +4085,7 @@
       <w:pPr>
         <w:numPr>
           <w:ilvl w:val="0"/>
-          <w:numId w:val="1045"/>
+          <w:numId w:val="1047"/>
         </w:numPr>
       </w:pPr>
       <w:r>
@@ -3878,8 +4102,8 @@
         <w:t xml:space="preserve">Analyse, Entwurf und Realisierung einer Web-Anwendung zur Überwachung und Auswertung von Löschvorgängen in der zentralen Eintragsdatenbank der T-Com auf Tages-, Wochen- und Monatsbasis. Umsetzung aller Projektphasen außer Anwendungstests.</w:t>
       </w:r>
     </w:p>
-    <w:bookmarkEnd w:id="67"/>
-    <w:bookmarkStart w:id="68" w:name="section-43"/>
+    <w:bookmarkEnd w:id="69"/>
+    <w:bookmarkStart w:id="70" w:name="section-43"/>
     <w:p>
       <w:pPr>
         <w:pStyle w:val="Heading3"/>
@@ -3892,7 +4116,7 @@
       <w:pPr>
         <w:numPr>
           <w:ilvl w:val="0"/>
-          <w:numId w:val="1046"/>
+          <w:numId w:val="1048"/>
         </w:numPr>
       </w:pPr>
       <w:r>
@@ -3913,7 +4137,7 @@
       <w:pPr>
         <w:numPr>
           <w:ilvl w:val="0"/>
-          <w:numId w:val="1046"/>
+          <w:numId w:val="1048"/>
         </w:numPr>
       </w:pPr>
       <w:r>
@@ -3934,7 +4158,7 @@
       <w:pPr>
         <w:numPr>
           <w:ilvl w:val="0"/>
-          <w:numId w:val="1046"/>
+          <w:numId w:val="1048"/>
         </w:numPr>
       </w:pPr>
       <w:r>
@@ -3951,8 +4175,8 @@
         <w:t xml:space="preserve">Entwurf und Implementierung mehrerer Varianten eines EJB zur Speicherung und zum Auslesen von Produktdaten.</w:t>
       </w:r>
     </w:p>
-    <w:bookmarkEnd w:id="68"/>
-    <w:bookmarkStart w:id="69" w:name="section-44"/>
+    <w:bookmarkEnd w:id="70"/>
+    <w:bookmarkStart w:id="71" w:name="section-44"/>
     <w:p>
       <w:pPr>
         <w:pStyle w:val="Heading3"/>
@@ -3965,7 +4189,7 @@
       <w:pPr>
         <w:numPr>
           <w:ilvl w:val="0"/>
-          <w:numId w:val="1047"/>
+          <w:numId w:val="1049"/>
         </w:numPr>
       </w:pPr>
       <w:r>
@@ -3986,7 +4210,7 @@
       <w:pPr>
         <w:numPr>
           <w:ilvl w:val="0"/>
-          <w:numId w:val="1047"/>
+          <w:numId w:val="1049"/>
         </w:numPr>
       </w:pPr>
       <w:r>
@@ -4007,7 +4231,7 @@
       <w:pPr>
         <w:numPr>
           <w:ilvl w:val="0"/>
-          <w:numId w:val="1047"/>
+          <w:numId w:val="1049"/>
         </w:numPr>
       </w:pPr>
       <w:r>
@@ -4024,8 +4248,8 @@
         <w:t xml:space="preserve">Wartung des Web-Clients zur Nachbearbeitung von OCR-erkannten Adresskorrekturkarten der Deutschen Post. Verantwortlich für die Datenbankschicht (Weiterentwicklung und Wartung).</w:t>
       </w:r>
     </w:p>
-    <w:bookmarkEnd w:id="69"/>
-    <w:bookmarkStart w:id="70" w:name="section-45"/>
+    <w:bookmarkEnd w:id="71"/>
+    <w:bookmarkStart w:id="72" w:name="section-45"/>
     <w:p>
       <w:pPr>
         <w:pStyle w:val="Heading3"/>
@@ -4038,7 +4262,7 @@
       <w:pPr>
         <w:numPr>
           <w:ilvl w:val="0"/>
-          <w:numId w:val="1048"/>
+          <w:numId w:val="1050"/>
         </w:numPr>
       </w:pPr>
       <w:r>
@@ -4059,7 +4283,7 @@
       <w:pPr>
         <w:numPr>
           <w:ilvl w:val="0"/>
-          <w:numId w:val="1048"/>
+          <w:numId w:val="1050"/>
         </w:numPr>
       </w:pPr>
       <w:r>
@@ -4080,7 +4304,7 @@
       <w:pPr>
         <w:numPr>
           <w:ilvl w:val="0"/>
-          <w:numId w:val="1048"/>
+          <w:numId w:val="1050"/>
         </w:numPr>
       </w:pPr>
       <w:r>
@@ -4097,8 +4321,8 @@
         <w:t xml:space="preserve">Coaching von Java-Einsteigern und Erstellung eines Projektpiloten zur Nachbearbeitung halbautomatisch (Fax/OCR) erfasster Meldebelege.</w:t>
       </w:r>
     </w:p>
-    <w:bookmarkEnd w:id="70"/>
-    <w:bookmarkStart w:id="71" w:name="section-46"/>
+    <w:bookmarkEnd w:id="72"/>
+    <w:bookmarkStart w:id="73" w:name="section-46"/>
     <w:p>
       <w:pPr>
         <w:pStyle w:val="Heading3"/>
@@ -4111,7 +4335,7 @@
       <w:pPr>
         <w:numPr>
           <w:ilvl w:val="0"/>
-          <w:numId w:val="1049"/>
+          <w:numId w:val="1051"/>
         </w:numPr>
       </w:pPr>
       <w:r>
@@ -4132,7 +4356,7 @@
       <w:pPr>
         <w:numPr>
           <w:ilvl w:val="0"/>
-          <w:numId w:val="1049"/>
+          <w:numId w:val="1051"/>
         </w:numPr>
       </w:pPr>
       <w:r>
@@ -4153,7 +4377,7 @@
       <w:pPr>
         <w:numPr>
           <w:ilvl w:val="0"/>
-          <w:numId w:val="1049"/>
+          <w:numId w:val="1051"/>
         </w:numPr>
       </w:pPr>
       <w:r>
@@ -4170,8 +4394,8 @@
         <w:t xml:space="preserve">Entwicklung eines Intranet-Shops für Marketingdokumente (Prospekte, Bilder, Druckvorstufen). Dokumente wurden per Swing-Oberfläche importiert, Kunden konnten online bestellen. Verwaltung von Kostenstellen, Berechtigungen und Budgetierungen.</w:t>
       </w:r>
     </w:p>
-    <w:bookmarkEnd w:id="71"/>
-    <w:bookmarkStart w:id="72" w:name="section-47"/>
+    <w:bookmarkEnd w:id="73"/>
+    <w:bookmarkStart w:id="74" w:name="section-47"/>
     <w:p>
       <w:pPr>
         <w:pStyle w:val="Heading3"/>
@@ -4184,7 +4408,7 @@
       <w:pPr>
         <w:numPr>
           <w:ilvl w:val="0"/>
-          <w:numId w:val="1050"/>
+          <w:numId w:val="1052"/>
         </w:numPr>
       </w:pPr>
       <w:r>
@@ -4205,7 +4429,7 @@
       <w:pPr>
         <w:numPr>
           <w:ilvl w:val="0"/>
-          <w:numId w:val="1050"/>
+          <w:numId w:val="1052"/>
         </w:numPr>
       </w:pPr>
       <w:r>
@@ -4226,7 +4450,7 @@
       <w:pPr>
         <w:numPr>
           <w:ilvl w:val="0"/>
-          <w:numId w:val="1050"/>
+          <w:numId w:val="1052"/>
         </w:numPr>
       </w:pPr>
       <w:r>
@@ -4243,8 +4467,8 @@
         <w:t xml:space="preserve">Implementierung eines Swing-basierten Zertifizierungs-Clients im Rahmen des Platinum-Projekts bei SAP LS (Learning Solution). Fokus auf optische Anpassung und Skalierbarkeit zur Windows-Vorlage.</w:t>
       </w:r>
     </w:p>
-    <w:bookmarkEnd w:id="72"/>
-    <w:bookmarkStart w:id="73" w:name="laufend-2"/>
+    <w:bookmarkEnd w:id="74"/>
+    <w:bookmarkStart w:id="75" w:name="laufend-4"/>
     <w:p>
       <w:pPr>
         <w:pStyle w:val="Heading3"/>
@@ -4257,7 +4481,7 @@
       <w:pPr>
         <w:numPr>
           <w:ilvl w:val="0"/>
-          <w:numId w:val="1051"/>
+          <w:numId w:val="1053"/>
         </w:numPr>
       </w:pPr>
       <w:r>
@@ -4278,7 +4502,7 @@
       <w:pPr>
         <w:numPr>
           <w:ilvl w:val="0"/>
-          <w:numId w:val="1051"/>
+          <w:numId w:val="1053"/>
         </w:numPr>
       </w:pPr>
       <w:r>
@@ -4299,7 +4523,7 @@
       <w:pPr>
         <w:numPr>
           <w:ilvl w:val="0"/>
-          <w:numId w:val="1051"/>
+          <w:numId w:val="1053"/>
         </w:numPr>
       </w:pPr>
       <w:r>
@@ -4320,7 +4544,7 @@
       <w:pPr>
         <w:numPr>
           <w:ilvl w:val="0"/>
-          <w:numId w:val="1051"/>
+          <w:numId w:val="1053"/>
         </w:numPr>
       </w:pPr>
       <w:r>
@@ -4343,8 +4567,8 @@
         <w:t xml:space="preserve">URL: https://hub.docker.com/repository/docker/outpost/ssh-relais</w:t>
       </w:r>
     </w:p>
-    <w:bookmarkEnd w:id="73"/>
-    <w:bookmarkStart w:id="74" w:name="section-48"/>
+    <w:bookmarkEnd w:id="75"/>
+    <w:bookmarkStart w:id="76" w:name="section-48"/>
     <w:p>
       <w:pPr>
         <w:pStyle w:val="Heading3"/>
@@ -4357,7 +4581,7 @@
       <w:pPr>
         <w:numPr>
           <w:ilvl w:val="0"/>
-          <w:numId w:val="1052"/>
+          <w:numId w:val="1054"/>
         </w:numPr>
       </w:pPr>
       <w:r>
@@ -4378,7 +4602,7 @@
       <w:pPr>
         <w:numPr>
           <w:ilvl w:val="0"/>
-          <w:numId w:val="1052"/>
+          <w:numId w:val="1054"/>
         </w:numPr>
       </w:pPr>
       <w:r>
@@ -4399,7 +4623,7 @@
       <w:pPr>
         <w:numPr>
           <w:ilvl w:val="0"/>
-          <w:numId w:val="1052"/>
+          <w:numId w:val="1054"/>
         </w:numPr>
       </w:pPr>
       <w:r>
@@ -4416,8 +4640,8 @@
         <w:t xml:space="preserve">Konzeption und Umsetzung einer Timetabling-Software mittels genetischer Algorithmen im Rahmen meiner Diplomarbeit.</w:t>
       </w:r>
     </w:p>
-    <w:bookmarkEnd w:id="74"/>
-    <w:bookmarkStart w:id="75" w:name="section-49"/>
+    <w:bookmarkEnd w:id="76"/>
+    <w:bookmarkStart w:id="77" w:name="section-49"/>
     <w:p>
       <w:pPr>
         <w:pStyle w:val="Heading3"/>
@@ -4430,7 +4654,7 @@
       <w:pPr>
         <w:numPr>
           <w:ilvl w:val="0"/>
-          <w:numId w:val="1053"/>
+          <w:numId w:val="1055"/>
         </w:numPr>
       </w:pPr>
       <w:r>
@@ -4451,7 +4675,7 @@
       <w:pPr>
         <w:numPr>
           <w:ilvl w:val="0"/>
-          <w:numId w:val="1053"/>
+          <w:numId w:val="1055"/>
         </w:numPr>
       </w:pPr>
       <w:r>
@@ -4472,7 +4696,7 @@
       <w:pPr>
         <w:numPr>
           <w:ilvl w:val="0"/>
-          <w:numId w:val="1053"/>
+          <w:numId w:val="1055"/>
         </w:numPr>
       </w:pPr>
       <w:r>
@@ -4489,8 +4713,8 @@
         <w:t xml:space="preserve">Entwicklung eines Tools zur Generierung von Importdaten für lineare Gleichungssysteme zur Optimierung von Aktien-Portfolios.</w:t>
       </w:r>
     </w:p>
-    <w:bookmarkEnd w:id="75"/>
-    <w:bookmarkStart w:id="76" w:name="section-50"/>
+    <w:bookmarkEnd w:id="77"/>
+    <w:bookmarkStart w:id="78" w:name="section-50"/>
     <w:p>
       <w:pPr>
         <w:pStyle w:val="Heading3"/>
@@ -4503,7 +4727,7 @@
       <w:pPr>
         <w:numPr>
           <w:ilvl w:val="0"/>
-          <w:numId w:val="1054"/>
+          <w:numId w:val="1056"/>
         </w:numPr>
       </w:pPr>
       <w:r>
@@ -4524,7 +4748,7 @@
       <w:pPr>
         <w:numPr>
           <w:ilvl w:val="0"/>
-          <w:numId w:val="1054"/>
+          <w:numId w:val="1056"/>
         </w:numPr>
       </w:pPr>
       <w:r>
@@ -4545,7 +4769,7 @@
       <w:pPr>
         <w:numPr>
           <w:ilvl w:val="0"/>
-          <w:numId w:val="1054"/>
+          <w:numId w:val="1056"/>
         </w:numPr>
       </w:pPr>
       <w:r>
@@ -4562,8 +4786,8 @@
         <w:t xml:space="preserve">Entwicklung und Wartung einer Artikelverwaltung auf Basis einer textbasierten Datenbank mit selbst entwickeltem Fenstersystem für das elterliche Pelzgeschäft.</w:t>
       </w:r>
     </w:p>
-    <w:bookmarkEnd w:id="76"/>
-    <w:bookmarkEnd w:id="77"/>
+    <w:bookmarkEnd w:id="78"/>
+    <w:bookmarkEnd w:id="79"/>
     <w:sectPr/>
   </w:body>
 </w:document>
@@ -4909,6 +5133,12 @@
     <w:abstractNumId w:val="991"/>
   </w:num>
   <w:num w:numId="1054">
+    <w:abstractNumId w:val="991"/>
+  </w:num>
+  <w:num w:numId="1055">
+    <w:abstractNumId w:val="991"/>
+  </w:num>
+  <w:num w:numId="1056">
     <w:abstractNumId w:val="991"/>
   </w:num>
 </w:numbering>

</xml_diff>